<commit_message>
Beneficios y Desafios de TDD
</commit_message>
<xml_diff>
--- a/Proyecto Final- Carro Joaquin.docx
+++ b/Proyecto Final- Carro Joaquin.docx
@@ -1047,7 +1047,36 @@
         <w:ind w:left="1080"/>
       </w:pPr>
       <w:r>
-        <w:t>Algunos de los beneficios de trabajar con TDD son:</w:t>
+        <w:t>Si bien, ningún estudio demuestra categóricamente las diferencias a favor en productividad o calidad entre utilizar TDD u otras opciones, tampoco ningún estudio demuestra lo contrario. Sin embargo, las experiencias de los equipos al trabajar utilizando TDD demuestra que suelen estar relajados y con confianza en cada parte del proyecto, y que a los clientes les emociona la constante de avances que se le proporciona.</w:t>
+      </w:r>
+    </w:p>
+    <w:p>
+      <w:pPr>
+        <w:pStyle w:val="Prrafodelista"/>
+        <w:ind w:left="1080"/>
+      </w:pPr>
+    </w:p>
+    <w:p/>
+    <w:p>
+      <w:pPr>
+        <w:pStyle w:val="Prrafodelista"/>
+        <w:numPr>
+          <w:ilvl w:val="0"/>
+          <w:numId w:val="16"/>
+        </w:numPr>
+        <w:rPr>
+          <w:b/>
+          <w:sz w:val="28"/>
+          <w:lang w:val="es-AR"/>
+        </w:rPr>
+      </w:pPr>
+      <w:r>
+        <w:rPr>
+          <w:b/>
+          <w:sz w:val="28"/>
+          <w:lang w:val="es-AR"/>
+        </w:rPr>
+        <w:t>Beneficios de TDD</w:t>
       </w:r>
     </w:p>
     <w:p>
@@ -1098,7 +1127,6 @@
         <w:rPr>
           <w:b/>
         </w:rPr>
-        <w:lastRenderedPageBreak/>
         <w:t>Mayor confianza</w:t>
       </w:r>
       <w:r>
@@ -1221,19 +1249,319 @@
     </w:p>
     <w:p>
       <w:pPr>
-        <w:ind w:left="1440" w:firstLine="0"/>
-      </w:pPr>
-    </w:p>
-    <w:p>
-      <w:pPr>
-        <w:ind w:left="1440" w:firstLine="0"/>
-      </w:pPr>
-      <w:r>
-        <w:t>Si bien, ningún estudio demuestra categóricamente</w:t>
-      </w:r>
-      <w:r>
-        <w:t xml:space="preserve"> las diferencias a favor en productividad o calidad entre utilizar TDD u otras opciones, tampoco ningún estudio demuestra lo contrario. Sin embargo, las experiencias de los equipos al trabajar utilizando TDD demuestra que suelen estar relajados y con confianza en cada parte del proyecto, y que a los clientes les emociona la constante de avances que se le proporciona.</w:t>
-      </w:r>
+        <w:pStyle w:val="Prrafodelista"/>
+        <w:ind w:left="1800"/>
+      </w:pPr>
+    </w:p>
+    <w:p>
+      <w:pPr>
+        <w:pStyle w:val="Prrafodelista"/>
+        <w:numPr>
+          <w:ilvl w:val="0"/>
+          <w:numId w:val="16"/>
+        </w:numPr>
+        <w:rPr>
+          <w:b/>
+          <w:sz w:val="28"/>
+          <w:lang w:val="es-AR"/>
+        </w:rPr>
+      </w:pPr>
+      <w:r>
+        <w:rPr>
+          <w:b/>
+          <w:sz w:val="28"/>
+          <w:lang w:val="es-AR"/>
+        </w:rPr>
+        <w:lastRenderedPageBreak/>
+        <w:t>Desafíos de TDD</w:t>
+      </w:r>
+    </w:p>
+    <w:p>
+      <w:pPr>
+        <w:pStyle w:val="Prrafodelista"/>
+        <w:numPr>
+          <w:ilvl w:val="0"/>
+          <w:numId w:val="29"/>
+        </w:numPr>
+        <w:rPr>
+          <w:lang w:val="es-AR"/>
+        </w:rPr>
+      </w:pPr>
+      <w:r>
+        <w:rPr>
+          <w:b/>
+          <w:lang w:val="es-AR"/>
+        </w:rPr>
+        <w:t>Curva de aprendizaje inicial</w:t>
+      </w:r>
+      <w:r>
+        <w:rPr>
+          <w:lang w:val="es-AR"/>
+        </w:rPr>
+        <w:t>:</w:t>
+      </w:r>
+      <w:r>
+        <w:rPr>
+          <w:lang w:val="es-AR"/>
+        </w:rPr>
+        <w:t xml:space="preserve"> realizar códigos que resulten efectivos requiere de mucha práctica y puede resultar realmente difícil para aquellas personas que no estén acostumbradas.</w:t>
+      </w:r>
+    </w:p>
+    <w:p>
+      <w:pPr>
+        <w:pStyle w:val="Prrafodelista"/>
+        <w:numPr>
+          <w:ilvl w:val="0"/>
+          <w:numId w:val="29"/>
+        </w:numPr>
+        <w:rPr>
+          <w:lang w:val="es-AR"/>
+        </w:rPr>
+      </w:pPr>
+      <w:r>
+        <w:rPr>
+          <w:b/>
+          <w:lang w:val="es-AR"/>
+        </w:rPr>
+        <w:t>Mayor tiempo necesario</w:t>
+      </w:r>
+      <w:r>
+        <w:rPr>
+          <w:lang w:val="es-AR"/>
+        </w:rPr>
+        <w:t>:</w:t>
+      </w:r>
+      <w:r>
+        <w:rPr>
+          <w:lang w:val="es-AR"/>
+        </w:rPr>
+        <w:t xml:space="preserve"> la etapa inicial hasta conseguir test funcionales ralentiza el proceso. También se debe dedicar un tiempo considerable en configurar y mantener entornos de prueba que resulten adecuados para el código.</w:t>
+      </w:r>
+    </w:p>
+    <w:p>
+      <w:pPr>
+        <w:pStyle w:val="Prrafodelista"/>
+        <w:numPr>
+          <w:ilvl w:val="0"/>
+          <w:numId w:val="29"/>
+        </w:numPr>
+      </w:pPr>
+      <w:r>
+        <w:rPr>
+          <w:b/>
+          <w:lang w:val="es-AR"/>
+        </w:rPr>
+        <w:t>Disminución eficiencia</w:t>
+      </w:r>
+      <w:r>
+        <w:rPr>
+          <w:lang w:val="es-AR"/>
+        </w:rPr>
+        <w:t>:</w:t>
+      </w:r>
+      <w:r>
+        <w:rPr>
+          <w:lang w:val="es-AR"/>
+        </w:rPr>
+        <w:t xml:space="preserve"> </w:t>
+      </w:r>
+      <w:r>
+        <w:t>aunque se ha demostrado que el TDD mejora la productividad, puede retrasar el desarrollo del proyecto, ya que añade más pasos a la creación e implementación de cada nueva característica. </w:t>
+      </w:r>
+    </w:p>
+    <w:p>
+      <w:pPr>
+        <w:pStyle w:val="Prrafodelista"/>
+        <w:numPr>
+          <w:ilvl w:val="0"/>
+          <w:numId w:val="29"/>
+        </w:numPr>
+        <w:rPr>
+          <w:lang w:val="es-AR"/>
+        </w:rPr>
+      </w:pPr>
+      <w:r>
+        <w:rPr>
+          <w:b/>
+          <w:lang w:val="es-AR"/>
+        </w:rPr>
+        <w:t>Mayor volumen de código</w:t>
+      </w:r>
+      <w:r>
+        <w:rPr>
+          <w:lang w:val="es-AR"/>
+        </w:rPr>
+        <w:t>:</w:t>
+      </w:r>
+      <w:r>
+        <w:rPr>
+          <w:lang w:val="es-AR"/>
+        </w:rPr>
+        <w:t xml:space="preserve"> como se debe desarrollar tanto el código funcional, como así también los test iniciales, esto resulta en una gran cantidad general de código.</w:t>
+      </w:r>
+    </w:p>
+    <w:p>
+      <w:pPr>
+        <w:pStyle w:val="Prrafodelista"/>
+        <w:numPr>
+          <w:ilvl w:val="0"/>
+          <w:numId w:val="29"/>
+        </w:numPr>
+        <w:rPr>
+          <w:lang w:val="es-AR"/>
+        </w:rPr>
+      </w:pPr>
+      <w:r>
+        <w:rPr>
+          <w:b/>
+          <w:lang w:val="es-AR"/>
+        </w:rPr>
+        <w:t>Mucho esfuerzo en el mantenimiento</w:t>
+      </w:r>
+      <w:r>
+        <w:rPr>
+          <w:lang w:val="es-AR"/>
+        </w:rPr>
+        <w:t>:</w:t>
+      </w:r>
+      <w:r>
+        <w:rPr>
+          <w:lang w:val="es-AR"/>
+        </w:rPr>
+        <w:t xml:space="preserve"> mantener los test actualizados</w:t>
+      </w:r>
+      <w:r>
+        <w:rPr>
+          <w:lang w:val="es-AR"/>
+        </w:rPr>
+        <w:t xml:space="preserve">, los cuales crecen proporcionalmente junto con el proyecto, </w:t>
+      </w:r>
+      <w:r>
+        <w:rPr>
+          <w:lang w:val="es-AR"/>
+        </w:rPr>
+        <w:t>con</w:t>
+      </w:r>
+      <w:r>
+        <w:rPr>
+          <w:lang w:val="es-AR"/>
+        </w:rPr>
+        <w:t>siderando los</w:t>
+      </w:r>
+      <w:r>
+        <w:rPr>
+          <w:lang w:val="es-AR"/>
+        </w:rPr>
+        <w:t xml:space="preserve"> cambios en el código por la refactorización y el agregado de nuevos requisitos</w:t>
+      </w:r>
+      <w:r>
+        <w:rPr>
+          <w:lang w:val="es-AR"/>
+        </w:rPr>
+        <w:t>, puede convertirse en una tarea desafiante.</w:t>
+      </w:r>
+    </w:p>
+    <w:p>
+      <w:pPr>
+        <w:pStyle w:val="Prrafodelista"/>
+        <w:numPr>
+          <w:ilvl w:val="0"/>
+          <w:numId w:val="29"/>
+        </w:numPr>
+        <w:rPr>
+          <w:lang w:val="es-AR"/>
+        </w:rPr>
+      </w:pPr>
+      <w:r>
+        <w:rPr>
+          <w:b/>
+          <w:lang w:val="es-AR"/>
+        </w:rPr>
+        <w:t>Integración con sistemas existentes</w:t>
+      </w:r>
+      <w:r>
+        <w:rPr>
+          <w:lang w:val="es-AR"/>
+        </w:rPr>
+        <w:t>:</w:t>
+      </w:r>
+      <w:r>
+        <w:rPr>
+          <w:lang w:val="es-AR"/>
+        </w:rPr>
+        <w:t xml:space="preserve"> </w:t>
+      </w:r>
+      <w:r>
+        <w:rPr>
+          <w:lang w:val="es-AR"/>
+        </w:rPr>
+        <w:t>Aplicar TDD en sistemas legados o en proyectos en marcha puede ser un reto ya que no han sido diseñados con la mentalidad diseñar a partir de las pruebas.</w:t>
+      </w:r>
+    </w:p>
+    <w:p>
+      <w:pPr>
+        <w:pStyle w:val="Prrafodelista"/>
+        <w:numPr>
+          <w:ilvl w:val="0"/>
+          <w:numId w:val="29"/>
+        </w:numPr>
+        <w:rPr>
+          <w:lang w:val="es-AR"/>
+        </w:rPr>
+      </w:pPr>
+      <w:r>
+        <w:rPr>
+          <w:b/>
+          <w:lang w:val="es-AR"/>
+        </w:rPr>
+        <w:t>Descuido del sistema general</w:t>
+      </w:r>
+      <w:r>
+        <w:rPr>
+          <w:lang w:val="es-AR"/>
+        </w:rPr>
+        <w:t>:</w:t>
+      </w:r>
+      <w:r>
+        <w:rPr>
+          <w:lang w:val="es-AR"/>
+        </w:rPr>
+        <w:t xml:space="preserve"> </w:t>
+      </w:r>
+      <w:r>
+        <w:rPr>
+          <w:rFonts w:ascii="Arial" w:hAnsi="Arial" w:cs="Arial"/>
+          <w:b/>
+          <w:bCs/>
+          <w:color w:val="161616"/>
+          <w:bdr w:val="none" w:sz="0" w:space="0" w:color="auto" w:frame="1"/>
+          <w:shd w:val="clear" w:color="auto" w:fill="FFFFFF"/>
+        </w:rPr>
+        <w:t> </w:t>
+      </w:r>
+      <w:r>
+        <w:rPr>
+          <w:lang w:val="es-AR"/>
+        </w:rPr>
+        <w:t>aunque el TDD fomenta la sencillez del código y mejora el diseño, centrarse demasiado en los componentes individuales puede llevar a un código general poco unificado</w:t>
+      </w:r>
+      <w:r>
+        <w:rPr>
+          <w:lang w:val="es-AR"/>
+        </w:rPr>
+        <w:t>.</w:t>
+      </w:r>
+    </w:p>
+    <w:p>
+      <w:pPr>
+        <w:pStyle w:val="Prrafodelista"/>
+        <w:ind w:left="1080"/>
+        <w:rPr>
+          <w:b/>
+          <w:sz w:val="28"/>
+          <w:lang w:val="es-AR"/>
+        </w:rPr>
+      </w:pPr>
     </w:p>
     <w:p>
       <w:pPr>
@@ -1779,9 +2107,10 @@
     </w:tbl>
     <w:p>
       <w:pPr>
-        <w:pStyle w:val="Prrafodelista"/>
-        <w:ind w:left="1080"/>
-      </w:pPr>
+        <w:ind w:firstLine="0"/>
+      </w:pPr>
+      <w:bookmarkStart w:id="0" w:name="_GoBack"/>
+      <w:bookmarkEnd w:id="0"/>
       <w:r>
         <w:lastRenderedPageBreak/>
         <w:t xml:space="preserve">Considerando las características vistas de la metodología Test </w:t>
@@ -1886,8 +2215,6 @@
       <w:pPr>
         <w:ind w:firstLine="0"/>
       </w:pPr>
-      <w:bookmarkStart w:id="0" w:name="_GoBack"/>
-      <w:bookmarkEnd w:id="0"/>
     </w:p>
     <w:p>
       <w:pPr>
@@ -1901,7 +2228,6 @@
         <w:rPr>
           <w:noProof/>
         </w:rPr>
-        <w:lastRenderedPageBreak/>
         <w:t>Bibliografia</w:t>
       </w:r>
     </w:p>
@@ -1922,6 +2248,7 @@
           <w:noProof/>
           <w:lang w:val="en-US"/>
         </w:rPr>
+        <w:lastRenderedPageBreak/>
         <w:t>Kent, B. (2002). Test-Driven Development by Example</w:t>
       </w:r>
       <w:r>
@@ -2271,7 +2598,7 @@
         <w:noProof/>
         <w:lang w:bidi="es-ES"/>
       </w:rPr>
-      <w:t>9</w:t>
+      <w:t>10</w:t>
     </w:r>
     <w:r>
       <w:rPr>
@@ -2548,6 +2875,92 @@
     </w:lvl>
   </w:abstractNum>
   <w:abstractNum w:abstractNumId="10" w15:restartNumberingAfterBreak="0">
+    <w:nsid w:val="12F20A38"/>
+    <w:multiLevelType w:val="hybridMultilevel"/>
+    <w:tmpl w:val="9286A506"/>
+    <w:lvl w:ilvl="0" w:tplc="0C0A000F">
+      <w:start w:val="1"/>
+      <w:numFmt w:val="decimal"/>
+      <w:lvlText w:val="%1."/>
+      <w:lvlJc w:val="left"/>
+      <w:pPr>
+        <w:ind w:left="720" w:hanging="360"/>
+      </w:pPr>
+    </w:lvl>
+    <w:lvl w:ilvl="1" w:tplc="0C0A0019" w:tentative="1">
+      <w:start w:val="1"/>
+      <w:numFmt w:val="lowerLetter"/>
+      <w:lvlText w:val="%2."/>
+      <w:lvlJc w:val="left"/>
+      <w:pPr>
+        <w:ind w:left="1440" w:hanging="360"/>
+      </w:pPr>
+    </w:lvl>
+    <w:lvl w:ilvl="2" w:tplc="0C0A001B" w:tentative="1">
+      <w:start w:val="1"/>
+      <w:numFmt w:val="lowerRoman"/>
+      <w:lvlText w:val="%3."/>
+      <w:lvlJc w:val="right"/>
+      <w:pPr>
+        <w:ind w:left="2160" w:hanging="180"/>
+      </w:pPr>
+    </w:lvl>
+    <w:lvl w:ilvl="3" w:tplc="0C0A000F" w:tentative="1">
+      <w:start w:val="1"/>
+      <w:numFmt w:val="decimal"/>
+      <w:lvlText w:val="%4."/>
+      <w:lvlJc w:val="left"/>
+      <w:pPr>
+        <w:ind w:left="2880" w:hanging="360"/>
+      </w:pPr>
+    </w:lvl>
+    <w:lvl w:ilvl="4" w:tplc="0C0A0019" w:tentative="1">
+      <w:start w:val="1"/>
+      <w:numFmt w:val="lowerLetter"/>
+      <w:lvlText w:val="%5."/>
+      <w:lvlJc w:val="left"/>
+      <w:pPr>
+        <w:ind w:left="3600" w:hanging="360"/>
+      </w:pPr>
+    </w:lvl>
+    <w:lvl w:ilvl="5" w:tplc="0C0A001B" w:tentative="1">
+      <w:start w:val="1"/>
+      <w:numFmt w:val="lowerRoman"/>
+      <w:lvlText w:val="%6."/>
+      <w:lvlJc w:val="right"/>
+      <w:pPr>
+        <w:ind w:left="4320" w:hanging="180"/>
+      </w:pPr>
+    </w:lvl>
+    <w:lvl w:ilvl="6" w:tplc="0C0A000F" w:tentative="1">
+      <w:start w:val="1"/>
+      <w:numFmt w:val="decimal"/>
+      <w:lvlText w:val="%7."/>
+      <w:lvlJc w:val="left"/>
+      <w:pPr>
+        <w:ind w:left="5040" w:hanging="360"/>
+      </w:pPr>
+    </w:lvl>
+    <w:lvl w:ilvl="7" w:tplc="0C0A0019" w:tentative="1">
+      <w:start w:val="1"/>
+      <w:numFmt w:val="lowerLetter"/>
+      <w:lvlText w:val="%8."/>
+      <w:lvlJc w:val="left"/>
+      <w:pPr>
+        <w:ind w:left="5760" w:hanging="360"/>
+      </w:pPr>
+    </w:lvl>
+    <w:lvl w:ilvl="8" w:tplc="0C0A001B" w:tentative="1">
+      <w:start w:val="1"/>
+      <w:numFmt w:val="lowerRoman"/>
+      <w:lvlText w:val="%9."/>
+      <w:lvlJc w:val="right"/>
+      <w:pPr>
+        <w:ind w:left="6480" w:hanging="180"/>
+      </w:pPr>
+    </w:lvl>
+  </w:abstractNum>
+  <w:abstractNum w:abstractNumId="11" w15:restartNumberingAfterBreak="0">
     <w:nsid w:val="284D5A83"/>
     <w:multiLevelType w:val="hybridMultilevel"/>
     <w:tmpl w:val="4350B85A"/>
@@ -2660,7 +3073,7 @@
       </w:rPr>
     </w:lvl>
   </w:abstractNum>
-  <w:abstractNum w:abstractNumId="11" w15:restartNumberingAfterBreak="0">
+  <w:abstractNum w:abstractNumId="12" w15:restartNumberingAfterBreak="0">
     <w:nsid w:val="2ED276A0"/>
     <w:multiLevelType w:val="hybridMultilevel"/>
     <w:tmpl w:val="415024C6"/>
@@ -2773,7 +3186,7 @@
       </w:rPr>
     </w:lvl>
   </w:abstractNum>
-  <w:abstractNum w:abstractNumId="12" w15:restartNumberingAfterBreak="0">
+  <w:abstractNum w:abstractNumId="13" w15:restartNumberingAfterBreak="0">
     <w:nsid w:val="322F7C2F"/>
     <w:multiLevelType w:val="hybridMultilevel"/>
     <w:tmpl w:val="DA3CDF4C"/>
@@ -2886,7 +3299,96 @@
       </w:rPr>
     </w:lvl>
   </w:abstractNum>
-  <w:abstractNum w:abstractNumId="13" w15:restartNumberingAfterBreak="0">
+  <w:abstractNum w:abstractNumId="14" w15:restartNumberingAfterBreak="0">
+    <w:nsid w:val="37DD4538"/>
+    <w:multiLevelType w:val="hybridMultilevel"/>
+    <w:tmpl w:val="8D4AF2F0"/>
+    <w:lvl w:ilvl="0" w:tplc="9AAE87F4">
+      <w:start w:val="1"/>
+      <w:numFmt w:val="decimal"/>
+      <w:lvlText w:val="%1."/>
+      <w:lvlJc w:val="left"/>
+      <w:pPr>
+        <w:ind w:left="1080" w:hanging="360"/>
+      </w:pPr>
+      <w:rPr>
+        <w:rFonts w:hint="default"/>
+      </w:rPr>
+    </w:lvl>
+    <w:lvl w:ilvl="1" w:tplc="0C0A0019" w:tentative="1">
+      <w:start w:val="1"/>
+      <w:numFmt w:val="lowerLetter"/>
+      <w:lvlText w:val="%2."/>
+      <w:lvlJc w:val="left"/>
+      <w:pPr>
+        <w:ind w:left="1440" w:hanging="360"/>
+      </w:pPr>
+    </w:lvl>
+    <w:lvl w:ilvl="2" w:tplc="0C0A001B" w:tentative="1">
+      <w:start w:val="1"/>
+      <w:numFmt w:val="lowerRoman"/>
+      <w:lvlText w:val="%3."/>
+      <w:lvlJc w:val="right"/>
+      <w:pPr>
+        <w:ind w:left="2160" w:hanging="180"/>
+      </w:pPr>
+    </w:lvl>
+    <w:lvl w:ilvl="3" w:tplc="0C0A000F" w:tentative="1">
+      <w:start w:val="1"/>
+      <w:numFmt w:val="decimal"/>
+      <w:lvlText w:val="%4."/>
+      <w:lvlJc w:val="left"/>
+      <w:pPr>
+        <w:ind w:left="2880" w:hanging="360"/>
+      </w:pPr>
+    </w:lvl>
+    <w:lvl w:ilvl="4" w:tplc="0C0A0019" w:tentative="1">
+      <w:start w:val="1"/>
+      <w:numFmt w:val="lowerLetter"/>
+      <w:lvlText w:val="%5."/>
+      <w:lvlJc w:val="left"/>
+      <w:pPr>
+        <w:ind w:left="3600" w:hanging="360"/>
+      </w:pPr>
+    </w:lvl>
+    <w:lvl w:ilvl="5" w:tplc="0C0A001B" w:tentative="1">
+      <w:start w:val="1"/>
+      <w:numFmt w:val="lowerRoman"/>
+      <w:lvlText w:val="%6."/>
+      <w:lvlJc w:val="right"/>
+      <w:pPr>
+        <w:ind w:left="4320" w:hanging="180"/>
+      </w:pPr>
+    </w:lvl>
+    <w:lvl w:ilvl="6" w:tplc="0C0A000F" w:tentative="1">
+      <w:start w:val="1"/>
+      <w:numFmt w:val="decimal"/>
+      <w:lvlText w:val="%7."/>
+      <w:lvlJc w:val="left"/>
+      <w:pPr>
+        <w:ind w:left="5040" w:hanging="360"/>
+      </w:pPr>
+    </w:lvl>
+    <w:lvl w:ilvl="7" w:tplc="0C0A0019" w:tentative="1">
+      <w:start w:val="1"/>
+      <w:numFmt w:val="lowerLetter"/>
+      <w:lvlText w:val="%8."/>
+      <w:lvlJc w:val="left"/>
+      <w:pPr>
+        <w:ind w:left="5760" w:hanging="360"/>
+      </w:pPr>
+    </w:lvl>
+    <w:lvl w:ilvl="8" w:tplc="0C0A001B" w:tentative="1">
+      <w:start w:val="1"/>
+      <w:numFmt w:val="lowerRoman"/>
+      <w:lvlText w:val="%9."/>
+      <w:lvlJc w:val="right"/>
+      <w:pPr>
+        <w:ind w:left="6480" w:hanging="180"/>
+      </w:pPr>
+    </w:lvl>
+  </w:abstractNum>
+  <w:abstractNum w:abstractNumId="15" w15:restartNumberingAfterBreak="0">
     <w:nsid w:val="39AA5C11"/>
     <w:multiLevelType w:val="multilevel"/>
     <w:tmpl w:val="87902BD0"/>
@@ -3035,7 +3537,7 @@
       </w:rPr>
     </w:lvl>
   </w:abstractNum>
-  <w:abstractNum w:abstractNumId="14" w15:restartNumberingAfterBreak="0">
+  <w:abstractNum w:abstractNumId="16" w15:restartNumberingAfterBreak="0">
     <w:nsid w:val="4A5A1099"/>
     <w:multiLevelType w:val="multilevel"/>
     <w:tmpl w:val="4268E1E0"/>
@@ -3122,10 +3624,10 @@
       </w:pPr>
     </w:lvl>
   </w:abstractNum>
-  <w:abstractNum w:abstractNumId="15" w15:restartNumberingAfterBreak="0">
+  <w:abstractNum w:abstractNumId="17" w15:restartNumberingAfterBreak="0">
     <w:nsid w:val="4D4D3CEF"/>
     <w:multiLevelType w:val="hybridMultilevel"/>
-    <w:tmpl w:val="9D32F00C"/>
+    <w:tmpl w:val="910886D4"/>
     <w:lvl w:ilvl="0" w:tplc="9AAE87F4">
       <w:start w:val="1"/>
       <w:numFmt w:val="decimal"/>
@@ -3211,7 +3713,7 @@
       </w:pPr>
     </w:lvl>
   </w:abstractNum>
-  <w:abstractNum w:abstractNumId="16" w15:restartNumberingAfterBreak="0">
+  <w:abstractNum w:abstractNumId="18" w15:restartNumberingAfterBreak="0">
     <w:nsid w:val="4E5438BA"/>
     <w:multiLevelType w:val="hybridMultilevel"/>
     <w:tmpl w:val="E90E7F22"/>
@@ -3324,7 +3826,7 @@
       </w:rPr>
     </w:lvl>
   </w:abstractNum>
-  <w:abstractNum w:abstractNumId="17" w15:restartNumberingAfterBreak="0">
+  <w:abstractNum w:abstractNumId="19" w15:restartNumberingAfterBreak="0">
     <w:nsid w:val="54B27D0C"/>
     <w:multiLevelType w:val="multilevel"/>
     <w:tmpl w:val="0409001D"/>
@@ -3410,7 +3912,7 @@
       </w:pPr>
     </w:lvl>
   </w:abstractNum>
-  <w:abstractNum w:abstractNumId="18" w15:restartNumberingAfterBreak="0">
+  <w:abstractNum w:abstractNumId="20" w15:restartNumberingAfterBreak="0">
     <w:nsid w:val="5C6B4E8C"/>
     <w:multiLevelType w:val="hybridMultilevel"/>
     <w:tmpl w:val="13309150"/>
@@ -3523,7 +4025,120 @@
       </w:rPr>
     </w:lvl>
   </w:abstractNum>
-  <w:abstractNum w:abstractNumId="19" w15:restartNumberingAfterBreak="0">
+  <w:abstractNum w:abstractNumId="21" w15:restartNumberingAfterBreak="0">
+    <w:nsid w:val="5F8F320F"/>
+    <w:multiLevelType w:val="hybridMultilevel"/>
+    <w:tmpl w:val="54362228"/>
+    <w:lvl w:ilvl="0" w:tplc="0C0A0001">
+      <w:start w:val="1"/>
+      <w:numFmt w:val="bullet"/>
+      <w:lvlText w:val=""/>
+      <w:lvlJc w:val="left"/>
+      <w:pPr>
+        <w:ind w:left="1800" w:hanging="360"/>
+      </w:pPr>
+      <w:rPr>
+        <w:rFonts w:ascii="Symbol" w:hAnsi="Symbol" w:hint="default"/>
+      </w:rPr>
+    </w:lvl>
+    <w:lvl w:ilvl="1" w:tplc="0C0A0003" w:tentative="1">
+      <w:start w:val="1"/>
+      <w:numFmt w:val="bullet"/>
+      <w:lvlText w:val="o"/>
+      <w:lvlJc w:val="left"/>
+      <w:pPr>
+        <w:ind w:left="2520" w:hanging="360"/>
+      </w:pPr>
+      <w:rPr>
+        <w:rFonts w:ascii="Courier New" w:hAnsi="Courier New" w:cs="Courier New" w:hint="default"/>
+      </w:rPr>
+    </w:lvl>
+    <w:lvl w:ilvl="2" w:tplc="0C0A0005" w:tentative="1">
+      <w:start w:val="1"/>
+      <w:numFmt w:val="bullet"/>
+      <w:lvlText w:val=""/>
+      <w:lvlJc w:val="left"/>
+      <w:pPr>
+        <w:ind w:left="3240" w:hanging="360"/>
+      </w:pPr>
+      <w:rPr>
+        <w:rFonts w:ascii="Wingdings" w:hAnsi="Wingdings" w:hint="default"/>
+      </w:rPr>
+    </w:lvl>
+    <w:lvl w:ilvl="3" w:tplc="0C0A0001" w:tentative="1">
+      <w:start w:val="1"/>
+      <w:numFmt w:val="bullet"/>
+      <w:lvlText w:val=""/>
+      <w:lvlJc w:val="left"/>
+      <w:pPr>
+        <w:ind w:left="3960" w:hanging="360"/>
+      </w:pPr>
+      <w:rPr>
+        <w:rFonts w:ascii="Symbol" w:hAnsi="Symbol" w:hint="default"/>
+      </w:rPr>
+    </w:lvl>
+    <w:lvl w:ilvl="4" w:tplc="0C0A0003" w:tentative="1">
+      <w:start w:val="1"/>
+      <w:numFmt w:val="bullet"/>
+      <w:lvlText w:val="o"/>
+      <w:lvlJc w:val="left"/>
+      <w:pPr>
+        <w:ind w:left="4680" w:hanging="360"/>
+      </w:pPr>
+      <w:rPr>
+        <w:rFonts w:ascii="Courier New" w:hAnsi="Courier New" w:cs="Courier New" w:hint="default"/>
+      </w:rPr>
+    </w:lvl>
+    <w:lvl w:ilvl="5" w:tplc="0C0A0005" w:tentative="1">
+      <w:start w:val="1"/>
+      <w:numFmt w:val="bullet"/>
+      <w:lvlText w:val=""/>
+      <w:lvlJc w:val="left"/>
+      <w:pPr>
+        <w:ind w:left="5400" w:hanging="360"/>
+      </w:pPr>
+      <w:rPr>
+        <w:rFonts w:ascii="Wingdings" w:hAnsi="Wingdings" w:hint="default"/>
+      </w:rPr>
+    </w:lvl>
+    <w:lvl w:ilvl="6" w:tplc="0C0A0001" w:tentative="1">
+      <w:start w:val="1"/>
+      <w:numFmt w:val="bullet"/>
+      <w:lvlText w:val=""/>
+      <w:lvlJc w:val="left"/>
+      <w:pPr>
+        <w:ind w:left="6120" w:hanging="360"/>
+      </w:pPr>
+      <w:rPr>
+        <w:rFonts w:ascii="Symbol" w:hAnsi="Symbol" w:hint="default"/>
+      </w:rPr>
+    </w:lvl>
+    <w:lvl w:ilvl="7" w:tplc="0C0A0003" w:tentative="1">
+      <w:start w:val="1"/>
+      <w:numFmt w:val="bullet"/>
+      <w:lvlText w:val="o"/>
+      <w:lvlJc w:val="left"/>
+      <w:pPr>
+        <w:ind w:left="6840" w:hanging="360"/>
+      </w:pPr>
+      <w:rPr>
+        <w:rFonts w:ascii="Courier New" w:hAnsi="Courier New" w:cs="Courier New" w:hint="default"/>
+      </w:rPr>
+    </w:lvl>
+    <w:lvl w:ilvl="8" w:tplc="0C0A0005" w:tentative="1">
+      <w:start w:val="1"/>
+      <w:numFmt w:val="bullet"/>
+      <w:lvlText w:val=""/>
+      <w:lvlJc w:val="left"/>
+      <w:pPr>
+        <w:ind w:left="7560" w:hanging="360"/>
+      </w:pPr>
+      <w:rPr>
+        <w:rFonts w:ascii="Wingdings" w:hAnsi="Wingdings" w:hint="default"/>
+      </w:rPr>
+    </w:lvl>
+  </w:abstractNum>
+  <w:abstractNum w:abstractNumId="22" w15:restartNumberingAfterBreak="0">
     <w:nsid w:val="6D702056"/>
     <w:multiLevelType w:val="multilevel"/>
     <w:tmpl w:val="04090023"/>
@@ -3610,7 +4225,120 @@
       </w:pPr>
     </w:lvl>
   </w:abstractNum>
-  <w:abstractNum w:abstractNumId="20" w15:restartNumberingAfterBreak="0">
+  <w:abstractNum w:abstractNumId="23" w15:restartNumberingAfterBreak="0">
+    <w:nsid w:val="6DFE06AA"/>
+    <w:multiLevelType w:val="hybridMultilevel"/>
+    <w:tmpl w:val="C8B08CBC"/>
+    <w:lvl w:ilvl="0" w:tplc="0C0A0001">
+      <w:start w:val="1"/>
+      <w:numFmt w:val="bullet"/>
+      <w:lvlText w:val=""/>
+      <w:lvlJc w:val="left"/>
+      <w:pPr>
+        <w:ind w:left="1800" w:hanging="360"/>
+      </w:pPr>
+      <w:rPr>
+        <w:rFonts w:ascii="Symbol" w:hAnsi="Symbol" w:hint="default"/>
+      </w:rPr>
+    </w:lvl>
+    <w:lvl w:ilvl="1" w:tplc="0C0A0003" w:tentative="1">
+      <w:start w:val="1"/>
+      <w:numFmt w:val="bullet"/>
+      <w:lvlText w:val="o"/>
+      <w:lvlJc w:val="left"/>
+      <w:pPr>
+        <w:ind w:left="2520" w:hanging="360"/>
+      </w:pPr>
+      <w:rPr>
+        <w:rFonts w:ascii="Courier New" w:hAnsi="Courier New" w:cs="Courier New" w:hint="default"/>
+      </w:rPr>
+    </w:lvl>
+    <w:lvl w:ilvl="2" w:tplc="0C0A0005" w:tentative="1">
+      <w:start w:val="1"/>
+      <w:numFmt w:val="bullet"/>
+      <w:lvlText w:val=""/>
+      <w:lvlJc w:val="left"/>
+      <w:pPr>
+        <w:ind w:left="3240" w:hanging="360"/>
+      </w:pPr>
+      <w:rPr>
+        <w:rFonts w:ascii="Wingdings" w:hAnsi="Wingdings" w:hint="default"/>
+      </w:rPr>
+    </w:lvl>
+    <w:lvl w:ilvl="3" w:tplc="0C0A0001" w:tentative="1">
+      <w:start w:val="1"/>
+      <w:numFmt w:val="bullet"/>
+      <w:lvlText w:val=""/>
+      <w:lvlJc w:val="left"/>
+      <w:pPr>
+        <w:ind w:left="3960" w:hanging="360"/>
+      </w:pPr>
+      <w:rPr>
+        <w:rFonts w:ascii="Symbol" w:hAnsi="Symbol" w:hint="default"/>
+      </w:rPr>
+    </w:lvl>
+    <w:lvl w:ilvl="4" w:tplc="0C0A0003" w:tentative="1">
+      <w:start w:val="1"/>
+      <w:numFmt w:val="bullet"/>
+      <w:lvlText w:val="o"/>
+      <w:lvlJc w:val="left"/>
+      <w:pPr>
+        <w:ind w:left="4680" w:hanging="360"/>
+      </w:pPr>
+      <w:rPr>
+        <w:rFonts w:ascii="Courier New" w:hAnsi="Courier New" w:cs="Courier New" w:hint="default"/>
+      </w:rPr>
+    </w:lvl>
+    <w:lvl w:ilvl="5" w:tplc="0C0A0005" w:tentative="1">
+      <w:start w:val="1"/>
+      <w:numFmt w:val="bullet"/>
+      <w:lvlText w:val=""/>
+      <w:lvlJc w:val="left"/>
+      <w:pPr>
+        <w:ind w:left="5400" w:hanging="360"/>
+      </w:pPr>
+      <w:rPr>
+        <w:rFonts w:ascii="Wingdings" w:hAnsi="Wingdings" w:hint="default"/>
+      </w:rPr>
+    </w:lvl>
+    <w:lvl w:ilvl="6" w:tplc="0C0A0001" w:tentative="1">
+      <w:start w:val="1"/>
+      <w:numFmt w:val="bullet"/>
+      <w:lvlText w:val=""/>
+      <w:lvlJc w:val="left"/>
+      <w:pPr>
+        <w:ind w:left="6120" w:hanging="360"/>
+      </w:pPr>
+      <w:rPr>
+        <w:rFonts w:ascii="Symbol" w:hAnsi="Symbol" w:hint="default"/>
+      </w:rPr>
+    </w:lvl>
+    <w:lvl w:ilvl="7" w:tplc="0C0A0003" w:tentative="1">
+      <w:start w:val="1"/>
+      <w:numFmt w:val="bullet"/>
+      <w:lvlText w:val="o"/>
+      <w:lvlJc w:val="left"/>
+      <w:pPr>
+        <w:ind w:left="6840" w:hanging="360"/>
+      </w:pPr>
+      <w:rPr>
+        <w:rFonts w:ascii="Courier New" w:hAnsi="Courier New" w:cs="Courier New" w:hint="default"/>
+      </w:rPr>
+    </w:lvl>
+    <w:lvl w:ilvl="8" w:tplc="0C0A0005" w:tentative="1">
+      <w:start w:val="1"/>
+      <w:numFmt w:val="bullet"/>
+      <w:lvlText w:val=""/>
+      <w:lvlJc w:val="left"/>
+      <w:pPr>
+        <w:ind w:left="7560" w:hanging="360"/>
+      </w:pPr>
+      <w:rPr>
+        <w:rFonts w:ascii="Wingdings" w:hAnsi="Wingdings" w:hint="default"/>
+      </w:rPr>
+    </w:lvl>
+  </w:abstractNum>
+  <w:abstractNum w:abstractNumId="24" w15:restartNumberingAfterBreak="0">
     <w:nsid w:val="7273740B"/>
     <w:multiLevelType w:val="multilevel"/>
     <w:tmpl w:val="0409001F"/>
@@ -3696,7 +4424,93 @@
       </w:pPr>
     </w:lvl>
   </w:abstractNum>
-  <w:abstractNum w:abstractNumId="21" w15:restartNumberingAfterBreak="0">
+  <w:abstractNum w:abstractNumId="25" w15:restartNumberingAfterBreak="0">
+    <w:nsid w:val="72AD2ACF"/>
+    <w:multiLevelType w:val="hybridMultilevel"/>
+    <w:tmpl w:val="081ED20C"/>
+    <w:lvl w:ilvl="0" w:tplc="0C0A000F">
+      <w:start w:val="1"/>
+      <w:numFmt w:val="decimal"/>
+      <w:lvlText w:val="%1."/>
+      <w:lvlJc w:val="left"/>
+      <w:pPr>
+        <w:ind w:left="1440" w:hanging="360"/>
+      </w:pPr>
+    </w:lvl>
+    <w:lvl w:ilvl="1" w:tplc="0C0A0019" w:tentative="1">
+      <w:start w:val="1"/>
+      <w:numFmt w:val="lowerLetter"/>
+      <w:lvlText w:val="%2."/>
+      <w:lvlJc w:val="left"/>
+      <w:pPr>
+        <w:ind w:left="2160" w:hanging="360"/>
+      </w:pPr>
+    </w:lvl>
+    <w:lvl w:ilvl="2" w:tplc="0C0A001B" w:tentative="1">
+      <w:start w:val="1"/>
+      <w:numFmt w:val="lowerRoman"/>
+      <w:lvlText w:val="%3."/>
+      <w:lvlJc w:val="right"/>
+      <w:pPr>
+        <w:ind w:left="2880" w:hanging="180"/>
+      </w:pPr>
+    </w:lvl>
+    <w:lvl w:ilvl="3" w:tplc="0C0A000F" w:tentative="1">
+      <w:start w:val="1"/>
+      <w:numFmt w:val="decimal"/>
+      <w:lvlText w:val="%4."/>
+      <w:lvlJc w:val="left"/>
+      <w:pPr>
+        <w:ind w:left="3600" w:hanging="360"/>
+      </w:pPr>
+    </w:lvl>
+    <w:lvl w:ilvl="4" w:tplc="0C0A0019" w:tentative="1">
+      <w:start w:val="1"/>
+      <w:numFmt w:val="lowerLetter"/>
+      <w:lvlText w:val="%5."/>
+      <w:lvlJc w:val="left"/>
+      <w:pPr>
+        <w:ind w:left="4320" w:hanging="360"/>
+      </w:pPr>
+    </w:lvl>
+    <w:lvl w:ilvl="5" w:tplc="0C0A001B" w:tentative="1">
+      <w:start w:val="1"/>
+      <w:numFmt w:val="lowerRoman"/>
+      <w:lvlText w:val="%6."/>
+      <w:lvlJc w:val="right"/>
+      <w:pPr>
+        <w:ind w:left="5040" w:hanging="180"/>
+      </w:pPr>
+    </w:lvl>
+    <w:lvl w:ilvl="6" w:tplc="0C0A000F" w:tentative="1">
+      <w:start w:val="1"/>
+      <w:numFmt w:val="decimal"/>
+      <w:lvlText w:val="%7."/>
+      <w:lvlJc w:val="left"/>
+      <w:pPr>
+        <w:ind w:left="5760" w:hanging="360"/>
+      </w:pPr>
+    </w:lvl>
+    <w:lvl w:ilvl="7" w:tplc="0C0A0019" w:tentative="1">
+      <w:start w:val="1"/>
+      <w:numFmt w:val="lowerLetter"/>
+      <w:lvlText w:val="%8."/>
+      <w:lvlJc w:val="left"/>
+      <w:pPr>
+        <w:ind w:left="6480" w:hanging="360"/>
+      </w:pPr>
+    </w:lvl>
+    <w:lvl w:ilvl="8" w:tplc="0C0A001B" w:tentative="1">
+      <w:start w:val="1"/>
+      <w:numFmt w:val="lowerRoman"/>
+      <w:lvlText w:val="%9."/>
+      <w:lvlJc w:val="right"/>
+      <w:pPr>
+        <w:ind w:left="7200" w:hanging="180"/>
+      </w:pPr>
+    </w:lvl>
+  </w:abstractNum>
+  <w:abstractNum w:abstractNumId="26" w15:restartNumberingAfterBreak="0">
     <w:nsid w:val="74BC2BE7"/>
     <w:multiLevelType w:val="hybridMultilevel"/>
     <w:tmpl w:val="C2B29B02"/>
@@ -3782,7 +4596,7 @@
       </w:pPr>
     </w:lvl>
   </w:abstractNum>
-  <w:abstractNum w:abstractNumId="22" w15:restartNumberingAfterBreak="0">
+  <w:abstractNum w:abstractNumId="27" w15:restartNumberingAfterBreak="0">
     <w:nsid w:val="7C673C43"/>
     <w:multiLevelType w:val="hybridMultilevel"/>
     <w:tmpl w:val="413C1C5C"/>
@@ -3932,43 +4746,58 @@
     </w:lvlOverride>
   </w:num>
   <w:num w:numId="12">
+    <w:abstractNumId w:val="24"/>
+  </w:num>
+  <w:num w:numId="13">
+    <w:abstractNumId w:val="19"/>
+  </w:num>
+  <w:num w:numId="14">
+    <w:abstractNumId w:val="16"/>
+  </w:num>
+  <w:num w:numId="15">
+    <w:abstractNumId w:val="22"/>
+  </w:num>
+  <w:num w:numId="16">
+    <w:abstractNumId w:val="17"/>
+  </w:num>
+  <w:num w:numId="17">
+    <w:abstractNumId w:val="13"/>
+  </w:num>
+  <w:num w:numId="18">
+    <w:abstractNumId w:val="26"/>
+  </w:num>
+  <w:num w:numId="19">
+    <w:abstractNumId w:val="18"/>
+  </w:num>
+  <w:num w:numId="20">
+    <w:abstractNumId w:val="15"/>
+  </w:num>
+  <w:num w:numId="21">
+    <w:abstractNumId w:val="27"/>
+  </w:num>
+  <w:num w:numId="22">
+    <w:abstractNumId w:val="11"/>
+  </w:num>
+  <w:num w:numId="23">
     <w:abstractNumId w:val="20"/>
   </w:num>
-  <w:num w:numId="13">
-    <w:abstractNumId w:val="17"/>
+  <w:num w:numId="24">
+    <w:abstractNumId w:val="12"/>
   </w:num>
-  <w:num w:numId="14">
+  <w:num w:numId="25">
+    <w:abstractNumId w:val="25"/>
+  </w:num>
+  <w:num w:numId="26">
+    <w:abstractNumId w:val="10"/>
+  </w:num>
+  <w:num w:numId="27">
+    <w:abstractNumId w:val="23"/>
+  </w:num>
+  <w:num w:numId="28">
     <w:abstractNumId w:val="14"/>
   </w:num>
-  <w:num w:numId="15">
-    <w:abstractNumId w:val="19"/>
-  </w:num>
-  <w:num w:numId="16">
-    <w:abstractNumId w:val="15"/>
-  </w:num>
-  <w:num w:numId="17">
-    <w:abstractNumId w:val="12"/>
-  </w:num>
-  <w:num w:numId="18">
+  <w:num w:numId="29">
     <w:abstractNumId w:val="21"/>
-  </w:num>
-  <w:num w:numId="19">
-    <w:abstractNumId w:val="16"/>
-  </w:num>
-  <w:num w:numId="20">
-    <w:abstractNumId w:val="13"/>
-  </w:num>
-  <w:num w:numId="21">
-    <w:abstractNumId w:val="22"/>
-  </w:num>
-  <w:num w:numId="22">
-    <w:abstractNumId w:val="10"/>
-  </w:num>
-  <w:num w:numId="23">
-    <w:abstractNumId w:val="18"/>
-  </w:num>
-  <w:num w:numId="24">
-    <w:abstractNumId w:val="11"/>
   </w:num>
 </w:numbering>
 </file>
@@ -4718,7 +5547,7 @@
   <w:style w:type="character" w:styleId="nfasis">
     <w:name w:val="Emphasis"/>
     <w:basedOn w:val="Fuentedeprrafopredeter"/>
-    <w:uiPriority w:val="4"/>
+    <w:uiPriority w:val="20"/>
     <w:unhideWhenUsed/>
     <w:qFormat/>
     <w:rsid w:val="00E30751"/>
@@ -6665,6 +7494,7 @@
   <w:rsids>
     <w:rsidRoot w:val="00FC7F30"/>
     <w:rsid w:val="0067295E"/>
+    <w:rsid w:val="00D82A00"/>
     <w:rsid w:val="00FC7F30"/>
   </w:rsids>
   <m:mathPr>
@@ -7589,7 +8419,7 @@
 </file>
 
 <file path=customXml/itemProps2.xml><?xml version="1.0" encoding="utf-8"?>
-<ds:datastoreItem xmlns:ds="http://schemas.openxmlformats.org/officeDocument/2006/customXml" ds:itemID="{D98B7FDD-4862-4009-AC5F-DE37AA9D8EFB}">
+<ds:datastoreItem xmlns:ds="http://schemas.openxmlformats.org/officeDocument/2006/customXml" ds:itemID="{CD4F2262-4FAF-4EA1-B58A-40DFC5B99991}">
   <ds:schemaRefs>
     <ds:schemaRef ds:uri="http://schemas.openxmlformats.org/officeDocument/2006/bibliography"/>
   </ds:schemaRefs>

</xml_diff>

<commit_message>
Ejemplos practicos ciclo RGR
</commit_message>
<xml_diff>
--- a/Proyecto Final- Carro Joaquin.docx
+++ b/Proyecto Final- Carro Joaquin.docx
@@ -615,8 +615,3880 @@
     </w:p>
     <w:p>
       <w:pPr>
+        <w:ind w:left="720" w:firstLine="0"/>
+      </w:pPr>
+      <w:r>
+        <w:t>Ejemplificaremos el funcionamiento del</w:t>
+      </w:r>
+      <w:r>
+        <w:t xml:space="preserve"> ciclo Red-Green-</w:t>
+      </w:r>
+      <w:proofErr w:type="spellStart"/>
+      <w:r>
+        <w:t>Refactor</w:t>
+      </w:r>
+      <w:proofErr w:type="spellEnd"/>
+      <w:r>
+        <w:t xml:space="preserve"> con los</w:t>
+      </w:r>
+      <w:r>
+        <w:t xml:space="preserve"> siguiente</w:t>
+      </w:r>
+      <w:r>
+        <w:t>s</w:t>
+      </w:r>
+      <w:r>
+        <w:t xml:space="preserve"> ejercicio</w:t>
+      </w:r>
+      <w:r>
+        <w:t>s</w:t>
+      </w:r>
+      <w:r>
+        <w:t>:</w:t>
+      </w:r>
+    </w:p>
+    <w:p>
+      <w:pPr>
+        <w:pStyle w:val="Prrafodelista"/>
+        <w:numPr>
+          <w:ilvl w:val="0"/>
+          <w:numId w:val="32"/>
+        </w:numPr>
+      </w:pPr>
+      <w:r>
+        <w:t xml:space="preserve">Se desea obtener una función que sea capaz de convertir un determinado monto en peso argentino, a su equivalente a dólares, conociendo el tipo de cambio correspondiente. Además, tendremos en cuenta que la función </w:t>
+      </w:r>
+      <w:r>
+        <w:t>no debe aceptar valores negativos para el monto de peso.</w:t>
+      </w:r>
+    </w:p>
+    <w:p>
+      <w:pPr>
+        <w:ind w:left="1080" w:firstLine="0"/>
+      </w:pPr>
+      <w:r>
+        <w:t>Función básica: supondremos que se quieren convertir 1</w:t>
+      </w:r>
+      <w:r>
+        <w:t>5</w:t>
+      </w:r>
+      <w:r>
+        <w:t>0000 pesos a dólares con un tipo de cambio de 1500</w:t>
+      </w:r>
+    </w:p>
+    <w:p>
+      <w:pPr>
+        <w:pStyle w:val="Prrafodelista"/>
+        <w:numPr>
+          <w:ilvl w:val="0"/>
+          <w:numId w:val="31"/>
+        </w:numPr>
+      </w:pPr>
+      <w:r>
+        <w:rPr>
+          <w:noProof/>
+          <w:lang w:eastAsia="es-ES"/>
+        </w:rPr>
+        <w:lastRenderedPageBreak/>
+        <mc:AlternateContent>
+          <mc:Choice Requires="wps">
+            <w:drawing>
+              <wp:anchor distT="0" distB="0" distL="114300" distR="114300" simplePos="0" relativeHeight="251658240" behindDoc="1" locked="0" layoutInCell="1" allowOverlap="1" wp14:anchorId="1837190E" wp14:editId="14C8E71C">
+                <wp:simplePos x="0" y="0"/>
+                <wp:positionH relativeFrom="column">
+                  <wp:posOffset>1530350</wp:posOffset>
+                </wp:positionH>
+                <wp:positionV relativeFrom="paragraph">
+                  <wp:posOffset>297180</wp:posOffset>
+                </wp:positionV>
+                <wp:extent cx="3194050" cy="1168400"/>
+                <wp:effectExtent l="0" t="0" r="25400" b="12700"/>
+                <wp:wrapTopAndBottom/>
+                <wp:docPr id="217" name="Cuadro de texto 2"/>
+                <wp:cNvGraphicFramePr>
+                  <a:graphicFrameLocks xmlns:a="http://schemas.openxmlformats.org/drawingml/2006/main"/>
+                </wp:cNvGraphicFramePr>
+                <a:graphic xmlns:a="http://schemas.openxmlformats.org/drawingml/2006/main">
+                  <a:graphicData uri="http://schemas.microsoft.com/office/word/2010/wordprocessingShape">
+                    <wps:wsp>
+                      <wps:cNvSpPr txBox="1">
+                        <a:spLocks noChangeArrowheads="1"/>
+                      </wps:cNvSpPr>
+                      <wps:spPr bwMode="auto">
+                        <a:xfrm>
+                          <a:off x="0" y="0"/>
+                          <a:ext cx="3194050" cy="1168400"/>
+                        </a:xfrm>
+                        <a:prstGeom prst="rect">
+                          <a:avLst/>
+                        </a:prstGeom>
+                        <a:solidFill>
+                          <a:srgbClr val="FFFFFF"/>
+                        </a:solidFill>
+                        <a:ln w="9525">
+                          <a:solidFill>
+                            <a:srgbClr val="000000"/>
+                          </a:solidFill>
+                          <a:miter lim="800000"/>
+                          <a:headEnd/>
+                          <a:tailEnd/>
+                        </a:ln>
+                      </wps:spPr>
+                      <wps:txbx>
+                        <w:txbxContent>
+                          <w:p>
+                            <w:pPr>
+                              <w:ind w:firstLine="0"/>
+                              <w:rPr>
+                                <w:lang w:val="es-AR"/>
+                              </w:rPr>
+                            </w:pPr>
+                            <w:r>
+                              <w:rPr>
+                                <w:lang w:val="es-AR"/>
+                              </w:rPr>
+                              <w:t>PRUEBA: conversión</w:t>
+                            </w:r>
+                          </w:p>
+                          <w:p>
+                            <w:pPr>
+                              <w:ind w:firstLine="0"/>
+                              <w:rPr>
+                                <w:lang w:val="es-AR"/>
+                              </w:rPr>
+                            </w:pPr>
+                            <w:r>
+                              <w:rPr>
+                                <w:lang w:val="es-AR"/>
+                              </w:rPr>
+                              <w:t xml:space="preserve">resultado </w:t>
+                            </w:r>
+                            <w:r>
+                              <w:rPr>
+                                <w:lang w:val="en-US"/>
+                              </w:rPr>
+                              <w:sym w:font="Wingdings" w:char="F0DF"/>
+                            </w:r>
+                            <w:r>
+                              <w:t xml:space="preserve"> </w:t>
+                            </w:r>
+                            <w:proofErr w:type="spellStart"/>
+                            <w:r>
+                              <w:rPr>
+                                <w:lang w:val="es-AR"/>
+                              </w:rPr>
+                              <w:t>pesos_a_dolares</w:t>
+                            </w:r>
+                            <w:proofErr w:type="spellEnd"/>
+                            <w:r>
+                              <w:rPr>
+                                <w:lang w:val="es-AR"/>
+                              </w:rPr>
+                              <w:t>(150000,1500)</w:t>
+                            </w:r>
+                          </w:p>
+                          <w:p>
+                            <w:pPr>
+                              <w:ind w:firstLine="0"/>
+                            </w:pPr>
+                            <w:r>
+                              <w:rPr>
+                                <w:lang w:val="es-AR"/>
+                              </w:rPr>
+                              <w:t>VERIFICAR resultado = 100</w:t>
+                            </w:r>
+                            <w:r>
+                              <w:t xml:space="preserve"> </w:t>
+                            </w:r>
+                          </w:p>
+                        </w:txbxContent>
+                      </wps:txbx>
+                      <wps:bodyPr rot="0" vert="horz" wrap="square" lIns="91440" tIns="45720" rIns="91440" bIns="45720" anchor="ctr" anchorCtr="0">
+                        <a:noAutofit/>
+                      </wps:bodyPr>
+                    </wps:wsp>
+                  </a:graphicData>
+                </a:graphic>
+              </wp:anchor>
+            </w:drawing>
+          </mc:Choice>
+          <mc:Fallback>
+            <w:pict>
+              <v:shapetype w14:anchorId="1837190E" id="_x0000_t202" coordsize="21600,21600" o:spt="202" path="m,l,21600r21600,l21600,xe">
+                <v:stroke joinstyle="miter"/>
+                <v:path gradientshapeok="t" o:connecttype="rect"/>
+              </v:shapetype>
+              <v:shape id="Cuadro de texto 2" o:spid="_x0000_s1026" type="#_x0000_t202" style="position:absolute;left:0;text-align:left;margin-left:120.5pt;margin-top:23.4pt;width:251.5pt;height:92pt;z-index:-251658240;visibility:visible;mso-wrap-style:square;mso-wrap-distance-left:9pt;mso-wrap-distance-top:0;mso-wrap-distance-right:9pt;mso-wrap-distance-bottom:0;mso-position-horizontal:absolute;mso-position-horizontal-relative:text;mso-position-vertical:absolute;mso-position-vertical-relative:text;v-text-anchor:middle" o:gfxdata="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">
+                <v:textbox>
+                  <w:txbxContent>
+                    <w:p>
+                      <w:pPr>
+                        <w:ind w:firstLine="0"/>
+                        <w:rPr>
+                          <w:lang w:val="es-AR"/>
+                        </w:rPr>
+                      </w:pPr>
+                      <w:r>
+                        <w:rPr>
+                          <w:lang w:val="es-AR"/>
+                        </w:rPr>
+                        <w:t>PRUEBA: conversión</w:t>
+                      </w:r>
+                    </w:p>
+                    <w:p>
+                      <w:pPr>
+                        <w:ind w:firstLine="0"/>
+                        <w:rPr>
+                          <w:lang w:val="es-AR"/>
+                        </w:rPr>
+                      </w:pPr>
+                      <w:r>
+                        <w:rPr>
+                          <w:lang w:val="es-AR"/>
+                        </w:rPr>
+                        <w:t xml:space="preserve">resultado </w:t>
+                      </w:r>
+                      <w:r>
+                        <w:rPr>
+                          <w:lang w:val="en-US"/>
+                        </w:rPr>
+                        <w:sym w:font="Wingdings" w:char="F0DF"/>
+                      </w:r>
+                      <w:r>
+                        <w:t xml:space="preserve"> </w:t>
+                      </w:r>
+                      <w:proofErr w:type="spellStart"/>
+                      <w:r>
+                        <w:rPr>
+                          <w:lang w:val="es-AR"/>
+                        </w:rPr>
+                        <w:t>pesos_a_dolares</w:t>
+                      </w:r>
+                      <w:proofErr w:type="spellEnd"/>
+                      <w:r>
+                        <w:rPr>
+                          <w:lang w:val="es-AR"/>
+                        </w:rPr>
+                        <w:t>(150000,1500)</w:t>
+                      </w:r>
+                    </w:p>
+                    <w:p>
+                      <w:pPr>
+                        <w:ind w:firstLine="0"/>
+                      </w:pPr>
+                      <w:r>
+                        <w:rPr>
+                          <w:lang w:val="es-AR"/>
+                        </w:rPr>
+                        <w:t>VERIFICAR resultado = 100</w:t>
+                      </w:r>
+                      <w:r>
+                        <w:t xml:space="preserve"> </w:t>
+                      </w:r>
+                    </w:p>
+                  </w:txbxContent>
+                </v:textbox>
+                <w10:wrap type="topAndBottom"/>
+              </v:shape>
+            </w:pict>
+          </mc:Fallback>
+        </mc:AlternateContent>
+      </w:r>
+      <w:r>
+        <w:t>Red: test que falle</w:t>
+      </w:r>
+    </w:p>
+    <w:p>
+      <w:pPr>
+        <w:pStyle w:val="Prrafodelista"/>
+        <w:ind w:left="1080" w:firstLine="360"/>
+        <w:rPr>
+          <w:lang w:val="es-AR"/>
+        </w:rPr>
+      </w:pPr>
+      <w:r>
+        <w:rPr>
+          <w:lang w:val="es-AR"/>
+        </w:rPr>
+        <w:t>Est</w:t>
+      </w:r>
+      <w:r>
+        <w:rPr>
+          <w:lang w:val="es-AR"/>
+        </w:rPr>
+        <w:t>a prueba</w:t>
+      </w:r>
+      <w:r>
+        <w:rPr>
+          <w:lang w:val="es-AR"/>
+        </w:rPr>
+        <w:t xml:space="preserve"> fallara, ya que la función </w:t>
+      </w:r>
+      <w:proofErr w:type="spellStart"/>
+      <w:r>
+        <w:rPr>
+          <w:lang w:val="es-AR"/>
+        </w:rPr>
+        <w:t>pesos_a_dolares</w:t>
+      </w:r>
+      <w:proofErr w:type="spellEnd"/>
+      <w:r>
+        <w:rPr>
+          <w:lang w:val="es-AR"/>
+        </w:rPr>
+        <w:t xml:space="preserve"> no existe todavía.</w:t>
+      </w:r>
+    </w:p>
+    <w:p>
+      <w:pPr>
+        <w:pStyle w:val="Prrafodelista"/>
+        <w:numPr>
+          <w:ilvl w:val="0"/>
+          <w:numId w:val="31"/>
+        </w:numPr>
+        <w:rPr>
+          <w:lang w:val="es-AR"/>
+        </w:rPr>
+      </w:pPr>
+      <w:r>
+        <w:rPr>
+          <w:noProof/>
+          <w:lang w:eastAsia="es-ES"/>
+        </w:rPr>
+        <mc:AlternateContent>
+          <mc:Choice Requires="wps">
+            <w:drawing>
+              <wp:anchor distT="0" distB="0" distL="114300" distR="114300" simplePos="0" relativeHeight="251659264" behindDoc="0" locked="0" layoutInCell="1" allowOverlap="1" wp14:anchorId="007E8F2D" wp14:editId="124772D7">
+                <wp:simplePos x="0" y="0"/>
+                <wp:positionH relativeFrom="column">
+                  <wp:posOffset>1403350</wp:posOffset>
+                </wp:positionH>
+                <wp:positionV relativeFrom="paragraph">
+                  <wp:posOffset>360680</wp:posOffset>
+                </wp:positionV>
+                <wp:extent cx="3111500" cy="1404620"/>
+                <wp:effectExtent l="0" t="0" r="12700" b="17780"/>
+                <wp:wrapTopAndBottom/>
+                <wp:docPr id="2" name="Cuadro de texto 2"/>
+                <wp:cNvGraphicFramePr>
+                  <a:graphicFrameLocks xmlns:a="http://schemas.openxmlformats.org/drawingml/2006/main"/>
+                </wp:cNvGraphicFramePr>
+                <a:graphic xmlns:a="http://schemas.openxmlformats.org/drawingml/2006/main">
+                  <a:graphicData uri="http://schemas.microsoft.com/office/word/2010/wordprocessingShape">
+                    <wps:wsp>
+                      <wps:cNvSpPr txBox="1">
+                        <a:spLocks noChangeArrowheads="1"/>
+                      </wps:cNvSpPr>
+                      <wps:spPr bwMode="auto">
+                        <a:xfrm>
+                          <a:off x="0" y="0"/>
+                          <a:ext cx="3111500" cy="1404620"/>
+                        </a:xfrm>
+                        <a:prstGeom prst="rect">
+                          <a:avLst/>
+                        </a:prstGeom>
+                        <a:solidFill>
+                          <a:srgbClr val="FFFFFF"/>
+                        </a:solidFill>
+                        <a:ln w="9525">
+                          <a:solidFill>
+                            <a:srgbClr val="000000"/>
+                          </a:solidFill>
+                          <a:miter lim="800000"/>
+                          <a:headEnd/>
+                          <a:tailEnd/>
+                        </a:ln>
+                      </wps:spPr>
+                      <wps:txbx>
+                        <w:txbxContent>
+                          <w:p>
+                            <w:pPr>
+                              <w:ind w:firstLine="0"/>
+                              <w:rPr>
+                                <w:lang w:val="es-AR"/>
+                              </w:rPr>
+                            </w:pPr>
+                            <w:r>
+                              <w:rPr>
+                                <w:lang w:val="es-AR"/>
+                              </w:rPr>
+                              <w:t xml:space="preserve">FUNCION: </w:t>
+                            </w:r>
+                            <w:proofErr w:type="spellStart"/>
+                            <w:r>
+                              <w:rPr>
+                                <w:lang w:val="es-AR"/>
+                              </w:rPr>
+                              <w:t>pesos_a_</w:t>
+                            </w:r>
+                            <w:proofErr w:type="gramStart"/>
+                            <w:r>
+                              <w:rPr>
+                                <w:lang w:val="es-AR"/>
+                              </w:rPr>
+                              <w:t>dolares</w:t>
+                            </w:r>
+                            <w:proofErr w:type="spellEnd"/>
+                            <w:r>
+                              <w:rPr>
+                                <w:lang w:val="es-AR"/>
+                              </w:rPr>
+                              <w:t>(</w:t>
+                            </w:r>
+                            <w:proofErr w:type="gramEnd"/>
+                            <w:r>
+                              <w:rPr>
+                                <w:lang w:val="es-AR"/>
+                              </w:rPr>
+                              <w:t>pesos, cambio)</w:t>
+                            </w:r>
+                          </w:p>
+                          <w:p>
+                            <w:pPr>
+                              <w:ind w:firstLine="0"/>
+                              <w:rPr>
+                                <w:lang w:val="es-AR"/>
+                              </w:rPr>
+                            </w:pPr>
+                            <w:r>
+                              <w:rPr>
+                                <w:lang w:val="es-AR"/>
+                              </w:rPr>
+                              <w:t>RETORNAR pesos/cambio</w:t>
+                            </w:r>
+                          </w:p>
+                        </w:txbxContent>
+                      </wps:txbx>
+                      <wps:bodyPr rot="0" vert="horz" wrap="square" lIns="91440" tIns="45720" rIns="91440" bIns="45720" anchor="t" anchorCtr="0">
+                        <a:spAutoFit/>
+                      </wps:bodyPr>
+                    </wps:wsp>
+                  </a:graphicData>
+                </a:graphic>
+              </wp:anchor>
+            </w:drawing>
+          </mc:Choice>
+          <mc:Fallback>
+            <w:pict>
+              <v:shape w14:anchorId="007E8F2D" id="_x0000_s1027" type="#_x0000_t202" style="position:absolute;left:0;text-align:left;margin-left:110.5pt;margin-top:28.4pt;width:245pt;height:110.6pt;z-index:251659264;visibility:visible;mso-wrap-style:square;mso-wrap-distance-left:9pt;mso-wrap-distance-top:0;mso-wrap-distance-right:9pt;mso-wrap-distance-bottom:0;mso-position-horizontal:absolute;mso-position-horizontal-relative:text;mso-position-vertical:absolute;mso-position-vertical-relative:text;v-text-anchor:top" o:gfxdata="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">
+                <v:textbox style="mso-fit-shape-to-text:t">
+                  <w:txbxContent>
+                    <w:p>
+                      <w:pPr>
+                        <w:ind w:firstLine="0"/>
+                        <w:rPr>
+                          <w:lang w:val="es-AR"/>
+                        </w:rPr>
+                      </w:pPr>
+                      <w:r>
+                        <w:rPr>
+                          <w:lang w:val="es-AR"/>
+                        </w:rPr>
+                        <w:t xml:space="preserve">FUNCION: </w:t>
+                      </w:r>
+                      <w:proofErr w:type="spellStart"/>
+                      <w:r>
+                        <w:rPr>
+                          <w:lang w:val="es-AR"/>
+                        </w:rPr>
+                        <w:t>pesos_a_</w:t>
+                      </w:r>
+                      <w:proofErr w:type="gramStart"/>
+                      <w:r>
+                        <w:rPr>
+                          <w:lang w:val="es-AR"/>
+                        </w:rPr>
+                        <w:t>dolares</w:t>
+                      </w:r>
+                      <w:proofErr w:type="spellEnd"/>
+                      <w:r>
+                        <w:rPr>
+                          <w:lang w:val="es-AR"/>
+                        </w:rPr>
+                        <w:t>(</w:t>
+                      </w:r>
+                      <w:proofErr w:type="gramEnd"/>
+                      <w:r>
+                        <w:rPr>
+                          <w:lang w:val="es-AR"/>
+                        </w:rPr>
+                        <w:t>pesos, cambio)</w:t>
+                      </w:r>
+                    </w:p>
+                    <w:p>
+                      <w:pPr>
+                        <w:ind w:firstLine="0"/>
+                        <w:rPr>
+                          <w:lang w:val="es-AR"/>
+                        </w:rPr>
+                      </w:pPr>
+                      <w:r>
+                        <w:rPr>
+                          <w:lang w:val="es-AR"/>
+                        </w:rPr>
+                        <w:t>RETORNAR pesos/cambio</w:t>
+                      </w:r>
+                    </w:p>
+                  </w:txbxContent>
+                </v:textbox>
+                <w10:wrap type="topAndBottom"/>
+              </v:shape>
+            </w:pict>
+          </mc:Fallback>
+        </mc:AlternateContent>
+      </w:r>
+      <w:r>
+        <w:rPr>
+          <w:lang w:val="es-AR"/>
+        </w:rPr>
+        <w:t>Green: hacer que el test funcione de manera simple.</w:t>
+      </w:r>
+    </w:p>
+    <w:p>
+      <w:pPr>
+        <w:pStyle w:val="Prrafodelista"/>
+        <w:ind w:left="1440"/>
+        <w:rPr>
+          <w:lang w:val="es-AR"/>
+        </w:rPr>
+      </w:pPr>
+      <w:r>
+        <w:rPr>
+          <w:lang w:val="es-AR"/>
+        </w:rPr>
+        <w:t>Realizamos la prueba ahora y está será exitosa.</w:t>
+      </w:r>
+    </w:p>
+    <w:p>
+      <w:pPr>
+        <w:pStyle w:val="Prrafodelista"/>
+        <w:numPr>
+          <w:ilvl w:val="0"/>
+          <w:numId w:val="31"/>
+        </w:numPr>
+        <w:rPr>
+          <w:lang w:val="es-AR"/>
+        </w:rPr>
+      </w:pPr>
+      <w:proofErr w:type="spellStart"/>
+      <w:r>
+        <w:rPr>
+          <w:lang w:val="es-AR"/>
+        </w:rPr>
+        <w:t>Refactor</w:t>
+      </w:r>
+      <w:proofErr w:type="spellEnd"/>
+      <w:r>
+        <w:rPr>
+          <w:lang w:val="es-AR"/>
+        </w:rPr>
+        <w:t>: como hasta acá el caso es muy sencillo, no requiere de ajustes.</w:t>
+      </w:r>
+    </w:p>
+    <w:p>
+      <w:pPr>
+        <w:ind w:left="720" w:firstLine="0"/>
+        <w:rPr>
+          <w:lang w:val="es-AR"/>
+        </w:rPr>
+      </w:pPr>
+    </w:p>
+    <w:p>
+      <w:pPr>
+        <w:ind w:left="720" w:firstLine="0"/>
+        <w:rPr>
+          <w:lang w:val="es-AR"/>
+        </w:rPr>
+      </w:pPr>
+      <w:r>
+        <w:rPr>
+          <w:lang w:val="es-AR"/>
+        </w:rPr>
+        <w:t>Función valores negativos: supondremos ahora que se quiere convertir un monto en pesos de -1500 con un cambio de 1500</w:t>
+      </w:r>
+    </w:p>
+    <w:p>
+      <w:pPr>
+        <w:pStyle w:val="Prrafodelista"/>
+        <w:numPr>
+          <w:ilvl w:val="0"/>
+          <w:numId w:val="31"/>
+        </w:numPr>
+        <w:rPr>
+          <w:lang w:val="es-AR"/>
+        </w:rPr>
+      </w:pPr>
+      <w:r>
+        <w:rPr>
+          <w:noProof/>
+          <w:lang w:eastAsia="es-ES"/>
+        </w:rPr>
+        <mc:AlternateContent>
+          <mc:Choice Requires="wps">
+            <w:drawing>
+              <wp:anchor distT="0" distB="0" distL="114300" distR="114300" simplePos="0" relativeHeight="251661312" behindDoc="1" locked="0" layoutInCell="1" allowOverlap="1" wp14:anchorId="6AD0B09B" wp14:editId="63142C75">
+                <wp:simplePos x="0" y="0"/>
+                <wp:positionH relativeFrom="column">
+                  <wp:posOffset>1143000</wp:posOffset>
+                </wp:positionH>
+                <wp:positionV relativeFrom="paragraph">
+                  <wp:posOffset>250190</wp:posOffset>
+                </wp:positionV>
+                <wp:extent cx="3600450" cy="1168400"/>
+                <wp:effectExtent l="0" t="0" r="19050" b="12700"/>
+                <wp:wrapTopAndBottom/>
+                <wp:docPr id="3" name="Cuadro de texto 2"/>
+                <wp:cNvGraphicFramePr>
+                  <a:graphicFrameLocks xmlns:a="http://schemas.openxmlformats.org/drawingml/2006/main"/>
+                </wp:cNvGraphicFramePr>
+                <a:graphic xmlns:a="http://schemas.openxmlformats.org/drawingml/2006/main">
+                  <a:graphicData uri="http://schemas.microsoft.com/office/word/2010/wordprocessingShape">
+                    <wps:wsp>
+                      <wps:cNvSpPr txBox="1">
+                        <a:spLocks noChangeArrowheads="1"/>
+                      </wps:cNvSpPr>
+                      <wps:spPr bwMode="auto">
+                        <a:xfrm>
+                          <a:off x="0" y="0"/>
+                          <a:ext cx="3600450" cy="1168400"/>
+                        </a:xfrm>
+                        <a:prstGeom prst="rect">
+                          <a:avLst/>
+                        </a:prstGeom>
+                        <a:solidFill>
+                          <a:srgbClr val="FFFFFF"/>
+                        </a:solidFill>
+                        <a:ln w="9525">
+                          <a:solidFill>
+                            <a:srgbClr val="000000"/>
+                          </a:solidFill>
+                          <a:miter lim="800000"/>
+                          <a:headEnd/>
+                          <a:tailEnd/>
+                        </a:ln>
+                      </wps:spPr>
+                      <wps:txbx>
+                        <w:txbxContent>
+                          <w:p>
+                            <w:pPr>
+                              <w:ind w:firstLine="0"/>
+                              <w:rPr>
+                                <w:lang w:val="es-AR"/>
+                              </w:rPr>
+                            </w:pPr>
+                            <w:r>
+                              <w:rPr>
+                                <w:lang w:val="es-AR"/>
+                              </w:rPr>
+                              <w:t xml:space="preserve">PRUEBA: </w:t>
+                            </w:r>
+                            <w:proofErr w:type="spellStart"/>
+                            <w:r>
+                              <w:rPr>
+                                <w:lang w:val="es-AR"/>
+                              </w:rPr>
+                              <w:t>valor_negativo</w:t>
+                            </w:r>
+                            <w:proofErr w:type="spellEnd"/>
+                          </w:p>
+                          <w:p>
+                            <w:pPr>
+                              <w:ind w:firstLine="0"/>
+                              <w:rPr>
+                                <w:lang w:val="es-AR"/>
+                              </w:rPr>
+                            </w:pPr>
+                            <w:r>
+                              <w:rPr>
+                                <w:lang w:val="es-AR"/>
+                              </w:rPr>
+                              <w:t xml:space="preserve">resultado </w:t>
+                            </w:r>
+                            <w:r>
+                              <w:rPr>
+                                <w:lang w:val="en-US"/>
+                              </w:rPr>
+                              <w:sym w:font="Wingdings" w:char="F0DF"/>
+                            </w:r>
+                            <w:r>
+                              <w:t xml:space="preserve"> </w:t>
+                            </w:r>
+                            <w:proofErr w:type="spellStart"/>
+                            <w:r>
+                              <w:rPr>
+                                <w:lang w:val="es-AR"/>
+                              </w:rPr>
+                              <w:t>pesos_a_dolares</w:t>
+                            </w:r>
+                            <w:proofErr w:type="spellEnd"/>
+                            <w:r>
+                              <w:rPr>
+                                <w:lang w:val="es-AR"/>
+                              </w:rPr>
+                              <w:t>(-1500,1500)</w:t>
+                            </w:r>
+                          </w:p>
+                          <w:p>
+                            <w:pPr>
+                              <w:ind w:firstLine="0"/>
+                            </w:pPr>
+                            <w:r>
+                              <w:rPr>
+                                <w:lang w:val="es-AR"/>
+                              </w:rPr>
+                              <w:t>VERIFICAR produzca ERROR</w:t>
+                            </w:r>
+                          </w:p>
+                        </w:txbxContent>
+                      </wps:txbx>
+                      <wps:bodyPr rot="0" vert="horz" wrap="square" lIns="91440" tIns="45720" rIns="91440" bIns="45720" anchor="ctr" anchorCtr="0">
+                        <a:noAutofit/>
+                      </wps:bodyPr>
+                    </wps:wsp>
+                  </a:graphicData>
+                </a:graphic>
+                <wp14:sizeRelH relativeFrom="margin">
+                  <wp14:pctWidth>0</wp14:pctWidth>
+                </wp14:sizeRelH>
+              </wp:anchor>
+            </w:drawing>
+          </mc:Choice>
+          <mc:Fallback>
+            <w:pict>
+              <v:shape w14:anchorId="6AD0B09B" id="_x0000_s1028" type="#_x0000_t202" style="position:absolute;left:0;text-align:left;margin-left:90pt;margin-top:19.7pt;width:283.5pt;height:92pt;z-index:-251655168;visibility:visible;mso-wrap-style:square;mso-width-percent:0;mso-wrap-distance-left:9pt;mso-wrap-distance-top:0;mso-wrap-distance-right:9pt;mso-wrap-distance-bottom:0;mso-position-horizontal:absolute;mso-position-horizontal-relative:text;mso-position-vertical:absolute;mso-position-vertical-relative:text;mso-width-percent:0;mso-width-relative:margin;v-text-anchor:middle" o:gfxdata="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">
+                <v:textbox>
+                  <w:txbxContent>
+                    <w:p>
+                      <w:pPr>
+                        <w:ind w:firstLine="0"/>
+                        <w:rPr>
+                          <w:lang w:val="es-AR"/>
+                        </w:rPr>
+                      </w:pPr>
+                      <w:r>
+                        <w:rPr>
+                          <w:lang w:val="es-AR"/>
+                        </w:rPr>
+                        <w:t xml:space="preserve">PRUEBA: </w:t>
+                      </w:r>
+                      <w:proofErr w:type="spellStart"/>
+                      <w:r>
+                        <w:rPr>
+                          <w:lang w:val="es-AR"/>
+                        </w:rPr>
+                        <w:t>valor_negativo</w:t>
+                      </w:r>
+                      <w:proofErr w:type="spellEnd"/>
+                    </w:p>
+                    <w:p>
+                      <w:pPr>
+                        <w:ind w:firstLine="0"/>
+                        <w:rPr>
+                          <w:lang w:val="es-AR"/>
+                        </w:rPr>
+                      </w:pPr>
+                      <w:r>
+                        <w:rPr>
+                          <w:lang w:val="es-AR"/>
+                        </w:rPr>
+                        <w:t xml:space="preserve">resultado </w:t>
+                      </w:r>
+                      <w:r>
+                        <w:rPr>
+                          <w:lang w:val="en-US"/>
+                        </w:rPr>
+                        <w:sym w:font="Wingdings" w:char="F0DF"/>
+                      </w:r>
+                      <w:r>
+                        <w:t xml:space="preserve"> </w:t>
+                      </w:r>
+                      <w:proofErr w:type="spellStart"/>
+                      <w:r>
+                        <w:rPr>
+                          <w:lang w:val="es-AR"/>
+                        </w:rPr>
+                        <w:t>pesos_a_dolares</w:t>
+                      </w:r>
+                      <w:proofErr w:type="spellEnd"/>
+                      <w:r>
+                        <w:rPr>
+                          <w:lang w:val="es-AR"/>
+                        </w:rPr>
+                        <w:t>(-1500,1500)</w:t>
+                      </w:r>
+                    </w:p>
+                    <w:p>
+                      <w:pPr>
+                        <w:ind w:firstLine="0"/>
+                      </w:pPr>
+                      <w:r>
+                        <w:rPr>
+                          <w:lang w:val="es-AR"/>
+                        </w:rPr>
+                        <w:t>VERIFICAR produzca ERROR</w:t>
+                      </w:r>
+                    </w:p>
+                  </w:txbxContent>
+                </v:textbox>
+                <w10:wrap type="topAndBottom"/>
+              </v:shape>
+            </w:pict>
+          </mc:Fallback>
+        </mc:AlternateContent>
+      </w:r>
+      <w:r>
+        <w:rPr>
+          <w:lang w:val="es-AR"/>
+        </w:rPr>
+        <w:t>Red: prueba que falle.</w:t>
+      </w:r>
+    </w:p>
+    <w:p>
+      <w:pPr>
+        <w:pStyle w:val="Prrafodelista"/>
+        <w:ind w:left="1440"/>
+        <w:rPr>
+          <w:lang w:val="es-AR"/>
+        </w:rPr>
+      </w:pPr>
+      <w:r>
+        <w:rPr>
+          <w:lang w:val="es-AR"/>
+        </w:rPr>
+        <w:t xml:space="preserve">La prueba falla, pues no existe la función </w:t>
+      </w:r>
+      <w:proofErr w:type="spellStart"/>
+      <w:r>
+        <w:rPr>
+          <w:lang w:val="es-AR"/>
+        </w:rPr>
+        <w:t>pesos_negativos_a_dolares</w:t>
+      </w:r>
+      <w:proofErr w:type="spellEnd"/>
+      <w:r>
+        <w:rPr>
+          <w:lang w:val="es-AR"/>
+        </w:rPr>
+        <w:t>.</w:t>
+      </w:r>
+    </w:p>
+    <w:p>
+      <w:pPr>
+        <w:pStyle w:val="Prrafodelista"/>
+        <w:numPr>
+          <w:ilvl w:val="0"/>
+          <w:numId w:val="31"/>
+        </w:numPr>
+        <w:rPr>
+          <w:lang w:val="es-AR"/>
+        </w:rPr>
+      </w:pPr>
+      <w:r>
+        <w:rPr>
+          <w:noProof/>
+          <w:lang w:eastAsia="es-ES"/>
+        </w:rPr>
+        <mc:AlternateContent>
+          <mc:Choice Requires="wps">
+            <w:drawing>
+              <wp:anchor distT="0" distB="0" distL="114300" distR="114300" simplePos="0" relativeHeight="251663360" behindDoc="0" locked="0" layoutInCell="1" allowOverlap="1" wp14:anchorId="18219D8D" wp14:editId="5CA5DFF2">
+                <wp:simplePos x="0" y="0"/>
+                <wp:positionH relativeFrom="column">
+                  <wp:posOffset>1200150</wp:posOffset>
+                </wp:positionH>
+                <wp:positionV relativeFrom="paragraph">
+                  <wp:posOffset>480695</wp:posOffset>
+                </wp:positionV>
+                <wp:extent cx="3759200" cy="1404620"/>
+                <wp:effectExtent l="0" t="0" r="12700" b="17780"/>
+                <wp:wrapTopAndBottom/>
+                <wp:docPr id="5" name="Cuadro de texto 5"/>
+                <wp:cNvGraphicFramePr>
+                  <a:graphicFrameLocks xmlns:a="http://schemas.openxmlformats.org/drawingml/2006/main"/>
+                </wp:cNvGraphicFramePr>
+                <a:graphic xmlns:a="http://schemas.openxmlformats.org/drawingml/2006/main">
+                  <a:graphicData uri="http://schemas.microsoft.com/office/word/2010/wordprocessingShape">
+                    <wps:wsp>
+                      <wps:cNvSpPr txBox="1">
+                        <a:spLocks noChangeArrowheads="1"/>
+                      </wps:cNvSpPr>
+                      <wps:spPr bwMode="auto">
+                        <a:xfrm>
+                          <a:off x="0" y="0"/>
+                          <a:ext cx="3759200" cy="1404620"/>
+                        </a:xfrm>
+                        <a:prstGeom prst="rect">
+                          <a:avLst/>
+                        </a:prstGeom>
+                        <a:solidFill>
+                          <a:srgbClr val="FFFFFF"/>
+                        </a:solidFill>
+                        <a:ln w="9525">
+                          <a:solidFill>
+                            <a:srgbClr val="000000"/>
+                          </a:solidFill>
+                          <a:miter lim="800000"/>
+                          <a:headEnd/>
+                          <a:tailEnd/>
+                        </a:ln>
+                      </wps:spPr>
+                      <wps:txbx>
+                        <w:txbxContent>
+                          <w:p>
+                            <w:pPr>
+                              <w:ind w:firstLine="0"/>
+                              <w:rPr>
+                                <w:lang w:val="es-AR"/>
+                              </w:rPr>
+                            </w:pPr>
+                            <w:r>
+                              <w:rPr>
+                                <w:lang w:val="es-AR"/>
+                              </w:rPr>
+                              <w:t xml:space="preserve">FUNCION: </w:t>
+                            </w:r>
+                            <w:proofErr w:type="spellStart"/>
+                            <w:r>
+                              <w:rPr>
+                                <w:lang w:val="es-AR"/>
+                              </w:rPr>
+                              <w:t>pesos_a_</w:t>
+                            </w:r>
+                            <w:proofErr w:type="gramStart"/>
+                            <w:r>
+                              <w:rPr>
+                                <w:lang w:val="es-AR"/>
+                              </w:rPr>
+                              <w:t>dolares</w:t>
+                            </w:r>
+                            <w:proofErr w:type="spellEnd"/>
+                            <w:r>
+                              <w:rPr>
+                                <w:lang w:val="es-AR"/>
+                              </w:rPr>
+                              <w:t>(</w:t>
+                            </w:r>
+                            <w:proofErr w:type="spellStart"/>
+                            <w:proofErr w:type="gramEnd"/>
+                            <w:r>
+                              <w:rPr>
+                                <w:lang w:val="es-AR"/>
+                              </w:rPr>
+                              <w:t>pesos_negativos</w:t>
+                            </w:r>
+                            <w:proofErr w:type="spellEnd"/>
+                            <w:r>
+                              <w:rPr>
+                                <w:lang w:val="es-AR"/>
+                              </w:rPr>
+                              <w:t>, cambio)</w:t>
+                            </w:r>
+                          </w:p>
+                          <w:p>
+                            <w:pPr>
+                              <w:ind w:firstLine="0"/>
+                              <w:rPr>
+                                <w:lang w:val="es-AR"/>
+                              </w:rPr>
+                            </w:pPr>
+                            <w:r>
+                              <w:rPr>
+                                <w:lang w:val="es-AR"/>
+                              </w:rPr>
+                              <w:t xml:space="preserve">SI pesos </w:t>
+                            </w:r>
+                            <w:r>
+                              <w:t>&lt;</w:t>
+                            </w:r>
+                            <w:r>
+                              <w:rPr>
+                                <w:lang w:val="es-AR"/>
+                              </w:rPr>
+                              <w:t xml:space="preserve"> 0 ENTONCES</w:t>
+                            </w:r>
+                          </w:p>
+                          <w:p>
+                            <w:pPr>
+                              <w:ind w:firstLine="0"/>
+                              <w:rPr>
+                                <w:lang w:val="es-AR"/>
+                              </w:rPr>
+                            </w:pPr>
+                            <w:r>
+                              <w:rPr>
+                                <w:lang w:val="es-AR"/>
+                              </w:rPr>
+                              <w:tab/>
+                              <w:t>RETORNAR ERROR</w:t>
+                            </w:r>
+                          </w:p>
+                          <w:p>
+                            <w:pPr>
+                              <w:ind w:firstLine="0"/>
+                              <w:rPr>
+                                <w:lang w:val="es-AR"/>
+                              </w:rPr>
+                            </w:pPr>
+                            <w:r>
+                              <w:rPr>
+                                <w:lang w:val="es-AR"/>
+                              </w:rPr>
+                              <w:t xml:space="preserve">SINO </w:t>
+                            </w:r>
+                          </w:p>
+                          <w:p>
+                            <w:pPr>
+                              <w:rPr>
+                                <w:lang w:val="es-AR"/>
+                              </w:rPr>
+                            </w:pPr>
+                            <w:r>
+                              <w:rPr>
+                                <w:lang w:val="es-AR"/>
+                              </w:rPr>
+                              <w:t>RETORNAR pesos/cambio</w:t>
+                            </w:r>
+                          </w:p>
+                        </w:txbxContent>
+                      </wps:txbx>
+                      <wps:bodyPr rot="0" vert="horz" wrap="square" lIns="91440" tIns="45720" rIns="91440" bIns="45720" anchor="t" anchorCtr="0">
+                        <a:spAutoFit/>
+                      </wps:bodyPr>
+                    </wps:wsp>
+                  </a:graphicData>
+                </a:graphic>
+                <wp14:sizeRelH relativeFrom="margin">
+                  <wp14:pctWidth>0</wp14:pctWidth>
+                </wp14:sizeRelH>
+              </wp:anchor>
+            </w:drawing>
+          </mc:Choice>
+          <mc:Fallback>
+            <w:pict>
+              <v:shape w14:anchorId="18219D8D" id="Cuadro de texto 5" o:spid="_x0000_s1029" type="#_x0000_t202" style="position:absolute;left:0;text-align:left;margin-left:94.5pt;margin-top:37.85pt;width:296pt;height:110.6pt;z-index:251663360;visibility:visible;mso-wrap-style:square;mso-width-percent:0;mso-wrap-distance-left:9pt;mso-wrap-distance-top:0;mso-wrap-distance-right:9pt;mso-wrap-distance-bottom:0;mso-position-horizontal:absolute;mso-position-horizontal-relative:text;mso-position-vertical:absolute;mso-position-vertical-relative:text;mso-width-percent:0;mso-width-relative:margin;v-text-anchor:top" o:gfxdata="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">
+                <v:textbox style="mso-fit-shape-to-text:t">
+                  <w:txbxContent>
+                    <w:p>
+                      <w:pPr>
+                        <w:ind w:firstLine="0"/>
+                        <w:rPr>
+                          <w:lang w:val="es-AR"/>
+                        </w:rPr>
+                      </w:pPr>
+                      <w:r>
+                        <w:rPr>
+                          <w:lang w:val="es-AR"/>
+                        </w:rPr>
+                        <w:t xml:space="preserve">FUNCION: </w:t>
+                      </w:r>
+                      <w:proofErr w:type="spellStart"/>
+                      <w:r>
+                        <w:rPr>
+                          <w:lang w:val="es-AR"/>
+                        </w:rPr>
+                        <w:t>pesos_a_</w:t>
+                      </w:r>
+                      <w:proofErr w:type="gramStart"/>
+                      <w:r>
+                        <w:rPr>
+                          <w:lang w:val="es-AR"/>
+                        </w:rPr>
+                        <w:t>dolares</w:t>
+                      </w:r>
+                      <w:proofErr w:type="spellEnd"/>
+                      <w:r>
+                        <w:rPr>
+                          <w:lang w:val="es-AR"/>
+                        </w:rPr>
+                        <w:t>(</w:t>
+                      </w:r>
+                      <w:proofErr w:type="spellStart"/>
+                      <w:proofErr w:type="gramEnd"/>
+                      <w:r>
+                        <w:rPr>
+                          <w:lang w:val="es-AR"/>
+                        </w:rPr>
+                        <w:t>pesos_negativos</w:t>
+                      </w:r>
+                      <w:proofErr w:type="spellEnd"/>
+                      <w:r>
+                        <w:rPr>
+                          <w:lang w:val="es-AR"/>
+                        </w:rPr>
+                        <w:t>, cambio)</w:t>
+                      </w:r>
+                    </w:p>
+                    <w:p>
+                      <w:pPr>
+                        <w:ind w:firstLine="0"/>
+                        <w:rPr>
+                          <w:lang w:val="es-AR"/>
+                        </w:rPr>
+                      </w:pPr>
+                      <w:r>
+                        <w:rPr>
+                          <w:lang w:val="es-AR"/>
+                        </w:rPr>
+                        <w:t xml:space="preserve">SI pesos </w:t>
+                      </w:r>
+                      <w:r>
+                        <w:t>&lt;</w:t>
+                      </w:r>
+                      <w:r>
+                        <w:rPr>
+                          <w:lang w:val="es-AR"/>
+                        </w:rPr>
+                        <w:t xml:space="preserve"> 0 ENTONCES</w:t>
+                      </w:r>
+                    </w:p>
+                    <w:p>
+                      <w:pPr>
+                        <w:ind w:firstLine="0"/>
+                        <w:rPr>
+                          <w:lang w:val="es-AR"/>
+                        </w:rPr>
+                      </w:pPr>
+                      <w:r>
+                        <w:rPr>
+                          <w:lang w:val="es-AR"/>
+                        </w:rPr>
+                        <w:tab/>
+                        <w:t>RETORNAR ERROR</w:t>
+                      </w:r>
+                    </w:p>
+                    <w:p>
+                      <w:pPr>
+                        <w:ind w:firstLine="0"/>
+                        <w:rPr>
+                          <w:lang w:val="es-AR"/>
+                        </w:rPr>
+                      </w:pPr>
+                      <w:r>
+                        <w:rPr>
+                          <w:lang w:val="es-AR"/>
+                        </w:rPr>
+                        <w:t xml:space="preserve">SINO </w:t>
+                      </w:r>
+                    </w:p>
+                    <w:p>
+                      <w:pPr>
+                        <w:rPr>
+                          <w:lang w:val="es-AR"/>
+                        </w:rPr>
+                      </w:pPr>
+                      <w:r>
+                        <w:rPr>
+                          <w:lang w:val="es-AR"/>
+                        </w:rPr>
+                        <w:t>RETORNAR pesos/cambio</w:t>
+                      </w:r>
+                    </w:p>
+                  </w:txbxContent>
+                </v:textbox>
+                <w10:wrap type="topAndBottom"/>
+              </v:shape>
+            </w:pict>
+          </mc:Fallback>
+        </mc:AlternateContent>
+      </w:r>
+      <w:r>
+        <w:rPr>
+          <w:lang w:val="es-AR"/>
+        </w:rPr>
+        <w:t>Green: hacer funcionar a la prueba.</w:t>
+      </w:r>
+    </w:p>
+    <w:p>
+      <w:pPr>
+        <w:pStyle w:val="Prrafodelista"/>
+        <w:ind w:left="1440"/>
+        <w:rPr>
+          <w:lang w:val="es-AR"/>
+        </w:rPr>
+      </w:pPr>
+      <w:r>
+        <w:rPr>
+          <w:lang w:val="es-AR"/>
+        </w:rPr>
+        <w:lastRenderedPageBreak/>
+        <w:t>Se ejecuta la prueba y se pasa exitosamente.</w:t>
+      </w:r>
+    </w:p>
+    <w:p>
+      <w:pPr>
+        <w:pStyle w:val="Prrafodelista"/>
+        <w:numPr>
+          <w:ilvl w:val="0"/>
+          <w:numId w:val="31"/>
+        </w:numPr>
+        <w:rPr>
+          <w:lang w:val="es-AR"/>
+        </w:rPr>
+      </w:pPr>
+      <w:proofErr w:type="spellStart"/>
+      <w:r>
+        <w:rPr>
+          <w:lang w:val="es-AR"/>
+        </w:rPr>
+        <w:t>Refactor</w:t>
+      </w:r>
+      <w:proofErr w:type="spellEnd"/>
+      <w:r>
+        <w:rPr>
+          <w:lang w:val="es-AR"/>
+        </w:rPr>
+        <w:t xml:space="preserve">: </w:t>
+      </w:r>
+      <w:r>
+        <w:rPr>
+          <w:lang w:val="es-AR"/>
+        </w:rPr>
+        <w:t xml:space="preserve">en este caso como tal, no hay mejoras que se puedan realizar sobre el código, lo que si se hace es quedarnos únicamente con la segunda función realizada, de esta forma evitamos duplicaciones </w:t>
+      </w:r>
+      <w:r>
+        <w:rPr>
+          <w:lang w:val="es-AR"/>
+        </w:rPr>
+        <w:t>y la segunda función contiene a la primera, por lo tanto, las pruebas seguirán pasando correctamente.</w:t>
+      </w:r>
+    </w:p>
+    <w:p>
+      <w:pPr>
+        <w:pStyle w:val="Prrafodelista"/>
+        <w:numPr>
+          <w:ilvl w:val="0"/>
+          <w:numId w:val="32"/>
+        </w:numPr>
+        <w:rPr>
+          <w:lang w:val="es-AR"/>
+        </w:rPr>
+      </w:pPr>
+      <w:r>
+        <w:rPr>
+          <w:lang w:val="es-AR"/>
+        </w:rPr>
+        <w:t>Se desea una determinar si un número de documento especifico forma parte de una lista de proporcionada previamente. Se debe tener en cuenta que los números de documentos son tratados como cadenas de caracteres de 8 dígitos.</w:t>
+      </w:r>
+    </w:p>
+    <w:p>
+      <w:pPr>
+        <w:pStyle w:val="Prrafodelista"/>
+        <w:ind w:left="1080"/>
+        <w:rPr>
+          <w:lang w:val="es-AR"/>
+        </w:rPr>
+      </w:pPr>
+      <w:r>
+        <w:rPr>
+          <w:lang w:val="es-AR"/>
+        </w:rPr>
+        <w:t>Prueba básica para el caso en el que DNI buscado se encuentre en la lista:</w:t>
+      </w:r>
+    </w:p>
+    <w:p>
+      <w:pPr>
+        <w:pStyle w:val="Prrafodelista"/>
+        <w:numPr>
+          <w:ilvl w:val="0"/>
+          <w:numId w:val="31"/>
+        </w:numPr>
+        <w:rPr>
+          <w:lang w:val="es-AR"/>
+        </w:rPr>
+      </w:pPr>
+      <w:r>
+        <w:rPr>
+          <w:noProof/>
+          <w:lang w:eastAsia="es-ES"/>
+        </w:rPr>
+        <mc:AlternateContent>
+          <mc:Choice Requires="wps">
+            <w:drawing>
+              <wp:anchor distT="0" distB="0" distL="114300" distR="114300" simplePos="0" relativeHeight="251665408" behindDoc="1" locked="0" layoutInCell="1" allowOverlap="1" wp14:anchorId="3F7574B9" wp14:editId="180BB8C6">
+                <wp:simplePos x="0" y="0"/>
+                <wp:positionH relativeFrom="column">
+                  <wp:posOffset>1208405</wp:posOffset>
+                </wp:positionH>
+                <wp:positionV relativeFrom="paragraph">
+                  <wp:posOffset>412750</wp:posOffset>
+                </wp:positionV>
+                <wp:extent cx="3784600" cy="1398905"/>
+                <wp:effectExtent l="0" t="0" r="25400" b="10795"/>
+                <wp:wrapTopAndBottom/>
+                <wp:docPr id="4" name="Cuadro de texto 2"/>
+                <wp:cNvGraphicFramePr>
+                  <a:graphicFrameLocks xmlns:a="http://schemas.openxmlformats.org/drawingml/2006/main"/>
+                </wp:cNvGraphicFramePr>
+                <a:graphic xmlns:a="http://schemas.openxmlformats.org/drawingml/2006/main">
+                  <a:graphicData uri="http://schemas.microsoft.com/office/word/2010/wordprocessingShape">
+                    <wps:wsp>
+                      <wps:cNvSpPr txBox="1">
+                        <a:spLocks noChangeArrowheads="1"/>
+                      </wps:cNvSpPr>
+                      <wps:spPr bwMode="auto">
+                        <a:xfrm>
+                          <a:off x="0" y="0"/>
+                          <a:ext cx="3784600" cy="1398905"/>
+                        </a:xfrm>
+                        <a:prstGeom prst="rect">
+                          <a:avLst/>
+                        </a:prstGeom>
+                        <a:solidFill>
+                          <a:srgbClr val="FFFFFF"/>
+                        </a:solidFill>
+                        <a:ln w="9525">
+                          <a:solidFill>
+                            <a:srgbClr val="000000"/>
+                          </a:solidFill>
+                          <a:miter lim="800000"/>
+                          <a:headEnd/>
+                          <a:tailEnd/>
+                        </a:ln>
+                      </wps:spPr>
+                      <wps:txbx>
+                        <w:txbxContent>
+                          <w:p>
+                            <w:pPr>
+                              <w:ind w:firstLine="0"/>
+                              <w:rPr>
+                                <w:lang w:val="es-AR"/>
+                              </w:rPr>
+                            </w:pPr>
+                            <w:r>
+                              <w:rPr>
+                                <w:lang w:val="es-AR"/>
+                              </w:rPr>
+                              <w:t xml:space="preserve">PRUEBA: </w:t>
+                            </w:r>
+                            <w:proofErr w:type="spellStart"/>
+                            <w:r>
+                              <w:rPr>
+                                <w:lang w:val="es-AR"/>
+                              </w:rPr>
+                              <w:t>verificar_existe_dni</w:t>
+                            </w:r>
+                            <w:proofErr w:type="spellEnd"/>
+                          </w:p>
+                          <w:p>
+                            <w:pPr>
+                              <w:ind w:firstLine="0"/>
+                              <w:rPr>
+                                <w:lang w:val="es-AR"/>
+                              </w:rPr>
+                            </w:pPr>
+                            <w:r>
+                              <w:rPr>
+                                <w:lang w:val="es-AR"/>
+                              </w:rPr>
+                              <w:t xml:space="preserve">lista </w:t>
+                            </w:r>
+                            <w:r>
+                              <w:rPr>
+                                <w:lang w:val="en-US"/>
+                              </w:rPr>
+                              <w:sym w:font="Wingdings" w:char="F0DF"/>
+                            </w:r>
+                            <w:r>
+                              <w:t xml:space="preserve"> </w:t>
+                            </w:r>
+                            <w:r>
+                              <w:rPr>
+                                <w:lang w:val="es-AR"/>
+                              </w:rPr>
+                              <w:t>[‘12345678’,’87654321’,’11111111’,’88888888’]</w:t>
+                            </w:r>
+                          </w:p>
+                          <w:p>
+                            <w:pPr>
+                              <w:ind w:firstLine="0"/>
+                              <w:rPr>
+                                <w:lang w:val="es-AR"/>
+                              </w:rPr>
+                            </w:pPr>
+                            <w:r>
+                              <w:rPr>
+                                <w:lang w:val="es-AR"/>
+                              </w:rPr>
+                              <w:t xml:space="preserve">resultado </w:t>
+                            </w:r>
+                            <w:r>
+                              <w:rPr>
+                                <w:lang w:val="en-US"/>
+                              </w:rPr>
+                              <w:sym w:font="Wingdings" w:char="F0DF"/>
+                            </w:r>
+                            <w:r>
+                              <w:t xml:space="preserve"> </w:t>
+                            </w:r>
+                            <w:proofErr w:type="spellStart"/>
+                            <w:r>
+                              <w:t>existe_dni</w:t>
+                            </w:r>
+                            <w:proofErr w:type="spellEnd"/>
+                            <w:r>
+                              <w:rPr>
+                                <w:lang w:val="es-AR"/>
+                              </w:rPr>
+                              <w:t>(‘12345678’, lista)</w:t>
+                            </w:r>
+                          </w:p>
+                          <w:p>
+                            <w:pPr>
+                              <w:ind w:firstLine="0"/>
+                            </w:pPr>
+                            <w:r>
+                              <w:rPr>
+                                <w:lang w:val="es-AR"/>
+                              </w:rPr>
+                              <w:t>VERIFICAR resultado = TRUE</w:t>
+                            </w:r>
+                          </w:p>
+                        </w:txbxContent>
+                      </wps:txbx>
+                      <wps:bodyPr rot="0" vert="horz" wrap="square" lIns="91440" tIns="45720" rIns="91440" bIns="45720" anchor="ctr" anchorCtr="0">
+                        <a:noAutofit/>
+                      </wps:bodyPr>
+                    </wps:wsp>
+                  </a:graphicData>
+                </a:graphic>
+                <wp14:sizeRelH relativeFrom="margin">
+                  <wp14:pctWidth>0</wp14:pctWidth>
+                </wp14:sizeRelH>
+                <wp14:sizeRelV relativeFrom="margin">
+                  <wp14:pctHeight>0</wp14:pctHeight>
+                </wp14:sizeRelV>
+              </wp:anchor>
+            </w:drawing>
+          </mc:Choice>
+          <mc:Fallback>
+            <w:pict>
+              <v:shape w14:anchorId="3F7574B9" id="_x0000_s1030" type="#_x0000_t202" style="position:absolute;left:0;text-align:left;margin-left:95.15pt;margin-top:32.5pt;width:298pt;height:110.15pt;z-index:-251651072;visibility:visible;mso-wrap-style:square;mso-width-percent:0;mso-height-percent:0;mso-wrap-distance-left:9pt;mso-wrap-distance-top:0;mso-wrap-distance-right:9pt;mso-wrap-distance-bottom:0;mso-position-horizontal:absolute;mso-position-horizontal-relative:text;mso-position-vertical:absolute;mso-position-vertical-relative:text;mso-width-percent:0;mso-height-percent:0;mso-width-relative:margin;mso-height-relative:margin;v-text-anchor:middle" o:gfxdata="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">
+                <v:textbox>
+                  <w:txbxContent>
+                    <w:p>
+                      <w:pPr>
+                        <w:ind w:firstLine="0"/>
+                        <w:rPr>
+                          <w:lang w:val="es-AR"/>
+                        </w:rPr>
+                      </w:pPr>
+                      <w:r>
+                        <w:rPr>
+                          <w:lang w:val="es-AR"/>
+                        </w:rPr>
+                        <w:t xml:space="preserve">PRUEBA: </w:t>
+                      </w:r>
+                      <w:proofErr w:type="spellStart"/>
+                      <w:r>
+                        <w:rPr>
+                          <w:lang w:val="es-AR"/>
+                        </w:rPr>
+                        <w:t>verificar_existe_dni</w:t>
+                      </w:r>
+                      <w:proofErr w:type="spellEnd"/>
+                    </w:p>
+                    <w:p>
+                      <w:pPr>
+                        <w:ind w:firstLine="0"/>
+                        <w:rPr>
+                          <w:lang w:val="es-AR"/>
+                        </w:rPr>
+                      </w:pPr>
+                      <w:r>
+                        <w:rPr>
+                          <w:lang w:val="es-AR"/>
+                        </w:rPr>
+                        <w:t xml:space="preserve">lista </w:t>
+                      </w:r>
+                      <w:r>
+                        <w:rPr>
+                          <w:lang w:val="en-US"/>
+                        </w:rPr>
+                        <w:sym w:font="Wingdings" w:char="F0DF"/>
+                      </w:r>
+                      <w:r>
+                        <w:t xml:space="preserve"> </w:t>
+                      </w:r>
+                      <w:r>
+                        <w:rPr>
+                          <w:lang w:val="es-AR"/>
+                        </w:rPr>
+                        <w:t>[‘12345678’,’87654321’,’11111111’,’88888888’]</w:t>
+                      </w:r>
+                    </w:p>
+                    <w:p>
+                      <w:pPr>
+                        <w:ind w:firstLine="0"/>
+                        <w:rPr>
+                          <w:lang w:val="es-AR"/>
+                        </w:rPr>
+                      </w:pPr>
+                      <w:r>
+                        <w:rPr>
+                          <w:lang w:val="es-AR"/>
+                        </w:rPr>
+                        <w:t xml:space="preserve">resultado </w:t>
+                      </w:r>
+                      <w:r>
+                        <w:rPr>
+                          <w:lang w:val="en-US"/>
+                        </w:rPr>
+                        <w:sym w:font="Wingdings" w:char="F0DF"/>
+                      </w:r>
+                      <w:r>
+                        <w:t xml:space="preserve"> </w:t>
+                      </w:r>
+                      <w:proofErr w:type="spellStart"/>
+                      <w:r>
+                        <w:t>existe_dni</w:t>
+                      </w:r>
+                      <w:proofErr w:type="spellEnd"/>
+                      <w:r>
+                        <w:rPr>
+                          <w:lang w:val="es-AR"/>
+                        </w:rPr>
+                        <w:t>(‘12345678’, lista)</w:t>
+                      </w:r>
+                    </w:p>
+                    <w:p>
+                      <w:pPr>
+                        <w:ind w:firstLine="0"/>
+                      </w:pPr>
+                      <w:r>
+                        <w:rPr>
+                          <w:lang w:val="es-AR"/>
+                        </w:rPr>
+                        <w:t>VERIFICAR resultado = TRUE</w:t>
+                      </w:r>
+                    </w:p>
+                  </w:txbxContent>
+                </v:textbox>
+                <w10:wrap type="topAndBottom"/>
+              </v:shape>
+            </w:pict>
+          </mc:Fallback>
+        </mc:AlternateContent>
+      </w:r>
+      <w:r>
+        <w:rPr>
+          <w:lang w:val="es-AR"/>
+        </w:rPr>
+        <w:t>Red:</w:t>
+      </w:r>
+    </w:p>
+    <w:p>
+      <w:pPr>
+        <w:pStyle w:val="Prrafodelista"/>
+        <w:numPr>
+          <w:ilvl w:val="0"/>
+          <w:numId w:val="31"/>
+        </w:numPr>
+        <w:rPr>
+          <w:lang w:val="es-AR"/>
+        </w:rPr>
+      </w:pPr>
+      <w:r>
+        <w:rPr>
+          <w:noProof/>
+          <w:lang w:eastAsia="es-ES"/>
+        </w:rPr>
+        <mc:AlternateContent>
+          <mc:Choice Requires="wps">
+            <w:drawing>
+              <wp:anchor distT="0" distB="0" distL="114300" distR="114300" simplePos="0" relativeHeight="251667456" behindDoc="0" locked="0" layoutInCell="1" allowOverlap="1" wp14:anchorId="78A2648C" wp14:editId="08F83B6F">
+                <wp:simplePos x="0" y="0"/>
+                <wp:positionH relativeFrom="column">
+                  <wp:posOffset>1327867</wp:posOffset>
+                </wp:positionH>
+                <wp:positionV relativeFrom="paragraph">
+                  <wp:posOffset>1806575</wp:posOffset>
+                </wp:positionV>
+                <wp:extent cx="3759200" cy="1404620"/>
+                <wp:effectExtent l="0" t="0" r="12700" b="17780"/>
+                <wp:wrapTopAndBottom/>
+                <wp:docPr id="6" name="Cuadro de texto 6"/>
+                <wp:cNvGraphicFramePr>
+                  <a:graphicFrameLocks xmlns:a="http://schemas.openxmlformats.org/drawingml/2006/main"/>
+                </wp:cNvGraphicFramePr>
+                <a:graphic xmlns:a="http://schemas.openxmlformats.org/drawingml/2006/main">
+                  <a:graphicData uri="http://schemas.microsoft.com/office/word/2010/wordprocessingShape">
+                    <wps:wsp>
+                      <wps:cNvSpPr txBox="1">
+                        <a:spLocks noChangeArrowheads="1"/>
+                      </wps:cNvSpPr>
+                      <wps:spPr bwMode="auto">
+                        <a:xfrm>
+                          <a:off x="0" y="0"/>
+                          <a:ext cx="3759200" cy="1404620"/>
+                        </a:xfrm>
+                        <a:prstGeom prst="rect">
+                          <a:avLst/>
+                        </a:prstGeom>
+                        <a:solidFill>
+                          <a:srgbClr val="FFFFFF"/>
+                        </a:solidFill>
+                        <a:ln w="9525">
+                          <a:solidFill>
+                            <a:srgbClr val="000000"/>
+                          </a:solidFill>
+                          <a:miter lim="800000"/>
+                          <a:headEnd/>
+                          <a:tailEnd/>
+                        </a:ln>
+                      </wps:spPr>
+                      <wps:txbx>
+                        <w:txbxContent>
+                          <w:p>
+                            <w:pPr>
+                              <w:ind w:firstLine="0"/>
+                              <w:rPr>
+                                <w:lang w:val="es-AR"/>
+                              </w:rPr>
+                            </w:pPr>
+                            <w:r>
+                              <w:rPr>
+                                <w:lang w:val="es-AR"/>
+                              </w:rPr>
+                              <w:t xml:space="preserve">FUNCION: </w:t>
+                            </w:r>
+                            <w:proofErr w:type="spellStart"/>
+                            <w:r>
+                              <w:rPr>
+                                <w:lang w:val="es-AR"/>
+                              </w:rPr>
+                              <w:t>existe_</w:t>
+                            </w:r>
+                            <w:proofErr w:type="gramStart"/>
+                            <w:r>
+                              <w:rPr>
+                                <w:lang w:val="es-AR"/>
+                              </w:rPr>
+                              <w:t>dni</w:t>
+                            </w:r>
+                            <w:proofErr w:type="spellEnd"/>
+                            <w:r>
+                              <w:rPr>
+                                <w:lang w:val="es-AR"/>
+                              </w:rPr>
+                              <w:t>(</w:t>
+                            </w:r>
+                            <w:proofErr w:type="spellStart"/>
+                            <w:proofErr w:type="gramEnd"/>
+                            <w:r>
+                              <w:rPr>
+                                <w:lang w:val="es-AR"/>
+                              </w:rPr>
+                              <w:t>dni</w:t>
+                            </w:r>
+                            <w:proofErr w:type="spellEnd"/>
+                            <w:r>
+                              <w:rPr>
+                                <w:lang w:val="es-AR"/>
+                              </w:rPr>
+                              <w:t>, lista)</w:t>
+                            </w:r>
+                          </w:p>
+                          <w:p>
+                            <w:pPr>
+                              <w:ind w:firstLine="0"/>
+                              <w:rPr>
+                                <w:lang w:val="es-AR"/>
+                              </w:rPr>
+                            </w:pPr>
+                            <w:r>
+                              <w:rPr>
+                                <w:lang w:val="es-AR"/>
+                              </w:rPr>
+                              <w:t>PARA cada elemento EN lista HACER</w:t>
+                            </w:r>
+                          </w:p>
+                          <w:p>
+                            <w:pPr>
+                              <w:ind w:firstLine="0"/>
+                              <w:rPr>
+                                <w:lang w:val="es-AR"/>
+                              </w:rPr>
+                            </w:pPr>
+                            <w:r>
+                              <w:rPr>
+                                <w:lang w:val="es-AR"/>
+                              </w:rPr>
+                              <w:tab/>
+                              <w:t xml:space="preserve">SI elemento = </w:t>
+                            </w:r>
+                            <w:proofErr w:type="spellStart"/>
+                            <w:r>
+                              <w:rPr>
+                                <w:lang w:val="es-AR"/>
+                              </w:rPr>
+                              <w:t>dni</w:t>
+                            </w:r>
+                            <w:proofErr w:type="spellEnd"/>
+                            <w:r>
+                              <w:rPr>
+                                <w:lang w:val="es-AR"/>
+                              </w:rPr>
+                              <w:t xml:space="preserve"> ENTONCES</w:t>
+                            </w:r>
+                          </w:p>
+                          <w:p>
+                            <w:pPr>
+                              <w:ind w:firstLine="0"/>
+                              <w:rPr>
+                                <w:lang w:val="es-AR"/>
+                              </w:rPr>
+                            </w:pPr>
+                            <w:r>
+                              <w:rPr>
+                                <w:lang w:val="es-AR"/>
+                              </w:rPr>
+                              <w:tab/>
+                            </w:r>
+                            <w:r>
+                              <w:rPr>
+                                <w:lang w:val="es-AR"/>
+                              </w:rPr>
+                              <w:tab/>
+                              <w:t>RETORNAR TRUE</w:t>
+                            </w:r>
+                          </w:p>
+                          <w:p>
+                            <w:pPr>
+                              <w:rPr>
+                                <w:lang w:val="es-AR"/>
+                              </w:rPr>
+                            </w:pPr>
+                            <w:r>
+                              <w:rPr>
+                                <w:lang w:val="es-AR"/>
+                              </w:rPr>
+                              <w:t xml:space="preserve">SINO </w:t>
+                            </w:r>
+                          </w:p>
+                          <w:p>
+                            <w:pPr>
+                              <w:ind w:left="720"/>
+                              <w:rPr>
+                                <w:lang w:val="es-AR"/>
+                              </w:rPr>
+                            </w:pPr>
+                            <w:r>
+                              <w:rPr>
+                                <w:lang w:val="es-AR"/>
+                              </w:rPr>
+                              <w:t>RETORNAR FALSE</w:t>
+                            </w:r>
+                          </w:p>
+                        </w:txbxContent>
+                      </wps:txbx>
+                      <wps:bodyPr rot="0" vert="horz" wrap="square" lIns="91440" tIns="45720" rIns="91440" bIns="45720" anchor="t" anchorCtr="0">
+                        <a:spAutoFit/>
+                      </wps:bodyPr>
+                    </wps:wsp>
+                  </a:graphicData>
+                </a:graphic>
+                <wp14:sizeRelH relativeFrom="margin">
+                  <wp14:pctWidth>0</wp14:pctWidth>
+                </wp14:sizeRelH>
+              </wp:anchor>
+            </w:drawing>
+          </mc:Choice>
+          <mc:Fallback>
+            <w:pict>
+              <v:shape w14:anchorId="78A2648C" id="Cuadro de texto 6" o:spid="_x0000_s1031" type="#_x0000_t202" style="position:absolute;left:0;text-align:left;margin-left:104.55pt;margin-top:142.25pt;width:296pt;height:110.6pt;z-index:251667456;visibility:visible;mso-wrap-style:square;mso-width-percent:0;mso-wrap-distance-left:9pt;mso-wrap-distance-top:0;mso-wrap-distance-right:9pt;mso-wrap-distance-bottom:0;mso-position-horizontal:absolute;mso-position-horizontal-relative:text;mso-position-vertical:absolute;mso-position-vertical-relative:text;mso-width-percent:0;mso-width-relative:margin;v-text-anchor:top" o:gfxdata="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">
+                <v:textbox style="mso-fit-shape-to-text:t">
+                  <w:txbxContent>
+                    <w:p>
+                      <w:pPr>
+                        <w:ind w:firstLine="0"/>
+                        <w:rPr>
+                          <w:lang w:val="es-AR"/>
+                        </w:rPr>
+                      </w:pPr>
+                      <w:r>
+                        <w:rPr>
+                          <w:lang w:val="es-AR"/>
+                        </w:rPr>
+                        <w:t xml:space="preserve">FUNCION: </w:t>
+                      </w:r>
+                      <w:proofErr w:type="spellStart"/>
+                      <w:r>
+                        <w:rPr>
+                          <w:lang w:val="es-AR"/>
+                        </w:rPr>
+                        <w:t>existe_</w:t>
+                      </w:r>
+                      <w:proofErr w:type="gramStart"/>
+                      <w:r>
+                        <w:rPr>
+                          <w:lang w:val="es-AR"/>
+                        </w:rPr>
+                        <w:t>dni</w:t>
+                      </w:r>
+                      <w:proofErr w:type="spellEnd"/>
+                      <w:r>
+                        <w:rPr>
+                          <w:lang w:val="es-AR"/>
+                        </w:rPr>
+                        <w:t>(</w:t>
+                      </w:r>
+                      <w:proofErr w:type="spellStart"/>
+                      <w:proofErr w:type="gramEnd"/>
+                      <w:r>
+                        <w:rPr>
+                          <w:lang w:val="es-AR"/>
+                        </w:rPr>
+                        <w:t>dni</w:t>
+                      </w:r>
+                      <w:proofErr w:type="spellEnd"/>
+                      <w:r>
+                        <w:rPr>
+                          <w:lang w:val="es-AR"/>
+                        </w:rPr>
+                        <w:t>, lista)</w:t>
+                      </w:r>
+                    </w:p>
+                    <w:p>
+                      <w:pPr>
+                        <w:ind w:firstLine="0"/>
+                        <w:rPr>
+                          <w:lang w:val="es-AR"/>
+                        </w:rPr>
+                      </w:pPr>
+                      <w:r>
+                        <w:rPr>
+                          <w:lang w:val="es-AR"/>
+                        </w:rPr>
+                        <w:t>PARA cada elemento EN lista HACER</w:t>
+                      </w:r>
+                    </w:p>
+                    <w:p>
+                      <w:pPr>
+                        <w:ind w:firstLine="0"/>
+                        <w:rPr>
+                          <w:lang w:val="es-AR"/>
+                        </w:rPr>
+                      </w:pPr>
+                      <w:r>
+                        <w:rPr>
+                          <w:lang w:val="es-AR"/>
+                        </w:rPr>
+                        <w:tab/>
+                        <w:t xml:space="preserve">SI elemento = </w:t>
+                      </w:r>
+                      <w:proofErr w:type="spellStart"/>
+                      <w:r>
+                        <w:rPr>
+                          <w:lang w:val="es-AR"/>
+                        </w:rPr>
+                        <w:t>dni</w:t>
+                      </w:r>
+                      <w:proofErr w:type="spellEnd"/>
+                      <w:r>
+                        <w:rPr>
+                          <w:lang w:val="es-AR"/>
+                        </w:rPr>
+                        <w:t xml:space="preserve"> ENTONCES</w:t>
+                      </w:r>
+                    </w:p>
+                    <w:p>
+                      <w:pPr>
+                        <w:ind w:firstLine="0"/>
+                        <w:rPr>
+                          <w:lang w:val="es-AR"/>
+                        </w:rPr>
+                      </w:pPr>
+                      <w:r>
+                        <w:rPr>
+                          <w:lang w:val="es-AR"/>
+                        </w:rPr>
+                        <w:tab/>
+                      </w:r>
+                      <w:r>
+                        <w:rPr>
+                          <w:lang w:val="es-AR"/>
+                        </w:rPr>
+                        <w:tab/>
+                        <w:t>RETORNAR TRUE</w:t>
+                      </w:r>
+                    </w:p>
+                    <w:p>
+                      <w:pPr>
+                        <w:rPr>
+                          <w:lang w:val="es-AR"/>
+                        </w:rPr>
+                      </w:pPr>
+                      <w:r>
+                        <w:rPr>
+                          <w:lang w:val="es-AR"/>
+                        </w:rPr>
+                        <w:t xml:space="preserve">SINO </w:t>
+                      </w:r>
+                    </w:p>
+                    <w:p>
+                      <w:pPr>
+                        <w:ind w:left="720"/>
+                        <w:rPr>
+                          <w:lang w:val="es-AR"/>
+                        </w:rPr>
+                      </w:pPr>
+                      <w:r>
+                        <w:rPr>
+                          <w:lang w:val="es-AR"/>
+                        </w:rPr>
+                        <w:t>RETORNAR FALSE</w:t>
+                      </w:r>
+                    </w:p>
+                  </w:txbxContent>
+                </v:textbox>
+                <w10:wrap type="topAndBottom"/>
+              </v:shape>
+            </w:pict>
+          </mc:Fallback>
+        </mc:AlternateContent>
+      </w:r>
+      <w:r>
+        <w:rPr>
+          <w:lang w:val="es-AR"/>
+        </w:rPr>
+        <w:t>Green:</w:t>
+      </w:r>
+    </w:p>
+    <w:p>
+      <w:pPr>
+        <w:ind w:left="1080" w:firstLine="0"/>
+        <w:rPr>
+          <w:lang w:val="es-AR"/>
+        </w:rPr>
+      </w:pPr>
+      <w:r>
+        <w:rPr>
+          <w:lang w:val="es-AR"/>
+        </w:rPr>
+        <w:t>Ahora procedemos a realizar la prueba para el caso en el que el DNI no se encuentre en la lista:</w:t>
+      </w:r>
+    </w:p>
+    <w:p>
+      <w:pPr>
+        <w:ind w:left="1080" w:firstLine="0"/>
+        <w:rPr>
+          <w:lang w:val="es-AR"/>
+        </w:rPr>
+      </w:pPr>
+    </w:p>
+    <w:p>
+      <w:pPr>
+        <w:ind w:left="1080" w:firstLine="0"/>
+        <w:rPr>
+          <w:lang w:val="es-AR"/>
+        </w:rPr>
+      </w:pPr>
+    </w:p>
+    <w:p>
+      <w:pPr>
+        <w:pStyle w:val="Prrafodelista"/>
+        <w:numPr>
+          <w:ilvl w:val="0"/>
+          <w:numId w:val="34"/>
+        </w:numPr>
+        <w:rPr>
+          <w:lang w:val="es-AR"/>
+        </w:rPr>
+      </w:pPr>
+      <w:r>
+        <w:rPr>
+          <w:noProof/>
+          <w:lang w:eastAsia="es-ES"/>
+        </w:rPr>
+        <w:lastRenderedPageBreak/>
+        <mc:AlternateContent>
+          <mc:Choice Requires="wps">
+            <w:drawing>
+              <wp:anchor distT="0" distB="0" distL="114300" distR="114300" simplePos="0" relativeHeight="251669504" behindDoc="1" locked="0" layoutInCell="1" allowOverlap="1" wp14:anchorId="6B54E2D7" wp14:editId="328F3F47">
+                <wp:simplePos x="0" y="0"/>
+                <wp:positionH relativeFrom="column">
+                  <wp:posOffset>1478942</wp:posOffset>
+                </wp:positionH>
+                <wp:positionV relativeFrom="paragraph">
+                  <wp:posOffset>282492</wp:posOffset>
+                </wp:positionV>
+                <wp:extent cx="3784600" cy="1398905"/>
+                <wp:effectExtent l="0" t="0" r="25400" b="10795"/>
+                <wp:wrapTopAndBottom/>
+                <wp:docPr id="8" name="Cuadro de texto 2"/>
+                <wp:cNvGraphicFramePr>
+                  <a:graphicFrameLocks xmlns:a="http://schemas.openxmlformats.org/drawingml/2006/main"/>
+                </wp:cNvGraphicFramePr>
+                <a:graphic xmlns:a="http://schemas.openxmlformats.org/drawingml/2006/main">
+                  <a:graphicData uri="http://schemas.microsoft.com/office/word/2010/wordprocessingShape">
+                    <wps:wsp>
+                      <wps:cNvSpPr txBox="1">
+                        <a:spLocks noChangeArrowheads="1"/>
+                      </wps:cNvSpPr>
+                      <wps:spPr bwMode="auto">
+                        <a:xfrm>
+                          <a:off x="0" y="0"/>
+                          <a:ext cx="3784600" cy="1398905"/>
+                        </a:xfrm>
+                        <a:prstGeom prst="rect">
+                          <a:avLst/>
+                        </a:prstGeom>
+                        <a:solidFill>
+                          <a:srgbClr val="FFFFFF"/>
+                        </a:solidFill>
+                        <a:ln w="9525">
+                          <a:solidFill>
+                            <a:srgbClr val="000000"/>
+                          </a:solidFill>
+                          <a:miter lim="800000"/>
+                          <a:headEnd/>
+                          <a:tailEnd/>
+                        </a:ln>
+                      </wps:spPr>
+                      <wps:txbx>
+                        <w:txbxContent>
+                          <w:p>
+                            <w:pPr>
+                              <w:ind w:firstLine="0"/>
+                              <w:rPr>
+                                <w:lang w:val="es-AR"/>
+                              </w:rPr>
+                            </w:pPr>
+                            <w:r>
+                              <w:rPr>
+                                <w:lang w:val="es-AR"/>
+                              </w:rPr>
+                              <w:t xml:space="preserve">PRUEBA: </w:t>
+                            </w:r>
+                            <w:proofErr w:type="spellStart"/>
+                            <w:r>
+                              <w:rPr>
+                                <w:lang w:val="es-AR"/>
+                              </w:rPr>
+                              <w:t>verificar_no_existe_dni</w:t>
+                            </w:r>
+                            <w:proofErr w:type="spellEnd"/>
+                          </w:p>
+                          <w:p>
+                            <w:pPr>
+                              <w:ind w:firstLine="0"/>
+                              <w:rPr>
+                                <w:lang w:val="es-AR"/>
+                              </w:rPr>
+                            </w:pPr>
+                            <w:r>
+                              <w:rPr>
+                                <w:lang w:val="es-AR"/>
+                              </w:rPr>
+                              <w:t xml:space="preserve">lista </w:t>
+                            </w:r>
+                            <w:r>
+                              <w:rPr>
+                                <w:lang w:val="en-US"/>
+                              </w:rPr>
+                              <w:sym w:font="Wingdings" w:char="F0DF"/>
+                            </w:r>
+                            <w:r>
+                              <w:t xml:space="preserve"> </w:t>
+                            </w:r>
+                            <w:r>
+                              <w:rPr>
+                                <w:lang w:val="es-AR"/>
+                              </w:rPr>
+                              <w:t>[‘12345678’,’87654321’,’11111111’,’88888888’]</w:t>
+                            </w:r>
+                          </w:p>
+                          <w:p>
+                            <w:pPr>
+                              <w:ind w:firstLine="0"/>
+                              <w:rPr>
+                                <w:lang w:val="es-AR"/>
+                              </w:rPr>
+                            </w:pPr>
+                            <w:r>
+                              <w:rPr>
+                                <w:lang w:val="es-AR"/>
+                              </w:rPr>
+                              <w:t xml:space="preserve">resultado </w:t>
+                            </w:r>
+                            <w:r>
+                              <w:rPr>
+                                <w:lang w:val="en-US"/>
+                              </w:rPr>
+                              <w:sym w:font="Wingdings" w:char="F0DF"/>
+                            </w:r>
+                            <w:r>
+                              <w:t xml:space="preserve"> </w:t>
+                            </w:r>
+                            <w:proofErr w:type="spellStart"/>
+                            <w:r>
+                              <w:t>existe_dni</w:t>
+                            </w:r>
+                            <w:proofErr w:type="spellEnd"/>
+                            <w:r>
+                              <w:rPr>
+                                <w:lang w:val="es-AR"/>
+                              </w:rPr>
+                              <w:t>(‘22222222’, lista)</w:t>
+                            </w:r>
+                          </w:p>
+                          <w:p>
+                            <w:pPr>
+                              <w:ind w:firstLine="0"/>
+                            </w:pPr>
+                            <w:r>
+                              <w:rPr>
+                                <w:lang w:val="es-AR"/>
+                              </w:rPr>
+                              <w:t>VERIFICAR resultado = FALSE</w:t>
+                            </w:r>
+                          </w:p>
+                        </w:txbxContent>
+                      </wps:txbx>
+                      <wps:bodyPr rot="0" vert="horz" wrap="square" lIns="91440" tIns="45720" rIns="91440" bIns="45720" anchor="ctr" anchorCtr="0">
+                        <a:noAutofit/>
+                      </wps:bodyPr>
+                    </wps:wsp>
+                  </a:graphicData>
+                </a:graphic>
+                <wp14:sizeRelH relativeFrom="margin">
+                  <wp14:pctWidth>0</wp14:pctWidth>
+                </wp14:sizeRelH>
+                <wp14:sizeRelV relativeFrom="margin">
+                  <wp14:pctHeight>0</wp14:pctHeight>
+                </wp14:sizeRelV>
+              </wp:anchor>
+            </w:drawing>
+          </mc:Choice>
+          <mc:Fallback>
+            <w:pict>
+              <v:shape w14:anchorId="6B54E2D7" id="_x0000_s1032" type="#_x0000_t202" style="position:absolute;left:0;text-align:left;margin-left:116.45pt;margin-top:22.25pt;width:298pt;height:110.15pt;z-index:-251646976;visibility:visible;mso-wrap-style:square;mso-width-percent:0;mso-height-percent:0;mso-wrap-distance-left:9pt;mso-wrap-distance-top:0;mso-wrap-distance-right:9pt;mso-wrap-distance-bottom:0;mso-position-horizontal:absolute;mso-position-horizontal-relative:text;mso-position-vertical:absolute;mso-position-vertical-relative:text;mso-width-percent:0;mso-height-percent:0;mso-width-relative:margin;mso-height-relative:margin;v-text-anchor:middle" o:gfxdata="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">
+                <v:textbox>
+                  <w:txbxContent>
+                    <w:p>
+                      <w:pPr>
+                        <w:ind w:firstLine="0"/>
+                        <w:rPr>
+                          <w:lang w:val="es-AR"/>
+                        </w:rPr>
+                      </w:pPr>
+                      <w:r>
+                        <w:rPr>
+                          <w:lang w:val="es-AR"/>
+                        </w:rPr>
+                        <w:t xml:space="preserve">PRUEBA: </w:t>
+                      </w:r>
+                      <w:proofErr w:type="spellStart"/>
+                      <w:r>
+                        <w:rPr>
+                          <w:lang w:val="es-AR"/>
+                        </w:rPr>
+                        <w:t>verificar_no_existe_dni</w:t>
+                      </w:r>
+                      <w:proofErr w:type="spellEnd"/>
+                    </w:p>
+                    <w:p>
+                      <w:pPr>
+                        <w:ind w:firstLine="0"/>
+                        <w:rPr>
+                          <w:lang w:val="es-AR"/>
+                        </w:rPr>
+                      </w:pPr>
+                      <w:r>
+                        <w:rPr>
+                          <w:lang w:val="es-AR"/>
+                        </w:rPr>
+                        <w:t xml:space="preserve">lista </w:t>
+                      </w:r>
+                      <w:r>
+                        <w:rPr>
+                          <w:lang w:val="en-US"/>
+                        </w:rPr>
+                        <w:sym w:font="Wingdings" w:char="F0DF"/>
+                      </w:r>
+                      <w:r>
+                        <w:t xml:space="preserve"> </w:t>
+                      </w:r>
+                      <w:r>
+                        <w:rPr>
+                          <w:lang w:val="es-AR"/>
+                        </w:rPr>
+                        <w:t>[‘12345678’,’87654321’,’11111111’,’88888888’]</w:t>
+                      </w:r>
+                    </w:p>
+                    <w:p>
+                      <w:pPr>
+                        <w:ind w:firstLine="0"/>
+                        <w:rPr>
+                          <w:lang w:val="es-AR"/>
+                        </w:rPr>
+                      </w:pPr>
+                      <w:r>
+                        <w:rPr>
+                          <w:lang w:val="es-AR"/>
+                        </w:rPr>
+                        <w:t xml:space="preserve">resultado </w:t>
+                      </w:r>
+                      <w:r>
+                        <w:rPr>
+                          <w:lang w:val="en-US"/>
+                        </w:rPr>
+                        <w:sym w:font="Wingdings" w:char="F0DF"/>
+                      </w:r>
+                      <w:r>
+                        <w:t xml:space="preserve"> </w:t>
+                      </w:r>
+                      <w:proofErr w:type="spellStart"/>
+                      <w:r>
+                        <w:t>existe_dni</w:t>
+                      </w:r>
+                      <w:proofErr w:type="spellEnd"/>
+                      <w:r>
+                        <w:rPr>
+                          <w:lang w:val="es-AR"/>
+                        </w:rPr>
+                        <w:t>(‘22222222’, lista)</w:t>
+                      </w:r>
+                    </w:p>
+                    <w:p>
+                      <w:pPr>
+                        <w:ind w:firstLine="0"/>
+                      </w:pPr>
+                      <w:r>
+                        <w:rPr>
+                          <w:lang w:val="es-AR"/>
+                        </w:rPr>
+                        <w:t>VERIFICAR resultado = FALSE</w:t>
+                      </w:r>
+                    </w:p>
+                  </w:txbxContent>
+                </v:textbox>
+                <w10:wrap type="topAndBottom"/>
+              </v:shape>
+            </w:pict>
+          </mc:Fallback>
+        </mc:AlternateContent>
+      </w:r>
+      <w:r>
+        <w:rPr>
+          <w:lang w:val="es-AR"/>
+        </w:rPr>
+        <w:t xml:space="preserve">RED: </w:t>
+      </w:r>
+    </w:p>
+    <w:p>
+      <w:pPr>
+        <w:pStyle w:val="Prrafodelista"/>
+        <w:ind w:left="1800"/>
+        <w:rPr>
+          <w:lang w:val="es-AR"/>
+        </w:rPr>
+      </w:pPr>
+      <w:r>
+        <w:rPr>
+          <w:lang w:val="es-AR"/>
+        </w:rPr>
+        <w:t xml:space="preserve">La función </w:t>
+      </w:r>
+      <w:proofErr w:type="spellStart"/>
+      <w:r>
+        <w:rPr>
+          <w:lang w:val="es-AR"/>
+        </w:rPr>
+        <w:t>existe_dni</w:t>
+      </w:r>
+      <w:proofErr w:type="spellEnd"/>
+      <w:r>
+        <w:rPr>
+          <w:lang w:val="es-AR"/>
+        </w:rPr>
+        <w:t xml:space="preserve"> ya abarca está prueba y la pasa exitosamente, por lo que no es necesario realizar más código.</w:t>
+      </w:r>
+    </w:p>
+    <w:p>
+      <w:pPr>
+        <w:ind w:left="1134" w:firstLine="0"/>
+        <w:rPr>
+          <w:lang w:val="es-AR"/>
+        </w:rPr>
+      </w:pPr>
+      <w:r>
+        <w:rPr>
+          <w:lang w:val="es-AR"/>
+        </w:rPr>
+        <w:t>Por último, vamos a considerar el caso en el que el número de documento que</w:t>
+      </w:r>
+      <w:r>
+        <w:rPr>
+          <w:lang w:val="es-AR"/>
+        </w:rPr>
+        <w:t xml:space="preserve"> se desea buscar, no tenga el formato correspondiente, es decir, que no sea de ocho caracteres: </w:t>
+      </w:r>
+    </w:p>
+    <w:p>
+      <w:pPr>
+        <w:pStyle w:val="Prrafodelista"/>
+        <w:numPr>
+          <w:ilvl w:val="0"/>
+          <w:numId w:val="34"/>
+        </w:numPr>
+        <w:rPr>
+          <w:lang w:val="es-AR"/>
+        </w:rPr>
+      </w:pPr>
+      <w:r>
+        <w:rPr>
+          <w:noProof/>
+          <w:lang w:eastAsia="es-ES"/>
+        </w:rPr>
+        <mc:AlternateContent>
+          <mc:Choice Requires="wps">
+            <w:drawing>
+              <wp:anchor distT="0" distB="0" distL="114300" distR="114300" simplePos="0" relativeHeight="251671552" behindDoc="1" locked="0" layoutInCell="1" allowOverlap="1" wp14:anchorId="75C23351" wp14:editId="36379427">
+                <wp:simplePos x="0" y="0"/>
+                <wp:positionH relativeFrom="column">
+                  <wp:posOffset>1407381</wp:posOffset>
+                </wp:positionH>
+                <wp:positionV relativeFrom="paragraph">
+                  <wp:posOffset>352756</wp:posOffset>
+                </wp:positionV>
+                <wp:extent cx="3784600" cy="1398905"/>
+                <wp:effectExtent l="0" t="0" r="25400" b="10795"/>
+                <wp:wrapTopAndBottom/>
+                <wp:docPr id="9" name="Cuadro de texto 2"/>
+                <wp:cNvGraphicFramePr>
+                  <a:graphicFrameLocks xmlns:a="http://schemas.openxmlformats.org/drawingml/2006/main"/>
+                </wp:cNvGraphicFramePr>
+                <a:graphic xmlns:a="http://schemas.openxmlformats.org/drawingml/2006/main">
+                  <a:graphicData uri="http://schemas.microsoft.com/office/word/2010/wordprocessingShape">
+                    <wps:wsp>
+                      <wps:cNvSpPr txBox="1">
+                        <a:spLocks noChangeArrowheads="1"/>
+                      </wps:cNvSpPr>
+                      <wps:spPr bwMode="auto">
+                        <a:xfrm>
+                          <a:off x="0" y="0"/>
+                          <a:ext cx="3784600" cy="1398905"/>
+                        </a:xfrm>
+                        <a:prstGeom prst="rect">
+                          <a:avLst/>
+                        </a:prstGeom>
+                        <a:solidFill>
+                          <a:srgbClr val="FFFFFF"/>
+                        </a:solidFill>
+                        <a:ln w="9525">
+                          <a:solidFill>
+                            <a:srgbClr val="000000"/>
+                          </a:solidFill>
+                          <a:miter lim="800000"/>
+                          <a:headEnd/>
+                          <a:tailEnd/>
+                        </a:ln>
+                      </wps:spPr>
+                      <wps:txbx>
+                        <w:txbxContent>
+                          <w:p>
+                            <w:pPr>
+                              <w:ind w:firstLine="0"/>
+                              <w:rPr>
+                                <w:lang w:val="es-AR"/>
+                              </w:rPr>
+                            </w:pPr>
+                            <w:r>
+                              <w:rPr>
+                                <w:lang w:val="es-AR"/>
+                              </w:rPr>
+                              <w:t xml:space="preserve">PRUEBA: </w:t>
+                            </w:r>
+                            <w:proofErr w:type="spellStart"/>
+                            <w:r>
+                              <w:rPr>
+                                <w:lang w:val="es-AR"/>
+                              </w:rPr>
+                              <w:t>verificar_formato_valido</w:t>
+                            </w:r>
+                            <w:proofErr w:type="spellEnd"/>
+                          </w:p>
+                          <w:p>
+                            <w:pPr>
+                              <w:ind w:firstLine="0"/>
+                              <w:rPr>
+                                <w:lang w:val="es-AR"/>
+                              </w:rPr>
+                            </w:pPr>
+                            <w:r>
+                              <w:rPr>
+                                <w:lang w:val="es-AR"/>
+                              </w:rPr>
+                              <w:t xml:space="preserve">lista </w:t>
+                            </w:r>
+                            <w:r>
+                              <w:rPr>
+                                <w:lang w:val="en-US"/>
+                              </w:rPr>
+                              <w:sym w:font="Wingdings" w:char="F0DF"/>
+                            </w:r>
+                            <w:r>
+                              <w:t xml:space="preserve"> </w:t>
+                            </w:r>
+                            <w:r>
+                              <w:rPr>
+                                <w:lang w:val="es-AR"/>
+                              </w:rPr>
+                              <w:t>[‘12345678’,’87654321’,’11111111’,’88888888’]</w:t>
+                            </w:r>
+                          </w:p>
+                          <w:p>
+                            <w:pPr>
+                              <w:ind w:firstLine="0"/>
+                              <w:rPr>
+                                <w:lang w:val="es-AR"/>
+                              </w:rPr>
+                            </w:pPr>
+                            <w:r>
+                              <w:rPr>
+                                <w:lang w:val="es-AR"/>
+                              </w:rPr>
+                              <w:t xml:space="preserve">resultado </w:t>
+                            </w:r>
+                            <w:r>
+                              <w:rPr>
+                                <w:lang w:val="en-US"/>
+                              </w:rPr>
+                              <w:sym w:font="Wingdings" w:char="F0DF"/>
+                            </w:r>
+                            <w:r>
+                              <w:t xml:space="preserve"> </w:t>
+                            </w:r>
+                            <w:proofErr w:type="spellStart"/>
+                            <w:r>
+                              <w:t>existe_dni</w:t>
+                            </w:r>
+                            <w:proofErr w:type="spellEnd"/>
+                            <w:r>
+                              <w:rPr>
+                                <w:lang w:val="es-AR"/>
+                              </w:rPr>
+                              <w:t>(‘1234’, lista)</w:t>
+                            </w:r>
+                          </w:p>
+                          <w:p>
+                            <w:pPr>
+                              <w:ind w:firstLine="0"/>
+                            </w:pPr>
+                            <w:r>
+                              <w:rPr>
+                                <w:lang w:val="es-AR"/>
+                              </w:rPr>
+                              <w:t>VERIFICAR ERROR</w:t>
+                            </w:r>
+                          </w:p>
+                        </w:txbxContent>
+                      </wps:txbx>
+                      <wps:bodyPr rot="0" vert="horz" wrap="square" lIns="91440" tIns="45720" rIns="91440" bIns="45720" anchor="ctr" anchorCtr="0">
+                        <a:noAutofit/>
+                      </wps:bodyPr>
+                    </wps:wsp>
+                  </a:graphicData>
+                </a:graphic>
+                <wp14:sizeRelH relativeFrom="margin">
+                  <wp14:pctWidth>0</wp14:pctWidth>
+                </wp14:sizeRelH>
+                <wp14:sizeRelV relativeFrom="margin">
+                  <wp14:pctHeight>0</wp14:pctHeight>
+                </wp14:sizeRelV>
+              </wp:anchor>
+            </w:drawing>
+          </mc:Choice>
+          <mc:Fallback>
+            <w:pict>
+              <v:shape w14:anchorId="75C23351" id="_x0000_s1033" type="#_x0000_t202" style="position:absolute;left:0;text-align:left;margin-left:110.8pt;margin-top:27.8pt;width:298pt;height:110.15pt;z-index:-251644928;visibility:visible;mso-wrap-style:square;mso-width-percent:0;mso-height-percent:0;mso-wrap-distance-left:9pt;mso-wrap-distance-top:0;mso-wrap-distance-right:9pt;mso-wrap-distance-bottom:0;mso-position-horizontal:absolute;mso-position-horizontal-relative:text;mso-position-vertical:absolute;mso-position-vertical-relative:text;mso-width-percent:0;mso-height-percent:0;mso-width-relative:margin;mso-height-relative:margin;v-text-anchor:middle" o:gfxdata="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">
+                <v:textbox>
+                  <w:txbxContent>
+                    <w:p>
+                      <w:pPr>
+                        <w:ind w:firstLine="0"/>
+                        <w:rPr>
+                          <w:lang w:val="es-AR"/>
+                        </w:rPr>
+                      </w:pPr>
+                      <w:r>
+                        <w:rPr>
+                          <w:lang w:val="es-AR"/>
+                        </w:rPr>
+                        <w:t xml:space="preserve">PRUEBA: </w:t>
+                      </w:r>
+                      <w:proofErr w:type="spellStart"/>
+                      <w:r>
+                        <w:rPr>
+                          <w:lang w:val="es-AR"/>
+                        </w:rPr>
+                        <w:t>verificar_formato_valido</w:t>
+                      </w:r>
+                      <w:proofErr w:type="spellEnd"/>
+                    </w:p>
+                    <w:p>
+                      <w:pPr>
+                        <w:ind w:firstLine="0"/>
+                        <w:rPr>
+                          <w:lang w:val="es-AR"/>
+                        </w:rPr>
+                      </w:pPr>
+                      <w:r>
+                        <w:rPr>
+                          <w:lang w:val="es-AR"/>
+                        </w:rPr>
+                        <w:t xml:space="preserve">lista </w:t>
+                      </w:r>
+                      <w:r>
+                        <w:rPr>
+                          <w:lang w:val="en-US"/>
+                        </w:rPr>
+                        <w:sym w:font="Wingdings" w:char="F0DF"/>
+                      </w:r>
+                      <w:r>
+                        <w:t xml:space="preserve"> </w:t>
+                      </w:r>
+                      <w:r>
+                        <w:rPr>
+                          <w:lang w:val="es-AR"/>
+                        </w:rPr>
+                        <w:t>[‘12345678’,’87654321’,’11111111’,’88888888’]</w:t>
+                      </w:r>
+                    </w:p>
+                    <w:p>
+                      <w:pPr>
+                        <w:ind w:firstLine="0"/>
+                        <w:rPr>
+                          <w:lang w:val="es-AR"/>
+                        </w:rPr>
+                      </w:pPr>
+                      <w:r>
+                        <w:rPr>
+                          <w:lang w:val="es-AR"/>
+                        </w:rPr>
+                        <w:t xml:space="preserve">resultado </w:t>
+                      </w:r>
+                      <w:r>
+                        <w:rPr>
+                          <w:lang w:val="en-US"/>
+                        </w:rPr>
+                        <w:sym w:font="Wingdings" w:char="F0DF"/>
+                      </w:r>
+                      <w:r>
+                        <w:t xml:space="preserve"> </w:t>
+                      </w:r>
+                      <w:proofErr w:type="spellStart"/>
+                      <w:r>
+                        <w:t>existe_dni</w:t>
+                      </w:r>
+                      <w:proofErr w:type="spellEnd"/>
+                      <w:r>
+                        <w:rPr>
+                          <w:lang w:val="es-AR"/>
+                        </w:rPr>
+                        <w:t>(‘1234’, lista)</w:t>
+                      </w:r>
+                    </w:p>
+                    <w:p>
+                      <w:pPr>
+                        <w:ind w:firstLine="0"/>
+                      </w:pPr>
+                      <w:r>
+                        <w:rPr>
+                          <w:lang w:val="es-AR"/>
+                        </w:rPr>
+                        <w:t>VERIFICAR ERROR</w:t>
+                      </w:r>
+                    </w:p>
+                  </w:txbxContent>
+                </v:textbox>
+                <w10:wrap type="topAndBottom"/>
+              </v:shape>
+            </w:pict>
+          </mc:Fallback>
+        </mc:AlternateContent>
+      </w:r>
+      <w:r>
+        <w:rPr>
+          <w:lang w:val="es-AR"/>
+        </w:rPr>
+        <w:t>RED:</w:t>
+      </w:r>
+    </w:p>
+    <w:p>
+      <w:pPr>
+        <w:pStyle w:val="Prrafodelista"/>
+        <w:numPr>
+          <w:ilvl w:val="0"/>
+          <w:numId w:val="34"/>
+        </w:numPr>
+        <w:rPr>
+          <w:lang w:val="es-AR"/>
+        </w:rPr>
+      </w:pPr>
+      <w:r>
+        <w:rPr>
+          <w:noProof/>
+          <w:lang w:eastAsia="es-ES"/>
+        </w:rPr>
+        <mc:AlternateContent>
+          <mc:Choice Requires="wps">
+            <w:drawing>
+              <wp:anchor distT="0" distB="0" distL="114300" distR="114300" simplePos="0" relativeHeight="251673600" behindDoc="0" locked="0" layoutInCell="1" allowOverlap="1" wp14:anchorId="772FCB84" wp14:editId="7F9F897A">
+                <wp:simplePos x="0" y="0"/>
+                <wp:positionH relativeFrom="column">
+                  <wp:posOffset>1407381</wp:posOffset>
+                </wp:positionH>
+                <wp:positionV relativeFrom="paragraph">
+                  <wp:posOffset>1642248</wp:posOffset>
+                </wp:positionV>
+                <wp:extent cx="3759200" cy="1404620"/>
+                <wp:effectExtent l="0" t="0" r="12700" b="17780"/>
+                <wp:wrapTopAndBottom/>
+                <wp:docPr id="10" name="Cuadro de texto 10"/>
+                <wp:cNvGraphicFramePr>
+                  <a:graphicFrameLocks xmlns:a="http://schemas.openxmlformats.org/drawingml/2006/main"/>
+                </wp:cNvGraphicFramePr>
+                <a:graphic xmlns:a="http://schemas.openxmlformats.org/drawingml/2006/main">
+                  <a:graphicData uri="http://schemas.microsoft.com/office/word/2010/wordprocessingShape">
+                    <wps:wsp>
+                      <wps:cNvSpPr txBox="1">
+                        <a:spLocks noChangeArrowheads="1"/>
+                      </wps:cNvSpPr>
+                      <wps:spPr bwMode="auto">
+                        <a:xfrm>
+                          <a:off x="0" y="0"/>
+                          <a:ext cx="3759200" cy="1404620"/>
+                        </a:xfrm>
+                        <a:prstGeom prst="rect">
+                          <a:avLst/>
+                        </a:prstGeom>
+                        <a:solidFill>
+                          <a:srgbClr val="FFFFFF"/>
+                        </a:solidFill>
+                        <a:ln w="9525">
+                          <a:solidFill>
+                            <a:srgbClr val="000000"/>
+                          </a:solidFill>
+                          <a:miter lim="800000"/>
+                          <a:headEnd/>
+                          <a:tailEnd/>
+                        </a:ln>
+                      </wps:spPr>
+                      <wps:txbx>
+                        <w:txbxContent>
+                          <w:p>
+                            <w:pPr>
+                              <w:ind w:firstLine="0"/>
+                              <w:rPr>
+                                <w:lang w:val="es-AR"/>
+                              </w:rPr>
+                            </w:pPr>
+                            <w:r>
+                              <w:rPr>
+                                <w:lang w:val="es-AR"/>
+                              </w:rPr>
+                              <w:t xml:space="preserve">FUNCION: </w:t>
+                            </w:r>
+                            <w:proofErr w:type="spellStart"/>
+                            <w:r>
+                              <w:rPr>
+                                <w:lang w:val="es-AR"/>
+                              </w:rPr>
+                              <w:t>existe_</w:t>
+                            </w:r>
+                            <w:proofErr w:type="gramStart"/>
+                            <w:r>
+                              <w:rPr>
+                                <w:lang w:val="es-AR"/>
+                              </w:rPr>
+                              <w:t>dni</w:t>
+                            </w:r>
+                            <w:proofErr w:type="spellEnd"/>
+                            <w:r>
+                              <w:rPr>
+                                <w:lang w:val="es-AR"/>
+                              </w:rPr>
+                              <w:t>(</w:t>
+                            </w:r>
+                            <w:proofErr w:type="spellStart"/>
+                            <w:proofErr w:type="gramEnd"/>
+                            <w:r>
+                              <w:rPr>
+                                <w:lang w:val="es-AR"/>
+                              </w:rPr>
+                              <w:t>dni</w:t>
+                            </w:r>
+                            <w:proofErr w:type="spellEnd"/>
+                            <w:r>
+                              <w:rPr>
+                                <w:lang w:val="es-AR"/>
+                              </w:rPr>
+                              <w:t>, lista)</w:t>
+                            </w:r>
+                          </w:p>
+                          <w:p>
+                            <w:pPr>
+                              <w:ind w:firstLine="0"/>
+                              <w:rPr>
+                                <w:lang w:val="es-AR"/>
+                              </w:rPr>
+                            </w:pPr>
+                            <w:r>
+                              <w:rPr>
+                                <w:lang w:val="es-AR"/>
+                              </w:rPr>
+                              <w:t>SI longitud(</w:t>
+                            </w:r>
+                            <w:proofErr w:type="spellStart"/>
+                            <w:r>
+                              <w:rPr>
+                                <w:lang w:val="es-AR"/>
+                              </w:rPr>
+                              <w:t>dni</w:t>
+                            </w:r>
+                            <w:proofErr w:type="spellEnd"/>
+                            <w:proofErr w:type="gramStart"/>
+                            <w:r>
+                              <w:rPr>
+                                <w:lang w:val="es-AR"/>
+                              </w:rPr>
+                              <w:t>) !</w:t>
+                            </w:r>
+                            <w:proofErr w:type="gramEnd"/>
+                            <w:r>
+                              <w:rPr>
+                                <w:lang w:val="es-AR"/>
+                              </w:rPr>
+                              <w:t>= 8 entonces</w:t>
+                            </w:r>
+                          </w:p>
+                          <w:p>
+                            <w:pPr>
+                              <w:ind w:firstLine="0"/>
+                              <w:rPr>
+                                <w:lang w:val="es-AR"/>
+                              </w:rPr>
+                            </w:pPr>
+                            <w:r>
+                              <w:rPr>
+                                <w:lang w:val="es-AR"/>
+                              </w:rPr>
+                              <w:tab/>
+                              <w:t>RETORNAR ERROR</w:t>
+                            </w:r>
+                          </w:p>
+                          <w:p>
+                            <w:pPr>
+                              <w:ind w:firstLine="0"/>
+                              <w:rPr>
+                                <w:lang w:val="es-AR"/>
+                              </w:rPr>
+                            </w:pPr>
+                            <w:r>
+                              <w:rPr>
+                                <w:lang w:val="es-AR"/>
+                              </w:rPr>
+                              <w:t>SINO</w:t>
+                            </w:r>
+                          </w:p>
+                          <w:p>
+                            <w:pPr>
+                              <w:rPr>
+                                <w:lang w:val="es-AR"/>
+                              </w:rPr>
+                            </w:pPr>
+                            <w:r>
+                              <w:rPr>
+                                <w:lang w:val="es-AR"/>
+                              </w:rPr>
+                              <w:t>PARA cada elemento EN lista HACER</w:t>
+                            </w:r>
+                          </w:p>
+                          <w:p>
+                            <w:pPr>
+                              <w:ind w:firstLine="0"/>
+                              <w:rPr>
+                                <w:lang w:val="es-AR"/>
+                              </w:rPr>
+                            </w:pPr>
+                            <w:r>
+                              <w:rPr>
+                                <w:lang w:val="es-AR"/>
+                              </w:rPr>
+                              <w:tab/>
+                            </w:r>
+                            <w:r>
+                              <w:rPr>
+                                <w:lang w:val="es-AR"/>
+                              </w:rPr>
+                              <w:tab/>
+                              <w:t xml:space="preserve">SI elemento = </w:t>
+                            </w:r>
+                            <w:proofErr w:type="spellStart"/>
+                            <w:r>
+                              <w:rPr>
+                                <w:lang w:val="es-AR"/>
+                              </w:rPr>
+                              <w:t>dni</w:t>
+                            </w:r>
+                            <w:proofErr w:type="spellEnd"/>
+                            <w:r>
+                              <w:rPr>
+                                <w:lang w:val="es-AR"/>
+                              </w:rPr>
+                              <w:t xml:space="preserve"> ENTONCES</w:t>
+                            </w:r>
+                          </w:p>
+                          <w:p>
+                            <w:pPr>
+                              <w:ind w:firstLine="0"/>
+                              <w:rPr>
+                                <w:lang w:val="es-AR"/>
+                              </w:rPr>
+                            </w:pPr>
+                            <w:r>
+                              <w:rPr>
+                                <w:lang w:val="es-AR"/>
+                              </w:rPr>
+                              <w:tab/>
+                            </w:r>
+                            <w:r>
+                              <w:rPr>
+                                <w:lang w:val="es-AR"/>
+                              </w:rPr>
+                              <w:tab/>
+                            </w:r>
+                            <w:r>
+                              <w:rPr>
+                                <w:lang w:val="es-AR"/>
+                              </w:rPr>
+                              <w:tab/>
+                              <w:t>RETORNAR TRUE</w:t>
+                            </w:r>
+                          </w:p>
+                          <w:p>
+                            <w:pPr>
+                              <w:ind w:left="720"/>
+                              <w:rPr>
+                                <w:lang w:val="es-AR"/>
+                              </w:rPr>
+                            </w:pPr>
+                            <w:r>
+                              <w:rPr>
+                                <w:lang w:val="es-AR"/>
+                              </w:rPr>
+                              <w:t xml:space="preserve">SINO </w:t>
+                            </w:r>
+                          </w:p>
+                          <w:p>
+                            <w:pPr>
+                              <w:ind w:left="1440"/>
+                              <w:rPr>
+                                <w:lang w:val="es-AR"/>
+                              </w:rPr>
+                            </w:pPr>
+                            <w:r>
+                              <w:rPr>
+                                <w:lang w:val="es-AR"/>
+                              </w:rPr>
+                              <w:t>RETORNAR FALSE</w:t>
+                            </w:r>
+                          </w:p>
+                        </w:txbxContent>
+                      </wps:txbx>
+                      <wps:bodyPr rot="0" vert="horz" wrap="square" lIns="91440" tIns="45720" rIns="91440" bIns="45720" anchor="t" anchorCtr="0">
+                        <a:spAutoFit/>
+                      </wps:bodyPr>
+                    </wps:wsp>
+                  </a:graphicData>
+                </a:graphic>
+                <wp14:sizeRelH relativeFrom="margin">
+                  <wp14:pctWidth>0</wp14:pctWidth>
+                </wp14:sizeRelH>
+              </wp:anchor>
+            </w:drawing>
+          </mc:Choice>
+          <mc:Fallback>
+            <w:pict>
+              <v:shape w14:anchorId="772FCB84" id="Cuadro de texto 10" o:spid="_x0000_s1034" type="#_x0000_t202" style="position:absolute;left:0;text-align:left;margin-left:110.8pt;margin-top:129.3pt;width:296pt;height:110.6pt;z-index:251673600;visibility:visible;mso-wrap-style:square;mso-width-percent:0;mso-wrap-distance-left:9pt;mso-wrap-distance-top:0;mso-wrap-distance-right:9pt;mso-wrap-distance-bottom:0;mso-position-horizontal:absolute;mso-position-horizontal-relative:text;mso-position-vertical:absolute;mso-position-vertical-relative:text;mso-width-percent:0;mso-width-relative:margin;v-text-anchor:top" o:gfxdata="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">
+                <v:textbox style="mso-fit-shape-to-text:t">
+                  <w:txbxContent>
+                    <w:p>
+                      <w:pPr>
+                        <w:ind w:firstLine="0"/>
+                        <w:rPr>
+                          <w:lang w:val="es-AR"/>
+                        </w:rPr>
+                      </w:pPr>
+                      <w:r>
+                        <w:rPr>
+                          <w:lang w:val="es-AR"/>
+                        </w:rPr>
+                        <w:t xml:space="preserve">FUNCION: </w:t>
+                      </w:r>
+                      <w:proofErr w:type="spellStart"/>
+                      <w:r>
+                        <w:rPr>
+                          <w:lang w:val="es-AR"/>
+                        </w:rPr>
+                        <w:t>existe_</w:t>
+                      </w:r>
+                      <w:proofErr w:type="gramStart"/>
+                      <w:r>
+                        <w:rPr>
+                          <w:lang w:val="es-AR"/>
+                        </w:rPr>
+                        <w:t>dni</w:t>
+                      </w:r>
+                      <w:proofErr w:type="spellEnd"/>
+                      <w:r>
+                        <w:rPr>
+                          <w:lang w:val="es-AR"/>
+                        </w:rPr>
+                        <w:t>(</w:t>
+                      </w:r>
+                      <w:proofErr w:type="spellStart"/>
+                      <w:proofErr w:type="gramEnd"/>
+                      <w:r>
+                        <w:rPr>
+                          <w:lang w:val="es-AR"/>
+                        </w:rPr>
+                        <w:t>dni</w:t>
+                      </w:r>
+                      <w:proofErr w:type="spellEnd"/>
+                      <w:r>
+                        <w:rPr>
+                          <w:lang w:val="es-AR"/>
+                        </w:rPr>
+                        <w:t>, lista)</w:t>
+                      </w:r>
+                    </w:p>
+                    <w:p>
+                      <w:pPr>
+                        <w:ind w:firstLine="0"/>
+                        <w:rPr>
+                          <w:lang w:val="es-AR"/>
+                        </w:rPr>
+                      </w:pPr>
+                      <w:r>
+                        <w:rPr>
+                          <w:lang w:val="es-AR"/>
+                        </w:rPr>
+                        <w:t>SI longitud(</w:t>
+                      </w:r>
+                      <w:proofErr w:type="spellStart"/>
+                      <w:r>
+                        <w:rPr>
+                          <w:lang w:val="es-AR"/>
+                        </w:rPr>
+                        <w:t>dni</w:t>
+                      </w:r>
+                      <w:proofErr w:type="spellEnd"/>
+                      <w:proofErr w:type="gramStart"/>
+                      <w:r>
+                        <w:rPr>
+                          <w:lang w:val="es-AR"/>
+                        </w:rPr>
+                        <w:t>) !</w:t>
+                      </w:r>
+                      <w:proofErr w:type="gramEnd"/>
+                      <w:r>
+                        <w:rPr>
+                          <w:lang w:val="es-AR"/>
+                        </w:rPr>
+                        <w:t>= 8 entonces</w:t>
+                      </w:r>
+                    </w:p>
+                    <w:p>
+                      <w:pPr>
+                        <w:ind w:firstLine="0"/>
+                        <w:rPr>
+                          <w:lang w:val="es-AR"/>
+                        </w:rPr>
+                      </w:pPr>
+                      <w:r>
+                        <w:rPr>
+                          <w:lang w:val="es-AR"/>
+                        </w:rPr>
+                        <w:tab/>
+                        <w:t>RETORNAR ERROR</w:t>
+                      </w:r>
+                    </w:p>
+                    <w:p>
+                      <w:pPr>
+                        <w:ind w:firstLine="0"/>
+                        <w:rPr>
+                          <w:lang w:val="es-AR"/>
+                        </w:rPr>
+                      </w:pPr>
+                      <w:r>
+                        <w:rPr>
+                          <w:lang w:val="es-AR"/>
+                        </w:rPr>
+                        <w:t>SINO</w:t>
+                      </w:r>
+                    </w:p>
+                    <w:p>
+                      <w:pPr>
+                        <w:rPr>
+                          <w:lang w:val="es-AR"/>
+                        </w:rPr>
+                      </w:pPr>
+                      <w:r>
+                        <w:rPr>
+                          <w:lang w:val="es-AR"/>
+                        </w:rPr>
+                        <w:t>PARA cada elemento EN lista HACER</w:t>
+                      </w:r>
+                    </w:p>
+                    <w:p>
+                      <w:pPr>
+                        <w:ind w:firstLine="0"/>
+                        <w:rPr>
+                          <w:lang w:val="es-AR"/>
+                        </w:rPr>
+                      </w:pPr>
+                      <w:r>
+                        <w:rPr>
+                          <w:lang w:val="es-AR"/>
+                        </w:rPr>
+                        <w:tab/>
+                      </w:r>
+                      <w:r>
+                        <w:rPr>
+                          <w:lang w:val="es-AR"/>
+                        </w:rPr>
+                        <w:tab/>
+                        <w:t xml:space="preserve">SI elemento = </w:t>
+                      </w:r>
+                      <w:proofErr w:type="spellStart"/>
+                      <w:r>
+                        <w:rPr>
+                          <w:lang w:val="es-AR"/>
+                        </w:rPr>
+                        <w:t>dni</w:t>
+                      </w:r>
+                      <w:proofErr w:type="spellEnd"/>
+                      <w:r>
+                        <w:rPr>
+                          <w:lang w:val="es-AR"/>
+                        </w:rPr>
+                        <w:t xml:space="preserve"> ENTONCES</w:t>
+                      </w:r>
+                    </w:p>
+                    <w:p>
+                      <w:pPr>
+                        <w:ind w:firstLine="0"/>
+                        <w:rPr>
+                          <w:lang w:val="es-AR"/>
+                        </w:rPr>
+                      </w:pPr>
+                      <w:r>
+                        <w:rPr>
+                          <w:lang w:val="es-AR"/>
+                        </w:rPr>
+                        <w:tab/>
+                      </w:r>
+                      <w:r>
+                        <w:rPr>
+                          <w:lang w:val="es-AR"/>
+                        </w:rPr>
+                        <w:tab/>
+                      </w:r>
+                      <w:r>
+                        <w:rPr>
+                          <w:lang w:val="es-AR"/>
+                        </w:rPr>
+                        <w:tab/>
+                        <w:t>RETORNAR TRUE</w:t>
+                      </w:r>
+                    </w:p>
+                    <w:p>
+                      <w:pPr>
+                        <w:ind w:left="720"/>
+                        <w:rPr>
+                          <w:lang w:val="es-AR"/>
+                        </w:rPr>
+                      </w:pPr>
+                      <w:r>
+                        <w:rPr>
+                          <w:lang w:val="es-AR"/>
+                        </w:rPr>
+                        <w:t xml:space="preserve">SINO </w:t>
+                      </w:r>
+                    </w:p>
+                    <w:p>
+                      <w:pPr>
+                        <w:ind w:left="1440"/>
+                        <w:rPr>
+                          <w:lang w:val="es-AR"/>
+                        </w:rPr>
+                      </w:pPr>
+                      <w:r>
+                        <w:rPr>
+                          <w:lang w:val="es-AR"/>
+                        </w:rPr>
+                        <w:t>RETORNAR FALSE</w:t>
+                      </w:r>
+                    </w:p>
+                  </w:txbxContent>
+                </v:textbox>
+                <w10:wrap type="topAndBottom"/>
+              </v:shape>
+            </w:pict>
+          </mc:Fallback>
+        </mc:AlternateContent>
+      </w:r>
+      <w:r>
+        <w:rPr>
+          <w:lang w:val="es-AR"/>
+        </w:rPr>
+        <w:t>GREEN:</w:t>
+      </w:r>
+    </w:p>
+    <w:p>
+      <w:pPr>
+        <w:pStyle w:val="Prrafodelista"/>
+        <w:numPr>
+          <w:ilvl w:val="0"/>
+          <w:numId w:val="34"/>
+        </w:numPr>
+        <w:rPr>
+          <w:lang w:val="es-AR"/>
+        </w:rPr>
+      </w:pPr>
+      <w:r>
+        <w:rPr>
+          <w:noProof/>
+          <w:lang w:eastAsia="es-ES"/>
+        </w:rPr>
+        <w:lastRenderedPageBreak/>
+        <mc:AlternateContent>
+          <mc:Choice Requires="wps">
+            <w:drawing>
+              <wp:anchor distT="0" distB="0" distL="114300" distR="114300" simplePos="0" relativeHeight="251677696" behindDoc="0" locked="0" layoutInCell="1" allowOverlap="1" wp14:anchorId="73D133D0" wp14:editId="3BBD9625">
+                <wp:simplePos x="0" y="0"/>
+                <wp:positionH relativeFrom="column">
+                  <wp:posOffset>1550035</wp:posOffset>
+                </wp:positionH>
+                <wp:positionV relativeFrom="paragraph">
+                  <wp:posOffset>1955800</wp:posOffset>
+                </wp:positionV>
+                <wp:extent cx="3759200" cy="2440940"/>
+                <wp:effectExtent l="0" t="0" r="12700" b="16510"/>
+                <wp:wrapTopAndBottom/>
+                <wp:docPr id="12" name="Cuadro de texto 12"/>
+                <wp:cNvGraphicFramePr>
+                  <a:graphicFrameLocks xmlns:a="http://schemas.openxmlformats.org/drawingml/2006/main"/>
+                </wp:cNvGraphicFramePr>
+                <a:graphic xmlns:a="http://schemas.openxmlformats.org/drawingml/2006/main">
+                  <a:graphicData uri="http://schemas.microsoft.com/office/word/2010/wordprocessingShape">
+                    <wps:wsp>
+                      <wps:cNvSpPr txBox="1">
+                        <a:spLocks noChangeArrowheads="1"/>
+                      </wps:cNvSpPr>
+                      <wps:spPr bwMode="auto">
+                        <a:xfrm>
+                          <a:off x="0" y="0"/>
+                          <a:ext cx="3759200" cy="2440940"/>
+                        </a:xfrm>
+                        <a:prstGeom prst="rect">
+                          <a:avLst/>
+                        </a:prstGeom>
+                        <a:solidFill>
+                          <a:srgbClr val="FFFFFF"/>
+                        </a:solidFill>
+                        <a:ln w="9525">
+                          <a:solidFill>
+                            <a:srgbClr val="000000"/>
+                          </a:solidFill>
+                          <a:miter lim="800000"/>
+                          <a:headEnd/>
+                          <a:tailEnd/>
+                        </a:ln>
+                      </wps:spPr>
+                      <wps:txbx>
+                        <w:txbxContent>
+                          <w:p>
+                            <w:pPr>
+                              <w:ind w:firstLine="0"/>
+                              <w:rPr>
+                                <w:lang w:val="es-AR"/>
+                              </w:rPr>
+                            </w:pPr>
+                            <w:r>
+                              <w:rPr>
+                                <w:lang w:val="es-AR"/>
+                              </w:rPr>
+                              <w:t xml:space="preserve">FUNCION: </w:t>
+                            </w:r>
+                            <w:proofErr w:type="spellStart"/>
+                            <w:r>
+                              <w:rPr>
+                                <w:lang w:val="es-AR"/>
+                              </w:rPr>
+                              <w:t>existe_</w:t>
+                            </w:r>
+                            <w:proofErr w:type="gramStart"/>
+                            <w:r>
+                              <w:rPr>
+                                <w:lang w:val="es-AR"/>
+                              </w:rPr>
+                              <w:t>dni</w:t>
+                            </w:r>
+                            <w:proofErr w:type="spellEnd"/>
+                            <w:r>
+                              <w:rPr>
+                                <w:lang w:val="es-AR"/>
+                              </w:rPr>
+                              <w:t>(</w:t>
+                            </w:r>
+                            <w:proofErr w:type="spellStart"/>
+                            <w:proofErr w:type="gramEnd"/>
+                            <w:r>
+                              <w:rPr>
+                                <w:lang w:val="es-AR"/>
+                              </w:rPr>
+                              <w:t>dni</w:t>
+                            </w:r>
+                            <w:proofErr w:type="spellEnd"/>
+                            <w:r>
+                              <w:rPr>
+                                <w:lang w:val="es-AR"/>
+                              </w:rPr>
+                              <w:t>, lista)</w:t>
+                            </w:r>
+                          </w:p>
+                          <w:p>
+                            <w:pPr>
+                              <w:ind w:firstLine="0"/>
+                              <w:rPr>
+                                <w:lang w:val="es-AR"/>
+                              </w:rPr>
+                            </w:pPr>
+                            <w:proofErr w:type="spellStart"/>
+                            <w:r>
+                              <w:rPr>
+                                <w:lang w:val="es-AR"/>
+                              </w:rPr>
+                              <w:t>dni_valido</w:t>
+                            </w:r>
+                            <w:proofErr w:type="spellEnd"/>
+                            <w:r>
+                              <w:rPr>
+                                <w:lang w:val="es-AR"/>
+                              </w:rPr>
+                              <w:t>(</w:t>
+                            </w:r>
+                            <w:proofErr w:type="spellStart"/>
+                            <w:r>
+                              <w:rPr>
+                                <w:lang w:val="es-AR"/>
+                              </w:rPr>
+                              <w:t>dni</w:t>
+                            </w:r>
+                            <w:proofErr w:type="spellEnd"/>
+                            <w:r>
+                              <w:rPr>
+                                <w:lang w:val="es-AR"/>
+                              </w:rPr>
+                              <w:t>)</w:t>
+                            </w:r>
+                          </w:p>
+                          <w:p>
+                            <w:pPr>
+                              <w:ind w:firstLine="0"/>
+                              <w:rPr>
+                                <w:lang w:val="es-AR"/>
+                              </w:rPr>
+                            </w:pPr>
+                            <w:r>
+                              <w:rPr>
+                                <w:lang w:val="es-AR"/>
+                              </w:rPr>
+                              <w:t>PARA cada elemento EN lista HACER</w:t>
+                            </w:r>
+                          </w:p>
+                          <w:p>
+                            <w:pPr>
+                              <w:ind w:firstLine="0"/>
+                              <w:rPr>
+                                <w:lang w:val="es-AR"/>
+                              </w:rPr>
+                            </w:pPr>
+                            <w:r>
+                              <w:rPr>
+                                <w:lang w:val="es-AR"/>
+                              </w:rPr>
+                              <w:tab/>
+                              <w:t xml:space="preserve">SI elemento = </w:t>
+                            </w:r>
+                            <w:proofErr w:type="spellStart"/>
+                            <w:r>
+                              <w:rPr>
+                                <w:lang w:val="es-AR"/>
+                              </w:rPr>
+                              <w:t>dni</w:t>
+                            </w:r>
+                            <w:proofErr w:type="spellEnd"/>
+                            <w:r>
+                              <w:rPr>
+                                <w:lang w:val="es-AR"/>
+                              </w:rPr>
+                              <w:t xml:space="preserve"> ENTONCES</w:t>
+                            </w:r>
+                          </w:p>
+                          <w:p>
+                            <w:pPr>
+                              <w:ind w:firstLine="0"/>
+                              <w:rPr>
+                                <w:lang w:val="es-AR"/>
+                              </w:rPr>
+                            </w:pPr>
+                            <w:r>
+                              <w:rPr>
+                                <w:lang w:val="es-AR"/>
+                              </w:rPr>
+                              <w:tab/>
+                            </w:r>
+                            <w:r>
+                              <w:rPr>
+                                <w:lang w:val="es-AR"/>
+                              </w:rPr>
+                              <w:tab/>
+                              <w:t>RETORNAR TRUE</w:t>
+                            </w:r>
+                          </w:p>
+                          <w:p>
+                            <w:pPr>
+                              <w:rPr>
+                                <w:lang w:val="es-AR"/>
+                              </w:rPr>
+                            </w:pPr>
+                            <w:r>
+                              <w:rPr>
+                                <w:lang w:val="es-AR"/>
+                              </w:rPr>
+                              <w:t xml:space="preserve">SINO </w:t>
+                            </w:r>
+                          </w:p>
+                          <w:p>
+                            <w:pPr>
+                              <w:rPr>
+                                <w:lang w:val="es-AR"/>
+                              </w:rPr>
+                            </w:pPr>
+                            <w:r>
+                              <w:rPr>
+                                <w:lang w:val="es-AR"/>
+                              </w:rPr>
+                              <w:t>RETORNAR FALSE</w:t>
+                            </w:r>
+                          </w:p>
+                        </w:txbxContent>
+                      </wps:txbx>
+                      <wps:bodyPr rot="0" vert="horz" wrap="square" lIns="91440" tIns="45720" rIns="91440" bIns="45720" anchor="t" anchorCtr="0">
+                        <a:noAutofit/>
+                      </wps:bodyPr>
+                    </wps:wsp>
+                  </a:graphicData>
+                </a:graphic>
+                <wp14:sizeRelH relativeFrom="margin">
+                  <wp14:pctWidth>0</wp14:pctWidth>
+                </wp14:sizeRelH>
+                <wp14:sizeRelV relativeFrom="margin">
+                  <wp14:pctHeight>0</wp14:pctHeight>
+                </wp14:sizeRelV>
+              </wp:anchor>
+            </w:drawing>
+          </mc:Choice>
+          <mc:Fallback>
+            <w:pict>
+              <v:shape w14:anchorId="73D133D0" id="Cuadro de texto 12" o:spid="_x0000_s1035" type="#_x0000_t202" style="position:absolute;left:0;text-align:left;margin-left:122.05pt;margin-top:154pt;width:296pt;height:192.2pt;z-index:251677696;visibility:visible;mso-wrap-style:square;mso-width-percent:0;mso-height-percent:0;mso-wrap-distance-left:9pt;mso-wrap-distance-top:0;mso-wrap-distance-right:9pt;mso-wrap-distance-bottom:0;mso-position-horizontal:absolute;mso-position-horizontal-relative:text;mso-position-vertical:absolute;mso-position-vertical-relative:text;mso-width-percent:0;mso-height-percent:0;mso-width-relative:margin;mso-height-relative:margin;v-text-anchor:top" o:gfxdata="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">
+                <v:textbox>
+                  <w:txbxContent>
+                    <w:p>
+                      <w:pPr>
+                        <w:ind w:firstLine="0"/>
+                        <w:rPr>
+                          <w:lang w:val="es-AR"/>
+                        </w:rPr>
+                      </w:pPr>
+                      <w:r>
+                        <w:rPr>
+                          <w:lang w:val="es-AR"/>
+                        </w:rPr>
+                        <w:t xml:space="preserve">FUNCION: </w:t>
+                      </w:r>
+                      <w:proofErr w:type="spellStart"/>
+                      <w:r>
+                        <w:rPr>
+                          <w:lang w:val="es-AR"/>
+                        </w:rPr>
+                        <w:t>existe_</w:t>
+                      </w:r>
+                      <w:proofErr w:type="gramStart"/>
+                      <w:r>
+                        <w:rPr>
+                          <w:lang w:val="es-AR"/>
+                        </w:rPr>
+                        <w:t>dni</w:t>
+                      </w:r>
+                      <w:proofErr w:type="spellEnd"/>
+                      <w:r>
+                        <w:rPr>
+                          <w:lang w:val="es-AR"/>
+                        </w:rPr>
+                        <w:t>(</w:t>
+                      </w:r>
+                      <w:proofErr w:type="spellStart"/>
+                      <w:proofErr w:type="gramEnd"/>
+                      <w:r>
+                        <w:rPr>
+                          <w:lang w:val="es-AR"/>
+                        </w:rPr>
+                        <w:t>dni</w:t>
+                      </w:r>
+                      <w:proofErr w:type="spellEnd"/>
+                      <w:r>
+                        <w:rPr>
+                          <w:lang w:val="es-AR"/>
+                        </w:rPr>
+                        <w:t>, lista)</w:t>
+                      </w:r>
+                    </w:p>
+                    <w:p>
+                      <w:pPr>
+                        <w:ind w:firstLine="0"/>
+                        <w:rPr>
+                          <w:lang w:val="es-AR"/>
+                        </w:rPr>
+                      </w:pPr>
+                      <w:proofErr w:type="spellStart"/>
+                      <w:r>
+                        <w:rPr>
+                          <w:lang w:val="es-AR"/>
+                        </w:rPr>
+                        <w:t>dni_valido</w:t>
+                      </w:r>
+                      <w:proofErr w:type="spellEnd"/>
+                      <w:r>
+                        <w:rPr>
+                          <w:lang w:val="es-AR"/>
+                        </w:rPr>
+                        <w:t>(</w:t>
+                      </w:r>
+                      <w:proofErr w:type="spellStart"/>
+                      <w:r>
+                        <w:rPr>
+                          <w:lang w:val="es-AR"/>
+                        </w:rPr>
+                        <w:t>dni</w:t>
+                      </w:r>
+                      <w:proofErr w:type="spellEnd"/>
+                      <w:r>
+                        <w:rPr>
+                          <w:lang w:val="es-AR"/>
+                        </w:rPr>
+                        <w:t>)</w:t>
+                      </w:r>
+                    </w:p>
+                    <w:p>
+                      <w:pPr>
+                        <w:ind w:firstLine="0"/>
+                        <w:rPr>
+                          <w:lang w:val="es-AR"/>
+                        </w:rPr>
+                      </w:pPr>
+                      <w:r>
+                        <w:rPr>
+                          <w:lang w:val="es-AR"/>
+                        </w:rPr>
+                        <w:t>PARA cada elemento EN lista HACER</w:t>
+                      </w:r>
+                    </w:p>
+                    <w:p>
+                      <w:pPr>
+                        <w:ind w:firstLine="0"/>
+                        <w:rPr>
+                          <w:lang w:val="es-AR"/>
+                        </w:rPr>
+                      </w:pPr>
+                      <w:r>
+                        <w:rPr>
+                          <w:lang w:val="es-AR"/>
+                        </w:rPr>
+                        <w:tab/>
+                        <w:t xml:space="preserve">SI elemento = </w:t>
+                      </w:r>
+                      <w:proofErr w:type="spellStart"/>
+                      <w:r>
+                        <w:rPr>
+                          <w:lang w:val="es-AR"/>
+                        </w:rPr>
+                        <w:t>dni</w:t>
+                      </w:r>
+                      <w:proofErr w:type="spellEnd"/>
+                      <w:r>
+                        <w:rPr>
+                          <w:lang w:val="es-AR"/>
+                        </w:rPr>
+                        <w:t xml:space="preserve"> ENTONCES</w:t>
+                      </w:r>
+                    </w:p>
+                    <w:p>
+                      <w:pPr>
+                        <w:ind w:firstLine="0"/>
+                        <w:rPr>
+                          <w:lang w:val="es-AR"/>
+                        </w:rPr>
+                      </w:pPr>
+                      <w:r>
+                        <w:rPr>
+                          <w:lang w:val="es-AR"/>
+                        </w:rPr>
+                        <w:tab/>
+                      </w:r>
+                      <w:r>
+                        <w:rPr>
+                          <w:lang w:val="es-AR"/>
+                        </w:rPr>
+                        <w:tab/>
+                        <w:t>RETORNAR TRUE</w:t>
+                      </w:r>
+                    </w:p>
+                    <w:p>
+                      <w:pPr>
+                        <w:rPr>
+                          <w:lang w:val="es-AR"/>
+                        </w:rPr>
+                      </w:pPr>
+                      <w:r>
+                        <w:rPr>
+                          <w:lang w:val="es-AR"/>
+                        </w:rPr>
+                        <w:t xml:space="preserve">SINO </w:t>
+                      </w:r>
+                    </w:p>
+                    <w:p>
+                      <w:pPr>
+                        <w:rPr>
+                          <w:lang w:val="es-AR"/>
+                        </w:rPr>
+                      </w:pPr>
+                      <w:r>
+                        <w:rPr>
+                          <w:lang w:val="es-AR"/>
+                        </w:rPr>
+                        <w:t>RETORNAR FALSE</w:t>
+                      </w:r>
+                    </w:p>
+                  </w:txbxContent>
+                </v:textbox>
+                <w10:wrap type="topAndBottom"/>
+              </v:shape>
+            </w:pict>
+          </mc:Fallback>
+        </mc:AlternateContent>
+      </w:r>
+      <w:r>
+        <w:rPr>
+          <w:noProof/>
+          <w:lang w:eastAsia="es-ES"/>
+        </w:rPr>
+        <mc:AlternateContent>
+          <mc:Choice Requires="wps">
+            <w:drawing>
+              <wp:anchor distT="0" distB="0" distL="114300" distR="114300" simplePos="0" relativeHeight="251675648" behindDoc="0" locked="0" layoutInCell="1" allowOverlap="1" wp14:anchorId="1293598F" wp14:editId="39DF6D36">
+                <wp:simplePos x="0" y="0"/>
+                <wp:positionH relativeFrom="column">
+                  <wp:posOffset>1550035</wp:posOffset>
+                </wp:positionH>
+                <wp:positionV relativeFrom="paragraph">
+                  <wp:posOffset>747395</wp:posOffset>
+                </wp:positionV>
+                <wp:extent cx="3759200" cy="1033145"/>
+                <wp:effectExtent l="0" t="0" r="12700" b="14605"/>
+                <wp:wrapTopAndBottom/>
+                <wp:docPr id="11" name="Cuadro de texto 11"/>
+                <wp:cNvGraphicFramePr>
+                  <a:graphicFrameLocks xmlns:a="http://schemas.openxmlformats.org/drawingml/2006/main"/>
+                </wp:cNvGraphicFramePr>
+                <a:graphic xmlns:a="http://schemas.openxmlformats.org/drawingml/2006/main">
+                  <a:graphicData uri="http://schemas.microsoft.com/office/word/2010/wordprocessingShape">
+                    <wps:wsp>
+                      <wps:cNvSpPr txBox="1">
+                        <a:spLocks noChangeArrowheads="1"/>
+                      </wps:cNvSpPr>
+                      <wps:spPr bwMode="auto">
+                        <a:xfrm>
+                          <a:off x="0" y="0"/>
+                          <a:ext cx="3759200" cy="1033145"/>
+                        </a:xfrm>
+                        <a:prstGeom prst="rect">
+                          <a:avLst/>
+                        </a:prstGeom>
+                        <a:solidFill>
+                          <a:srgbClr val="FFFFFF"/>
+                        </a:solidFill>
+                        <a:ln w="9525">
+                          <a:solidFill>
+                            <a:srgbClr val="000000"/>
+                          </a:solidFill>
+                          <a:miter lim="800000"/>
+                          <a:headEnd/>
+                          <a:tailEnd/>
+                        </a:ln>
+                      </wps:spPr>
+                      <wps:txbx>
+                        <w:txbxContent>
+                          <w:p>
+                            <w:pPr>
+                              <w:ind w:firstLine="0"/>
+                              <w:rPr>
+                                <w:lang w:val="es-AR"/>
+                              </w:rPr>
+                            </w:pPr>
+                            <w:r>
+                              <w:rPr>
+                                <w:lang w:val="es-AR"/>
+                              </w:rPr>
+                              <w:t xml:space="preserve">FUNCION: </w:t>
+                            </w:r>
+                            <w:proofErr w:type="spellStart"/>
+                            <w:r>
+                              <w:rPr>
+                                <w:lang w:val="es-AR"/>
+                              </w:rPr>
+                              <w:t>dni_valido</w:t>
+                            </w:r>
+                            <w:proofErr w:type="spellEnd"/>
+                            <w:r>
+                              <w:rPr>
+                                <w:lang w:val="es-AR"/>
+                              </w:rPr>
+                              <w:t xml:space="preserve"> </w:t>
+                            </w:r>
+                            <w:r>
+                              <w:rPr>
+                                <w:lang w:val="es-AR"/>
+                              </w:rPr>
+                              <w:t>(</w:t>
+                            </w:r>
+                            <w:proofErr w:type="spellStart"/>
+                            <w:r>
+                              <w:rPr>
+                                <w:lang w:val="es-AR"/>
+                              </w:rPr>
+                              <w:t>dni</w:t>
+                            </w:r>
+                            <w:proofErr w:type="spellEnd"/>
+                            <w:r>
+                              <w:rPr>
+                                <w:lang w:val="es-AR"/>
+                              </w:rPr>
+                              <w:t>)</w:t>
+                            </w:r>
+                          </w:p>
+                          <w:p>
+                            <w:pPr>
+                              <w:ind w:firstLine="0"/>
+                              <w:rPr>
+                                <w:lang w:val="es-AR"/>
+                              </w:rPr>
+                            </w:pPr>
+                            <w:r>
+                              <w:rPr>
+                                <w:lang w:val="es-AR"/>
+                              </w:rPr>
+                              <w:t>SI longitud(</w:t>
+                            </w:r>
+                            <w:proofErr w:type="spellStart"/>
+                            <w:r>
+                              <w:rPr>
+                                <w:lang w:val="es-AR"/>
+                              </w:rPr>
+                              <w:t>dni</w:t>
+                            </w:r>
+                            <w:proofErr w:type="spellEnd"/>
+                            <w:proofErr w:type="gramStart"/>
+                            <w:r>
+                              <w:rPr>
+                                <w:lang w:val="es-AR"/>
+                              </w:rPr>
+                              <w:t>) !</w:t>
+                            </w:r>
+                            <w:proofErr w:type="gramEnd"/>
+                            <w:r>
+                              <w:rPr>
+                                <w:lang w:val="es-AR"/>
+                              </w:rPr>
+                              <w:t>= 8 ENTONCES</w:t>
+                            </w:r>
+                          </w:p>
+                          <w:p>
+                            <w:pPr>
+                              <w:ind w:firstLine="0"/>
+                              <w:rPr>
+                                <w:lang w:val="es-AR"/>
+                              </w:rPr>
+                            </w:pPr>
+                            <w:r>
+                              <w:rPr>
+                                <w:lang w:val="es-AR"/>
+                              </w:rPr>
+                              <w:tab/>
+                              <w:t xml:space="preserve">RETORNAR ERROR </w:t>
+                            </w:r>
+                          </w:p>
+                        </w:txbxContent>
+                      </wps:txbx>
+                      <wps:bodyPr rot="0" vert="horz" wrap="square" lIns="91440" tIns="45720" rIns="91440" bIns="45720" anchor="t" anchorCtr="0">
+                        <a:noAutofit/>
+                      </wps:bodyPr>
+                    </wps:wsp>
+                  </a:graphicData>
+                </a:graphic>
+                <wp14:sizeRelH relativeFrom="margin">
+                  <wp14:pctWidth>0</wp14:pctWidth>
+                </wp14:sizeRelH>
+                <wp14:sizeRelV relativeFrom="margin">
+                  <wp14:pctHeight>0</wp14:pctHeight>
+                </wp14:sizeRelV>
+              </wp:anchor>
+            </w:drawing>
+          </mc:Choice>
+          <mc:Fallback>
+            <w:pict>
+              <v:shape w14:anchorId="1293598F" id="Cuadro de texto 11" o:spid="_x0000_s1036" type="#_x0000_t202" style="position:absolute;left:0;text-align:left;margin-left:122.05pt;margin-top:58.85pt;width:296pt;height:81.35pt;z-index:251675648;visibility:visible;mso-wrap-style:square;mso-width-percent:0;mso-height-percent:0;mso-wrap-distance-left:9pt;mso-wrap-distance-top:0;mso-wrap-distance-right:9pt;mso-wrap-distance-bottom:0;mso-position-horizontal:absolute;mso-position-horizontal-relative:text;mso-position-vertical:absolute;mso-position-vertical-relative:text;mso-width-percent:0;mso-height-percent:0;mso-width-relative:margin;mso-height-relative:margin;v-text-anchor:top" o:gfxdata="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">
+                <v:textbox>
+                  <w:txbxContent>
+                    <w:p>
+                      <w:pPr>
+                        <w:ind w:firstLine="0"/>
+                        <w:rPr>
+                          <w:lang w:val="es-AR"/>
+                        </w:rPr>
+                      </w:pPr>
+                      <w:r>
+                        <w:rPr>
+                          <w:lang w:val="es-AR"/>
+                        </w:rPr>
+                        <w:t xml:space="preserve">FUNCION: </w:t>
+                      </w:r>
+                      <w:proofErr w:type="spellStart"/>
+                      <w:r>
+                        <w:rPr>
+                          <w:lang w:val="es-AR"/>
+                        </w:rPr>
+                        <w:t>dni_valido</w:t>
+                      </w:r>
+                      <w:proofErr w:type="spellEnd"/>
+                      <w:r>
+                        <w:rPr>
+                          <w:lang w:val="es-AR"/>
+                        </w:rPr>
+                        <w:t xml:space="preserve"> </w:t>
+                      </w:r>
+                      <w:r>
+                        <w:rPr>
+                          <w:lang w:val="es-AR"/>
+                        </w:rPr>
+                        <w:t>(</w:t>
+                      </w:r>
+                      <w:proofErr w:type="spellStart"/>
+                      <w:r>
+                        <w:rPr>
+                          <w:lang w:val="es-AR"/>
+                        </w:rPr>
+                        <w:t>dni</w:t>
+                      </w:r>
+                      <w:proofErr w:type="spellEnd"/>
+                      <w:r>
+                        <w:rPr>
+                          <w:lang w:val="es-AR"/>
+                        </w:rPr>
+                        <w:t>)</w:t>
+                      </w:r>
+                    </w:p>
+                    <w:p>
+                      <w:pPr>
+                        <w:ind w:firstLine="0"/>
+                        <w:rPr>
+                          <w:lang w:val="es-AR"/>
+                        </w:rPr>
+                      </w:pPr>
+                      <w:r>
+                        <w:rPr>
+                          <w:lang w:val="es-AR"/>
+                        </w:rPr>
+                        <w:t>SI longitud(</w:t>
+                      </w:r>
+                      <w:proofErr w:type="spellStart"/>
+                      <w:r>
+                        <w:rPr>
+                          <w:lang w:val="es-AR"/>
+                        </w:rPr>
+                        <w:t>dni</w:t>
+                      </w:r>
+                      <w:proofErr w:type="spellEnd"/>
+                      <w:proofErr w:type="gramStart"/>
+                      <w:r>
+                        <w:rPr>
+                          <w:lang w:val="es-AR"/>
+                        </w:rPr>
+                        <w:t>) !</w:t>
+                      </w:r>
+                      <w:proofErr w:type="gramEnd"/>
+                      <w:r>
+                        <w:rPr>
+                          <w:lang w:val="es-AR"/>
+                        </w:rPr>
+                        <w:t>= 8 ENTONCES</w:t>
+                      </w:r>
+                    </w:p>
+                    <w:p>
+                      <w:pPr>
+                        <w:ind w:firstLine="0"/>
+                        <w:rPr>
+                          <w:lang w:val="es-AR"/>
+                        </w:rPr>
+                      </w:pPr>
+                      <w:r>
+                        <w:rPr>
+                          <w:lang w:val="es-AR"/>
+                        </w:rPr>
+                        <w:tab/>
+                        <w:t xml:space="preserve">RETORNAR ERROR </w:t>
+                      </w:r>
+                    </w:p>
+                  </w:txbxContent>
+                </v:textbox>
+                <w10:wrap type="topAndBottom"/>
+              </v:shape>
+            </w:pict>
+          </mc:Fallback>
+        </mc:AlternateContent>
+      </w:r>
+      <w:r>
+        <w:rPr>
+          <w:lang w:val="es-AR"/>
+        </w:rPr>
+        <w:t>REFACTOR: en este caso una buena práctica de refactorización seria separar las responsabilidades de la función en funciones diferentes.</w:t>
+      </w:r>
+    </w:p>
+    <w:p>
+      <w:pPr>
         <w:ind w:firstLine="0"/>
-      </w:pPr>
+        <w:rPr>
+          <w:sz w:val="28"/>
+          <w:lang w:val="es-AR"/>
+        </w:rPr>
+      </w:pPr>
+      <w:bookmarkStart w:id="0" w:name="_GoBack"/>
+      <w:bookmarkEnd w:id="0"/>
     </w:p>
     <w:p>
       <w:pPr>
@@ -2138,8 +6010,6 @@
           <w:lang w:val="es-AR"/>
         </w:rPr>
       </w:pPr>
-      <w:bookmarkStart w:id="0" w:name="_GoBack"/>
-      <w:bookmarkEnd w:id="0"/>
       <w:r>
         <w:t xml:space="preserve">Considerando las características vistas de la metodología Test </w:t>
       </w:r>
@@ -2625,7 +6495,7 @@
         <w:noProof/>
         <w:lang w:bidi="es-ES"/>
       </w:rPr>
-      <w:t>2</w:t>
+      <w:t>13</w:t>
     </w:r>
     <w:r>
       <w:rPr>
@@ -2902,6 +6772,208 @@
     </w:lvl>
   </w:abstractNum>
   <w:abstractNum w:abstractNumId="10" w15:restartNumberingAfterBreak="0">
+    <w:nsid w:val="0120444C"/>
+    <w:multiLevelType w:val="hybridMultilevel"/>
+    <w:tmpl w:val="6C8CB2F2"/>
+    <w:lvl w:ilvl="0" w:tplc="ACC6C8A8">
+      <w:start w:val="1"/>
+      <w:numFmt w:val="lowerLetter"/>
+      <w:lvlText w:val="%1."/>
+      <w:lvlJc w:val="left"/>
+      <w:pPr>
+        <w:ind w:left="1080" w:hanging="360"/>
+      </w:pPr>
+      <w:rPr>
+        <w:rFonts w:hint="default"/>
+      </w:rPr>
+    </w:lvl>
+    <w:lvl w:ilvl="1" w:tplc="0C0A0019" w:tentative="1">
+      <w:start w:val="1"/>
+      <w:numFmt w:val="lowerLetter"/>
+      <w:lvlText w:val="%2."/>
+      <w:lvlJc w:val="left"/>
+      <w:pPr>
+        <w:ind w:left="1800" w:hanging="360"/>
+      </w:pPr>
+    </w:lvl>
+    <w:lvl w:ilvl="2" w:tplc="0C0A001B" w:tentative="1">
+      <w:start w:val="1"/>
+      <w:numFmt w:val="lowerRoman"/>
+      <w:lvlText w:val="%3."/>
+      <w:lvlJc w:val="right"/>
+      <w:pPr>
+        <w:ind w:left="2520" w:hanging="180"/>
+      </w:pPr>
+    </w:lvl>
+    <w:lvl w:ilvl="3" w:tplc="0C0A000F" w:tentative="1">
+      <w:start w:val="1"/>
+      <w:numFmt w:val="decimal"/>
+      <w:lvlText w:val="%4."/>
+      <w:lvlJc w:val="left"/>
+      <w:pPr>
+        <w:ind w:left="3240" w:hanging="360"/>
+      </w:pPr>
+    </w:lvl>
+    <w:lvl w:ilvl="4" w:tplc="0C0A0019" w:tentative="1">
+      <w:start w:val="1"/>
+      <w:numFmt w:val="lowerLetter"/>
+      <w:lvlText w:val="%5."/>
+      <w:lvlJc w:val="left"/>
+      <w:pPr>
+        <w:ind w:left="3960" w:hanging="360"/>
+      </w:pPr>
+    </w:lvl>
+    <w:lvl w:ilvl="5" w:tplc="0C0A001B" w:tentative="1">
+      <w:start w:val="1"/>
+      <w:numFmt w:val="lowerRoman"/>
+      <w:lvlText w:val="%6."/>
+      <w:lvlJc w:val="right"/>
+      <w:pPr>
+        <w:ind w:left="4680" w:hanging="180"/>
+      </w:pPr>
+    </w:lvl>
+    <w:lvl w:ilvl="6" w:tplc="0C0A000F" w:tentative="1">
+      <w:start w:val="1"/>
+      <w:numFmt w:val="decimal"/>
+      <w:lvlText w:val="%7."/>
+      <w:lvlJc w:val="left"/>
+      <w:pPr>
+        <w:ind w:left="5400" w:hanging="360"/>
+      </w:pPr>
+    </w:lvl>
+    <w:lvl w:ilvl="7" w:tplc="0C0A0019" w:tentative="1">
+      <w:start w:val="1"/>
+      <w:numFmt w:val="lowerLetter"/>
+      <w:lvlText w:val="%8."/>
+      <w:lvlJc w:val="left"/>
+      <w:pPr>
+        <w:ind w:left="6120" w:hanging="360"/>
+      </w:pPr>
+    </w:lvl>
+    <w:lvl w:ilvl="8" w:tplc="0C0A001B" w:tentative="1">
+      <w:start w:val="1"/>
+      <w:numFmt w:val="lowerRoman"/>
+      <w:lvlText w:val="%9."/>
+      <w:lvlJc w:val="right"/>
+      <w:pPr>
+        <w:ind w:left="6840" w:hanging="180"/>
+      </w:pPr>
+    </w:lvl>
+  </w:abstractNum>
+  <w:abstractNum w:abstractNumId="11" w15:restartNumberingAfterBreak="0">
+    <w:nsid w:val="014619AD"/>
+    <w:multiLevelType w:val="hybridMultilevel"/>
+    <w:tmpl w:val="5D16AAB4"/>
+    <w:lvl w:ilvl="0" w:tplc="0C0A0001">
+      <w:start w:val="1"/>
+      <w:numFmt w:val="bullet"/>
+      <w:lvlText w:val=""/>
+      <w:lvlJc w:val="left"/>
+      <w:pPr>
+        <w:ind w:left="1800" w:hanging="360"/>
+      </w:pPr>
+      <w:rPr>
+        <w:rFonts w:ascii="Symbol" w:hAnsi="Symbol" w:hint="default"/>
+      </w:rPr>
+    </w:lvl>
+    <w:lvl w:ilvl="1" w:tplc="0C0A0003" w:tentative="1">
+      <w:start w:val="1"/>
+      <w:numFmt w:val="bullet"/>
+      <w:lvlText w:val="o"/>
+      <w:lvlJc w:val="left"/>
+      <w:pPr>
+        <w:ind w:left="2520" w:hanging="360"/>
+      </w:pPr>
+      <w:rPr>
+        <w:rFonts w:ascii="Courier New" w:hAnsi="Courier New" w:cs="Courier New" w:hint="default"/>
+      </w:rPr>
+    </w:lvl>
+    <w:lvl w:ilvl="2" w:tplc="0C0A0005" w:tentative="1">
+      <w:start w:val="1"/>
+      <w:numFmt w:val="bullet"/>
+      <w:lvlText w:val=""/>
+      <w:lvlJc w:val="left"/>
+      <w:pPr>
+        <w:ind w:left="3240" w:hanging="360"/>
+      </w:pPr>
+      <w:rPr>
+        <w:rFonts w:ascii="Wingdings" w:hAnsi="Wingdings" w:hint="default"/>
+      </w:rPr>
+    </w:lvl>
+    <w:lvl w:ilvl="3" w:tplc="0C0A0001" w:tentative="1">
+      <w:start w:val="1"/>
+      <w:numFmt w:val="bullet"/>
+      <w:lvlText w:val=""/>
+      <w:lvlJc w:val="left"/>
+      <w:pPr>
+        <w:ind w:left="3960" w:hanging="360"/>
+      </w:pPr>
+      <w:rPr>
+        <w:rFonts w:ascii="Symbol" w:hAnsi="Symbol" w:hint="default"/>
+      </w:rPr>
+    </w:lvl>
+    <w:lvl w:ilvl="4" w:tplc="0C0A0003" w:tentative="1">
+      <w:start w:val="1"/>
+      <w:numFmt w:val="bullet"/>
+      <w:lvlText w:val="o"/>
+      <w:lvlJc w:val="left"/>
+      <w:pPr>
+        <w:ind w:left="4680" w:hanging="360"/>
+      </w:pPr>
+      <w:rPr>
+        <w:rFonts w:ascii="Courier New" w:hAnsi="Courier New" w:cs="Courier New" w:hint="default"/>
+      </w:rPr>
+    </w:lvl>
+    <w:lvl w:ilvl="5" w:tplc="0C0A0005" w:tentative="1">
+      <w:start w:val="1"/>
+      <w:numFmt w:val="bullet"/>
+      <w:lvlText w:val=""/>
+      <w:lvlJc w:val="left"/>
+      <w:pPr>
+        <w:ind w:left="5400" w:hanging="360"/>
+      </w:pPr>
+      <w:rPr>
+        <w:rFonts w:ascii="Wingdings" w:hAnsi="Wingdings" w:hint="default"/>
+      </w:rPr>
+    </w:lvl>
+    <w:lvl w:ilvl="6" w:tplc="0C0A0001" w:tentative="1">
+      <w:start w:val="1"/>
+      <w:numFmt w:val="bullet"/>
+      <w:lvlText w:val=""/>
+      <w:lvlJc w:val="left"/>
+      <w:pPr>
+        <w:ind w:left="6120" w:hanging="360"/>
+      </w:pPr>
+      <w:rPr>
+        <w:rFonts w:ascii="Symbol" w:hAnsi="Symbol" w:hint="default"/>
+      </w:rPr>
+    </w:lvl>
+    <w:lvl w:ilvl="7" w:tplc="0C0A0003" w:tentative="1">
+      <w:start w:val="1"/>
+      <w:numFmt w:val="bullet"/>
+      <w:lvlText w:val="o"/>
+      <w:lvlJc w:val="left"/>
+      <w:pPr>
+        <w:ind w:left="6840" w:hanging="360"/>
+      </w:pPr>
+      <w:rPr>
+        <w:rFonts w:ascii="Courier New" w:hAnsi="Courier New" w:cs="Courier New" w:hint="default"/>
+      </w:rPr>
+    </w:lvl>
+    <w:lvl w:ilvl="8" w:tplc="0C0A0005" w:tentative="1">
+      <w:start w:val="1"/>
+      <w:numFmt w:val="bullet"/>
+      <w:lvlText w:val=""/>
+      <w:lvlJc w:val="left"/>
+      <w:pPr>
+        <w:ind w:left="7560" w:hanging="360"/>
+      </w:pPr>
+      <w:rPr>
+        <w:rFonts w:ascii="Wingdings" w:hAnsi="Wingdings" w:hint="default"/>
+      </w:rPr>
+    </w:lvl>
+  </w:abstractNum>
+  <w:abstractNum w:abstractNumId="12" w15:restartNumberingAfterBreak="0">
     <w:nsid w:val="12F20A38"/>
     <w:multiLevelType w:val="hybridMultilevel"/>
     <w:tmpl w:val="9286A506"/>
@@ -2987,7 +7059,7 @@
       </w:pPr>
     </w:lvl>
   </w:abstractNum>
-  <w:abstractNum w:abstractNumId="11" w15:restartNumberingAfterBreak="0">
+  <w:abstractNum w:abstractNumId="13" w15:restartNumberingAfterBreak="0">
     <w:nsid w:val="284D5A83"/>
     <w:multiLevelType w:val="hybridMultilevel"/>
     <w:tmpl w:val="4350B85A"/>
@@ -3100,7 +7172,7 @@
       </w:rPr>
     </w:lvl>
   </w:abstractNum>
-  <w:abstractNum w:abstractNumId="12" w15:restartNumberingAfterBreak="0">
+  <w:abstractNum w:abstractNumId="14" w15:restartNumberingAfterBreak="0">
     <w:nsid w:val="2ED276A0"/>
     <w:multiLevelType w:val="hybridMultilevel"/>
     <w:tmpl w:val="415024C6"/>
@@ -3213,7 +7285,7 @@
       </w:rPr>
     </w:lvl>
   </w:abstractNum>
-  <w:abstractNum w:abstractNumId="13" w15:restartNumberingAfterBreak="0">
+  <w:abstractNum w:abstractNumId="15" w15:restartNumberingAfterBreak="0">
     <w:nsid w:val="322F7C2F"/>
     <w:multiLevelType w:val="hybridMultilevel"/>
     <w:tmpl w:val="DA3CDF4C"/>
@@ -3326,7 +7398,7 @@
       </w:rPr>
     </w:lvl>
   </w:abstractNum>
-  <w:abstractNum w:abstractNumId="14" w15:restartNumberingAfterBreak="0">
+  <w:abstractNum w:abstractNumId="16" w15:restartNumberingAfterBreak="0">
     <w:nsid w:val="37DD4538"/>
     <w:multiLevelType w:val="hybridMultilevel"/>
     <w:tmpl w:val="8D4AF2F0"/>
@@ -3415,7 +7487,7 @@
       </w:pPr>
     </w:lvl>
   </w:abstractNum>
-  <w:abstractNum w:abstractNumId="15" w15:restartNumberingAfterBreak="0">
+  <w:abstractNum w:abstractNumId="17" w15:restartNumberingAfterBreak="0">
     <w:nsid w:val="39AA5C11"/>
     <w:multiLevelType w:val="multilevel"/>
     <w:tmpl w:val="87902BD0"/>
@@ -3564,7 +7636,120 @@
       </w:rPr>
     </w:lvl>
   </w:abstractNum>
-  <w:abstractNum w:abstractNumId="16" w15:restartNumberingAfterBreak="0">
+  <w:abstractNum w:abstractNumId="18" w15:restartNumberingAfterBreak="0">
+    <w:nsid w:val="46B666DD"/>
+    <w:multiLevelType w:val="hybridMultilevel"/>
+    <w:tmpl w:val="6FB61ED6"/>
+    <w:lvl w:ilvl="0" w:tplc="0C0A0001">
+      <w:start w:val="1"/>
+      <w:numFmt w:val="bullet"/>
+      <w:lvlText w:val=""/>
+      <w:lvlJc w:val="left"/>
+      <w:pPr>
+        <w:ind w:left="1800" w:hanging="360"/>
+      </w:pPr>
+      <w:rPr>
+        <w:rFonts w:ascii="Symbol" w:hAnsi="Symbol" w:hint="default"/>
+      </w:rPr>
+    </w:lvl>
+    <w:lvl w:ilvl="1" w:tplc="0C0A0003" w:tentative="1">
+      <w:start w:val="1"/>
+      <w:numFmt w:val="bullet"/>
+      <w:lvlText w:val="o"/>
+      <w:lvlJc w:val="left"/>
+      <w:pPr>
+        <w:ind w:left="2520" w:hanging="360"/>
+      </w:pPr>
+      <w:rPr>
+        <w:rFonts w:ascii="Courier New" w:hAnsi="Courier New" w:cs="Courier New" w:hint="default"/>
+      </w:rPr>
+    </w:lvl>
+    <w:lvl w:ilvl="2" w:tplc="0C0A0005" w:tentative="1">
+      <w:start w:val="1"/>
+      <w:numFmt w:val="bullet"/>
+      <w:lvlText w:val=""/>
+      <w:lvlJc w:val="left"/>
+      <w:pPr>
+        <w:ind w:left="3240" w:hanging="360"/>
+      </w:pPr>
+      <w:rPr>
+        <w:rFonts w:ascii="Wingdings" w:hAnsi="Wingdings" w:hint="default"/>
+      </w:rPr>
+    </w:lvl>
+    <w:lvl w:ilvl="3" w:tplc="0C0A0001" w:tentative="1">
+      <w:start w:val="1"/>
+      <w:numFmt w:val="bullet"/>
+      <w:lvlText w:val=""/>
+      <w:lvlJc w:val="left"/>
+      <w:pPr>
+        <w:ind w:left="3960" w:hanging="360"/>
+      </w:pPr>
+      <w:rPr>
+        <w:rFonts w:ascii="Symbol" w:hAnsi="Symbol" w:hint="default"/>
+      </w:rPr>
+    </w:lvl>
+    <w:lvl w:ilvl="4" w:tplc="0C0A0003" w:tentative="1">
+      <w:start w:val="1"/>
+      <w:numFmt w:val="bullet"/>
+      <w:lvlText w:val="o"/>
+      <w:lvlJc w:val="left"/>
+      <w:pPr>
+        <w:ind w:left="4680" w:hanging="360"/>
+      </w:pPr>
+      <w:rPr>
+        <w:rFonts w:ascii="Courier New" w:hAnsi="Courier New" w:cs="Courier New" w:hint="default"/>
+      </w:rPr>
+    </w:lvl>
+    <w:lvl w:ilvl="5" w:tplc="0C0A0005" w:tentative="1">
+      <w:start w:val="1"/>
+      <w:numFmt w:val="bullet"/>
+      <w:lvlText w:val=""/>
+      <w:lvlJc w:val="left"/>
+      <w:pPr>
+        <w:ind w:left="5400" w:hanging="360"/>
+      </w:pPr>
+      <w:rPr>
+        <w:rFonts w:ascii="Wingdings" w:hAnsi="Wingdings" w:hint="default"/>
+      </w:rPr>
+    </w:lvl>
+    <w:lvl w:ilvl="6" w:tplc="0C0A0001" w:tentative="1">
+      <w:start w:val="1"/>
+      <w:numFmt w:val="bullet"/>
+      <w:lvlText w:val=""/>
+      <w:lvlJc w:val="left"/>
+      <w:pPr>
+        <w:ind w:left="6120" w:hanging="360"/>
+      </w:pPr>
+      <w:rPr>
+        <w:rFonts w:ascii="Symbol" w:hAnsi="Symbol" w:hint="default"/>
+      </w:rPr>
+    </w:lvl>
+    <w:lvl w:ilvl="7" w:tplc="0C0A0003" w:tentative="1">
+      <w:start w:val="1"/>
+      <w:numFmt w:val="bullet"/>
+      <w:lvlText w:val="o"/>
+      <w:lvlJc w:val="left"/>
+      <w:pPr>
+        <w:ind w:left="6840" w:hanging="360"/>
+      </w:pPr>
+      <w:rPr>
+        <w:rFonts w:ascii="Courier New" w:hAnsi="Courier New" w:cs="Courier New" w:hint="default"/>
+      </w:rPr>
+    </w:lvl>
+    <w:lvl w:ilvl="8" w:tplc="0C0A0005" w:tentative="1">
+      <w:start w:val="1"/>
+      <w:numFmt w:val="bullet"/>
+      <w:lvlText w:val=""/>
+      <w:lvlJc w:val="left"/>
+      <w:pPr>
+        <w:ind w:left="7560" w:hanging="360"/>
+      </w:pPr>
+      <w:rPr>
+        <w:rFonts w:ascii="Wingdings" w:hAnsi="Wingdings" w:hint="default"/>
+      </w:rPr>
+    </w:lvl>
+  </w:abstractNum>
+  <w:abstractNum w:abstractNumId="19" w15:restartNumberingAfterBreak="0">
     <w:nsid w:val="4A5A1099"/>
     <w:multiLevelType w:val="multilevel"/>
     <w:tmpl w:val="4268E1E0"/>
@@ -3651,7 +7836,7 @@
       </w:pPr>
     </w:lvl>
   </w:abstractNum>
-  <w:abstractNum w:abstractNumId="17" w15:restartNumberingAfterBreak="0">
+  <w:abstractNum w:abstractNumId="20" w15:restartNumberingAfterBreak="0">
     <w:nsid w:val="4D4D3CEF"/>
     <w:multiLevelType w:val="hybridMultilevel"/>
     <w:tmpl w:val="FF7E1736"/>
@@ -3740,7 +7925,7 @@
       </w:pPr>
     </w:lvl>
   </w:abstractNum>
-  <w:abstractNum w:abstractNumId="18" w15:restartNumberingAfterBreak="0">
+  <w:abstractNum w:abstractNumId="21" w15:restartNumberingAfterBreak="0">
     <w:nsid w:val="4E5438BA"/>
     <w:multiLevelType w:val="hybridMultilevel"/>
     <w:tmpl w:val="E90E7F22"/>
@@ -3853,7 +8038,7 @@
       </w:rPr>
     </w:lvl>
   </w:abstractNum>
-  <w:abstractNum w:abstractNumId="19" w15:restartNumberingAfterBreak="0">
+  <w:abstractNum w:abstractNumId="22" w15:restartNumberingAfterBreak="0">
     <w:nsid w:val="54B27D0C"/>
     <w:multiLevelType w:val="multilevel"/>
     <w:tmpl w:val="0409001D"/>
@@ -3939,7 +8124,7 @@
       </w:pPr>
     </w:lvl>
   </w:abstractNum>
-  <w:abstractNum w:abstractNumId="20" w15:restartNumberingAfterBreak="0">
+  <w:abstractNum w:abstractNumId="23" w15:restartNumberingAfterBreak="0">
     <w:nsid w:val="5A5A7A21"/>
     <w:multiLevelType w:val="hybridMultilevel"/>
     <w:tmpl w:val="16368196"/>
@@ -4025,7 +8210,7 @@
       </w:pPr>
     </w:lvl>
   </w:abstractNum>
-  <w:abstractNum w:abstractNumId="21" w15:restartNumberingAfterBreak="0">
+  <w:abstractNum w:abstractNumId="24" w15:restartNumberingAfterBreak="0">
     <w:nsid w:val="5C6B4E8C"/>
     <w:multiLevelType w:val="hybridMultilevel"/>
     <w:tmpl w:val="13309150"/>
@@ -4138,7 +8323,120 @@
       </w:rPr>
     </w:lvl>
   </w:abstractNum>
-  <w:abstractNum w:abstractNumId="22" w15:restartNumberingAfterBreak="0">
+  <w:abstractNum w:abstractNumId="25" w15:restartNumberingAfterBreak="0">
+    <w:nsid w:val="5D206B21"/>
+    <w:multiLevelType w:val="hybridMultilevel"/>
+    <w:tmpl w:val="B8E6EFB4"/>
+    <w:lvl w:ilvl="0" w:tplc="0C0A0001">
+      <w:start w:val="1"/>
+      <w:numFmt w:val="bullet"/>
+      <w:lvlText w:val=""/>
+      <w:lvlJc w:val="left"/>
+      <w:pPr>
+        <w:ind w:left="1440" w:hanging="360"/>
+      </w:pPr>
+      <w:rPr>
+        <w:rFonts w:ascii="Symbol" w:hAnsi="Symbol" w:hint="default"/>
+      </w:rPr>
+    </w:lvl>
+    <w:lvl w:ilvl="1" w:tplc="0C0A0003" w:tentative="1">
+      <w:start w:val="1"/>
+      <w:numFmt w:val="bullet"/>
+      <w:lvlText w:val="o"/>
+      <w:lvlJc w:val="left"/>
+      <w:pPr>
+        <w:ind w:left="2160" w:hanging="360"/>
+      </w:pPr>
+      <w:rPr>
+        <w:rFonts w:ascii="Courier New" w:hAnsi="Courier New" w:cs="Courier New" w:hint="default"/>
+      </w:rPr>
+    </w:lvl>
+    <w:lvl w:ilvl="2" w:tplc="0C0A0005" w:tentative="1">
+      <w:start w:val="1"/>
+      <w:numFmt w:val="bullet"/>
+      <w:lvlText w:val=""/>
+      <w:lvlJc w:val="left"/>
+      <w:pPr>
+        <w:ind w:left="2880" w:hanging="360"/>
+      </w:pPr>
+      <w:rPr>
+        <w:rFonts w:ascii="Wingdings" w:hAnsi="Wingdings" w:hint="default"/>
+      </w:rPr>
+    </w:lvl>
+    <w:lvl w:ilvl="3" w:tplc="0C0A0001" w:tentative="1">
+      <w:start w:val="1"/>
+      <w:numFmt w:val="bullet"/>
+      <w:lvlText w:val=""/>
+      <w:lvlJc w:val="left"/>
+      <w:pPr>
+        <w:ind w:left="3600" w:hanging="360"/>
+      </w:pPr>
+      <w:rPr>
+        <w:rFonts w:ascii="Symbol" w:hAnsi="Symbol" w:hint="default"/>
+      </w:rPr>
+    </w:lvl>
+    <w:lvl w:ilvl="4" w:tplc="0C0A0003" w:tentative="1">
+      <w:start w:val="1"/>
+      <w:numFmt w:val="bullet"/>
+      <w:lvlText w:val="o"/>
+      <w:lvlJc w:val="left"/>
+      <w:pPr>
+        <w:ind w:left="4320" w:hanging="360"/>
+      </w:pPr>
+      <w:rPr>
+        <w:rFonts w:ascii="Courier New" w:hAnsi="Courier New" w:cs="Courier New" w:hint="default"/>
+      </w:rPr>
+    </w:lvl>
+    <w:lvl w:ilvl="5" w:tplc="0C0A0005" w:tentative="1">
+      <w:start w:val="1"/>
+      <w:numFmt w:val="bullet"/>
+      <w:lvlText w:val=""/>
+      <w:lvlJc w:val="left"/>
+      <w:pPr>
+        <w:ind w:left="5040" w:hanging="360"/>
+      </w:pPr>
+      <w:rPr>
+        <w:rFonts w:ascii="Wingdings" w:hAnsi="Wingdings" w:hint="default"/>
+      </w:rPr>
+    </w:lvl>
+    <w:lvl w:ilvl="6" w:tplc="0C0A0001" w:tentative="1">
+      <w:start w:val="1"/>
+      <w:numFmt w:val="bullet"/>
+      <w:lvlText w:val=""/>
+      <w:lvlJc w:val="left"/>
+      <w:pPr>
+        <w:ind w:left="5760" w:hanging="360"/>
+      </w:pPr>
+      <w:rPr>
+        <w:rFonts w:ascii="Symbol" w:hAnsi="Symbol" w:hint="default"/>
+      </w:rPr>
+    </w:lvl>
+    <w:lvl w:ilvl="7" w:tplc="0C0A0003" w:tentative="1">
+      <w:start w:val="1"/>
+      <w:numFmt w:val="bullet"/>
+      <w:lvlText w:val="o"/>
+      <w:lvlJc w:val="left"/>
+      <w:pPr>
+        <w:ind w:left="6480" w:hanging="360"/>
+      </w:pPr>
+      <w:rPr>
+        <w:rFonts w:ascii="Courier New" w:hAnsi="Courier New" w:cs="Courier New" w:hint="default"/>
+      </w:rPr>
+    </w:lvl>
+    <w:lvl w:ilvl="8" w:tplc="0C0A0005" w:tentative="1">
+      <w:start w:val="1"/>
+      <w:numFmt w:val="bullet"/>
+      <w:lvlText w:val=""/>
+      <w:lvlJc w:val="left"/>
+      <w:pPr>
+        <w:ind w:left="7200" w:hanging="360"/>
+      </w:pPr>
+      <w:rPr>
+        <w:rFonts w:ascii="Wingdings" w:hAnsi="Wingdings" w:hint="default"/>
+      </w:rPr>
+    </w:lvl>
+  </w:abstractNum>
+  <w:abstractNum w:abstractNumId="26" w15:restartNumberingAfterBreak="0">
     <w:nsid w:val="5F8F320F"/>
     <w:multiLevelType w:val="hybridMultilevel"/>
     <w:tmpl w:val="54362228"/>
@@ -4251,7 +8549,7 @@
       </w:rPr>
     </w:lvl>
   </w:abstractNum>
-  <w:abstractNum w:abstractNumId="23" w15:restartNumberingAfterBreak="0">
+  <w:abstractNum w:abstractNumId="27" w15:restartNumberingAfterBreak="0">
     <w:nsid w:val="6D702056"/>
     <w:multiLevelType w:val="multilevel"/>
     <w:tmpl w:val="04090023"/>
@@ -4338,7 +8636,7 @@
       </w:pPr>
     </w:lvl>
   </w:abstractNum>
-  <w:abstractNum w:abstractNumId="24" w15:restartNumberingAfterBreak="0">
+  <w:abstractNum w:abstractNumId="28" w15:restartNumberingAfterBreak="0">
     <w:nsid w:val="6DFE06AA"/>
     <w:multiLevelType w:val="hybridMultilevel"/>
     <w:tmpl w:val="C8B08CBC"/>
@@ -4451,7 +8749,7 @@
       </w:rPr>
     </w:lvl>
   </w:abstractNum>
-  <w:abstractNum w:abstractNumId="25" w15:restartNumberingAfterBreak="0">
+  <w:abstractNum w:abstractNumId="29" w15:restartNumberingAfterBreak="0">
     <w:nsid w:val="7273740B"/>
     <w:multiLevelType w:val="multilevel"/>
     <w:tmpl w:val="0409001F"/>
@@ -4537,7 +8835,7 @@
       </w:pPr>
     </w:lvl>
   </w:abstractNum>
-  <w:abstractNum w:abstractNumId="26" w15:restartNumberingAfterBreak="0">
+  <w:abstractNum w:abstractNumId="30" w15:restartNumberingAfterBreak="0">
     <w:nsid w:val="72AD2ACF"/>
     <w:multiLevelType w:val="hybridMultilevel"/>
     <w:tmpl w:val="081ED20C"/>
@@ -4623,7 +8921,7 @@
       </w:pPr>
     </w:lvl>
   </w:abstractNum>
-  <w:abstractNum w:abstractNumId="27" w15:restartNumberingAfterBreak="0">
+  <w:abstractNum w:abstractNumId="31" w15:restartNumberingAfterBreak="0">
     <w:nsid w:val="74BC2BE7"/>
     <w:multiLevelType w:val="hybridMultilevel"/>
     <w:tmpl w:val="C2B29B02"/>
@@ -4709,7 +9007,7 @@
       </w:pPr>
     </w:lvl>
   </w:abstractNum>
-  <w:abstractNum w:abstractNumId="28" w15:restartNumberingAfterBreak="0">
+  <w:abstractNum w:abstractNumId="32" w15:restartNumberingAfterBreak="0">
     <w:nsid w:val="7C673C43"/>
     <w:multiLevelType w:val="hybridMultilevel"/>
     <w:tmpl w:val="413C1C5C"/>
@@ -4859,61 +9157,73 @@
     </w:lvlOverride>
   </w:num>
   <w:num w:numId="12">
+    <w:abstractNumId w:val="29"/>
+  </w:num>
+  <w:num w:numId="13">
+    <w:abstractNumId w:val="22"/>
+  </w:num>
+  <w:num w:numId="14">
+    <w:abstractNumId w:val="19"/>
+  </w:num>
+  <w:num w:numId="15">
+    <w:abstractNumId w:val="27"/>
+  </w:num>
+  <w:num w:numId="16">
+    <w:abstractNumId w:val="20"/>
+  </w:num>
+  <w:num w:numId="17">
+    <w:abstractNumId w:val="15"/>
+  </w:num>
+  <w:num w:numId="18">
+    <w:abstractNumId w:val="31"/>
+  </w:num>
+  <w:num w:numId="19">
+    <w:abstractNumId w:val="21"/>
+  </w:num>
+  <w:num w:numId="20">
+    <w:abstractNumId w:val="17"/>
+  </w:num>
+  <w:num w:numId="21">
+    <w:abstractNumId w:val="32"/>
+  </w:num>
+  <w:num w:numId="22">
+    <w:abstractNumId w:val="13"/>
+  </w:num>
+  <w:num w:numId="23">
+    <w:abstractNumId w:val="24"/>
+  </w:num>
+  <w:num w:numId="24">
+    <w:abstractNumId w:val="14"/>
+  </w:num>
+  <w:num w:numId="25">
+    <w:abstractNumId w:val="30"/>
+  </w:num>
+  <w:num w:numId="26">
+    <w:abstractNumId w:val="12"/>
+  </w:num>
+  <w:num w:numId="27">
+    <w:abstractNumId w:val="28"/>
+  </w:num>
+  <w:num w:numId="28">
+    <w:abstractNumId w:val="16"/>
+  </w:num>
+  <w:num w:numId="29">
+    <w:abstractNumId w:val="26"/>
+  </w:num>
+  <w:num w:numId="30">
+    <w:abstractNumId w:val="23"/>
+  </w:num>
+  <w:num w:numId="31">
     <w:abstractNumId w:val="25"/>
   </w:num>
-  <w:num w:numId="13">
-    <w:abstractNumId w:val="19"/>
+  <w:num w:numId="32">
+    <w:abstractNumId w:val="10"/>
   </w:num>
-  <w:num w:numId="14">
-    <w:abstractNumId w:val="16"/>
-  </w:num>
-  <w:num w:numId="15">
-    <w:abstractNumId w:val="23"/>
-  </w:num>
-  <w:num w:numId="16">
-    <w:abstractNumId w:val="17"/>
-  </w:num>
-  <w:num w:numId="17">
-    <w:abstractNumId w:val="13"/>
-  </w:num>
-  <w:num w:numId="18">
-    <w:abstractNumId w:val="27"/>
-  </w:num>
-  <w:num w:numId="19">
-    <w:abstractNumId w:val="18"/>
-  </w:num>
-  <w:num w:numId="20">
-    <w:abstractNumId w:val="15"/>
-  </w:num>
-  <w:num w:numId="21">
-    <w:abstractNumId w:val="28"/>
-  </w:num>
-  <w:num w:numId="22">
+  <w:num w:numId="33">
     <w:abstractNumId w:val="11"/>
   </w:num>
-  <w:num w:numId="23">
-    <w:abstractNumId w:val="21"/>
-  </w:num>
-  <w:num w:numId="24">
-    <w:abstractNumId w:val="12"/>
-  </w:num>
-  <w:num w:numId="25">
-    <w:abstractNumId w:val="26"/>
-  </w:num>
-  <w:num w:numId="26">
-    <w:abstractNumId w:val="10"/>
-  </w:num>
-  <w:num w:numId="27">
-    <w:abstractNumId w:val="24"/>
-  </w:num>
-  <w:num w:numId="28">
-    <w:abstractNumId w:val="14"/>
-  </w:num>
-  <w:num w:numId="29">
-    <w:abstractNumId w:val="22"/>
-  </w:num>
-  <w:num w:numId="30">
-    <w:abstractNumId w:val="20"/>
+  <w:num w:numId="34">
+    <w:abstractNumId w:val="18"/>
   </w:num>
 </w:numbering>
 </file>
@@ -7609,8 +11919,10 @@
   </w:compat>
   <w:rsids>
     <w:rsidRoot w:val="00FC7F30"/>
+    <w:rsid w:val="001A55F9"/>
     <w:rsid w:val="003C029C"/>
     <w:rsid w:val="0067295E"/>
+    <w:rsid w:val="00A67C4A"/>
     <w:rsid w:val="00D82A00"/>
     <w:rsid w:val="00FC7F30"/>
   </w:rsids>
@@ -8536,7 +12848,7 @@
 </file>
 
 <file path=customXml/itemProps2.xml><?xml version="1.0" encoding="utf-8"?>
-<ds:datastoreItem xmlns:ds="http://schemas.openxmlformats.org/officeDocument/2006/customXml" ds:itemID="{22D2FCA0-B7E0-4298-8195-41EBEC5367DF}">
+<ds:datastoreItem xmlns:ds="http://schemas.openxmlformats.org/officeDocument/2006/customXml" ds:itemID="{1B227DEF-2706-4CBB-95EB-9105B3576E50}">
   <ds:schemaRefs>
     <ds:schemaRef ds:uri="http://schemas.openxmlformats.org/officeDocument/2006/bibliography"/>
   </ds:schemaRefs>

</xml_diff>